<commit_message>
Update 15 November 2025.
</commit_message>
<xml_diff>
--- a/PEMANFAATAN ALGORITMA KLASTER.docx
+++ b/PEMANFAATAN ALGORITMA KLASTER.docx
@@ -26,7 +26,13 @@
       </w:r>
       <w:r>
         <w:br/>
-        <w:t>DI WILAYAH SERANG</w:t>
+        <w:t xml:space="preserve">DI </w:t>
+      </w:r>
+      <w:r>
+        <w:t>STASIUN METEOROLOGI MARITIM</w:t>
+      </w:r>
+      <w:r>
+        <w:t xml:space="preserve"> SERANG</w:t>
       </w:r>
     </w:p>
     <w:p/>
@@ -138,14 +144,20 @@
         <w:t>2026</w:t>
       </w:r>
     </w:p>
-    <w:p/>
+    <w:p>
+      <w:pPr>
+        <w:sectPr>
+          <w:pgSz w:w="11906" w:h="16838"/>
+          <w:pgMar w:top="1701" w:right="1701" w:bottom="1701" w:left="1701" w:header="708" w:footer="708" w:gutter="0"/>
+          <w:cols w:space="708"/>
+          <w:docGrid w:linePitch="360"/>
+        </w:sectPr>
+      </w:pPr>
+    </w:p>
     <w:p>
       <w:pPr>
         <w:pStyle w:val="Heading1"/>
       </w:pPr>
-      <w:r>
-        <w:br w:type="page"/>
-      </w:r>
       <w:r>
         <w:lastRenderedPageBreak/>
         <w:t>BAB 1</w:t>
@@ -203,6 +215,7 @@
       </w:r>
     </w:p>
     <w:p>
+      <w:bookmarkStart w:id="0" w:name="_Hlk212206759"/>
       <w:r>
         <w:t xml:space="preserve">Cuaca dan iklim adalah </w:t>
       </w:r>
@@ -392,6 +405,7 @@
       <w:r>
         <w:t>.</w:t>
       </w:r>
+      <w:bookmarkEnd w:id="0"/>
     </w:p>
     <w:p/>
     <w:p>
@@ -501,12 +515,14 @@
       <w:r>
         <w:t xml:space="preserve"> seperti </w:t>
       </w:r>
+      <w:bookmarkStart w:id="1" w:name="_Hlk212228214"/>
       <w:r>
         <w:t>El Niño-Southern Oscillation (ENSO)</w:t>
       </w:r>
       <w:r>
         <w:t xml:space="preserve"> dan Madden-Julian Oscillation (MJO)</w:t>
       </w:r>
+      <w:bookmarkEnd w:id="1"/>
       <w:r>
         <w:t xml:space="preserve"> </w:t>
       </w:r>
@@ -564,7 +580,7 @@
         <w:fldChar w:fldCharType="begin" w:fldLock="1"/>
       </w:r>
       <w:r>
-        <w:instrText>ADDIN CSL_CITATION {"citationItems":[{"id":"ITEM-1","itemData":{"author":[{"dropping-particle":"","family":"BMKG","given":"","non-dropping-particle":"","parse-names":false,"suffix":""}],"id":"ITEM-1","issued":{"date-parts":[["2016"]]},"title":"Peraturan Kepala Badan Meteorologi, Klimatologi, dan Geofisika Nomor 3 Tahun 2016 tentang Organisasi dan Tata Kerja Badan Meteorologi, Klimatologi, dan Geofisika.","type":"article"},"uris":["http://www.mendeley.com/documents/?uuid=27b05709-3bba-4508-a90f-42511da7e0c2"]},{"id":"ITEM-2","itemData":{"author":[{"dropping-particle":"","family":"BMKG","given":"","non-dropping-particle":"","parse-names":false,"suffix":""}],"id":"ITEM-2","issued":{"date-parts":[["2020"]]},"title":"Peraturan Badan Meteorologi, Klimatologi, dan Geofisika Republik Indonesia Nomor 4 Tahun 2020 Tentang Rencana Strategis Badan Meteorologi, Klimatologi, dan Geofisika Tahun 2020—2024","type":"article"},"uris":["http://www.mendeley.com/documents/?uuid=848390f1-05b7-4427-8933-d7d089d6d76f"]}],"mendeley":{"formattedCitation":"(BMKG, 2016, 2020)","plainTextFormattedCitation":"(BMKG, 2016, 2020)","previouslyFormattedCitation":"(BMKG, 2016, 2020)"},"properties":{"noteIndex":0},"schema":"https://github.com/citation-style-language/schema/raw/master/csl-citation.json"}</w:instrText>
+        <w:instrText>ADDIN CSL_CITATION {"citationItems":[{"id":"ITEM-1","itemData":{"author":[{"dropping-particle":"","family":"BMKG","given":"","non-dropping-particle":"","parse-names":false,"suffix":""}],"id":"ITEM-1","issued":{"date-parts":[["2016"]]},"title":"Peraturan Kepala Badan Meteorologi, Klimatologi, dan Geofisika Nomor 3 Tahun 2016 tentang Organisasi dan Tata Kerja Badan Meteorologi, Klimatologi, dan Geofisika.","type":"article"},"uris":["http://www.mendeley.com/documents/?uuid=27b05709-3bba-4508-a90f-42511da7e0c2"]},{"id":"ITEM-2","itemData":{"author":[{"dropping-particle":"","family":"BMKG","given":"","non-dropping-particle":"","parse-names":false,"suffix":""}],"id":"ITEM-2","issued":{"date-parts":[["2020"]]},"title":"Peraturan Badan Meteorologi, Klimatologi, dan Geofisika Republik Indonesia Nomor 4 Tahun 2020 Tentang Rencana Strategis Badan Meteorologi, Klimatologi, dan Geofisika Tahun 2020—2024","type":"article"},"uris":["http://www.mendeley.com/documents/?uuid=848390f1-05b7-4427-8933-d7d089d6d76f"]}],"mendeley":{"formattedCitation":"(BMKG, 2016a, 2020)","plainTextFormattedCitation":"(BMKG, 2016a, 2020)","previouslyFormattedCitation":"(BMKG, 2016a, 2020)"},"properties":{"noteIndex":0},"schema":"https://github.com/citation-style-language/schema/raw/master/csl-citation.json"}</w:instrText>
       </w:r>
       <w:r>
         <w:fldChar w:fldCharType="separate"/>
@@ -573,7 +589,7 @@
         <w:rPr>
           <w:noProof/>
         </w:rPr>
-        <w:t>(BMKG, 2016, 2020)</w:t>
+        <w:t>(BMKG, 2016a, 2020)</w:t>
       </w:r>
       <w:r>
         <w:fldChar w:fldCharType="end"/>
@@ -837,7 +853,13 @@
         </w:numPr>
       </w:pPr>
       <w:r>
-        <w:t>Apa algoritma pengelompokan yang paling stabil dan sesuai untuk data curah hujan di Stasiun Meteorologi Serang?</w:t>
+        <w:t xml:space="preserve">Apa algoritma pengelompokan yang paling stabil dan sesuai untuk data curah hujan di </w:t>
+      </w:r>
+      <w:r>
+        <w:t>Stasiun Meteorologi Maritim Serang</w:t>
+      </w:r>
+      <w:r>
+        <w:t>?</w:t>
       </w:r>
     </w:p>
     <w:p>
@@ -888,7 +910,13 @@
         </w:numPr>
       </w:pPr>
       <w:r>
-        <w:t>Menentukan algoritma pengelompokan data curah hujan yang paling stabil dan sesuai untuk data curah hujan di Stasiun Meteorologi Serang.</w:t>
+        <w:t xml:space="preserve">Menentukan algoritma pengelompokan data curah hujan yang paling stabil dan sesuai untuk data curah hujan di </w:t>
+      </w:r>
+      <w:r>
+        <w:t>Stasiun Meteorologi Maritim Serang</w:t>
+      </w:r>
+      <w:r>
+        <w:t>.</w:t>
       </w:r>
     </w:p>
     <w:p>
@@ -900,7 +928,13 @@
         </w:numPr>
       </w:pPr>
       <w:r>
-        <w:t>Membuat produk informasi iklim berupa informasi pola curah hujan di Stasiun Meteorologi Serang.</w:t>
+        <w:t xml:space="preserve">Membuat produk informasi iklim berupa informasi pola curah hujan di </w:t>
+      </w:r>
+      <w:r>
+        <w:t>Stasiun Meteorologi Maritim Serang</w:t>
+      </w:r>
+      <w:r>
+        <w:t>.</w:t>
       </w:r>
     </w:p>
     <w:p/>
@@ -942,10 +976,10 @@
         <w:t>fokus pada satu titik lokasi (</w:t>
       </w:r>
       <w:r>
-        <w:t xml:space="preserve">Stasiun Meteorologi </w:t>
-      </w:r>
-      <w:r>
-        <w:t xml:space="preserve">Serang, </w:t>
+        <w:t>Stasiun Meteorologi Maritim Serang</w:t>
+      </w:r>
+      <w:r>
+        <w:t xml:space="preserve">, </w:t>
       </w:r>
       <w:r>
         <w:t>Banten</w:t>
@@ -1896,43 +1930,6 @@
         <w:fldChar w:fldCharType="end"/>
       </w:r>
       <w:r>
-        <w:t>. Selain itu, SOM dapat mengisi data hilang (</w:t>
-      </w:r>
-      <w:r>
-        <w:rPr>
-          <w:i/>
-          <w:iCs/>
-        </w:rPr>
-        <w:t>missing data</w:t>
-      </w:r>
-      <w:r>
-        <w:t xml:space="preserve">) dengan memanfaatkan hubungan antar titik data yang </w:t>
-      </w:r>
-      <w:r>
-        <w:t>diamati</w:t>
-      </w:r>
-      <w:r>
-        <w:t xml:space="preserve">, sehingga meningkatkan kelengkapan dan akurasi data </w:t>
-      </w:r>
-      <w:r>
-        <w:fldChar w:fldCharType="begin" w:fldLock="1"/>
-      </w:r>
-      <w:r>
-        <w:instrText>ADDIN CSL_CITATION {"citationItems":[{"id":"ITEM-1","itemData":{"abstract":"Self-organizing maps (SOMs), a particular application of artificial neural networks, are used to proportionately combine precipitation records of individual stations into a regional data set by extracting the common regional variability from the locally forced variability at each station. The methodology is applied to a 100 yr record of precipitation data for 104 stations in the Mid-Atlantic/Northeast United States region. The SOM combines stations with common precipitation characteristics and identifies precipitation regions that are consistent across a range of spatial scales. A variation of the SOM application identifies the temporal modes of the regional precipitation record and uses them to fill missing data in the station observations to produce a regional precipitation record. A test of the methodology with a complete data set shows that the Œmissing data¹ routine improves the regional signal when up to 80% of the data are missing from 80% of the stations. The improvement is almost as pronounced when there is a bias in the missing data for both high-precipitation and low-precipitation events.","author":[{"dropping-particle":"","family":"Crane","given":"Robert G","non-dropping-particle":"","parse-names":false,"suffix":""},{"dropping-particle":"","family":"Hewitson","given":"Bruce C","non-dropping-particle":"","parse-names":false,"suffix":""}],"container-title":"Climate Research","id":"ITEM-1","issued":{"date-parts":[["2003"]]},"note":"10.3354/cr025095","page":"95-107","title":"Clustering and upscaling of station precipitation records to regional patterns using self-organizing maps (SOMs)","type":"article-journal","volume":"25"},"uris":["http://www.mendeley.com/documents/?uuid=35d80195-4284-49f9-a148-d8a0c34b1fa1"]}],"mendeley":{"formattedCitation":"(Crane &amp; Hewitson, 2003)","plainTextFormattedCitation":"(Crane &amp; Hewitson, 2003)","previouslyFormattedCitation":"(Crane &amp; Hewitson, 2003)"},"properties":{"noteIndex":0},"schema":"https://github.com/citation-style-language/schema/raw/master/csl-citation.json"}</w:instrText>
-      </w:r>
-      <w:r>
-        <w:fldChar w:fldCharType="separate"/>
-      </w:r>
-      <w:r>
-        <w:rPr>
-          <w:noProof/>
-        </w:rPr>
-        <w:t>(Crane &amp; Hewitson, 2003)</w:t>
-      </w:r>
-      <w:r>
-        <w:fldChar w:fldCharType="end"/>
-      </w:r>
-      <w:r>
         <w:t>. Metode ini juga berguna untuk analisis regional dengan menggabungkan catatan curah hujan dari berbagai stasiun, mengidentifikasi karakteristik presipitasi yang sama, dan memperdalam pemahaman tentang variabilitasnya</w:t>
       </w:r>
       <w:r>
@@ -2022,11 +2019,11 @@
         <w:fldChar w:fldCharType="end"/>
       </w:r>
       <w:r>
-        <w:t xml:space="preserve">. </w:t>
+        <w:t xml:space="preserve">. Dalam analisis curah hujan, DBSCAN terbukti efektif membedakan pola cuaca normal </w:t>
       </w:r>
       <w:r>
         <w:lastRenderedPageBreak/>
-        <w:t xml:space="preserve">Dalam analisis curah hujan, DBSCAN terbukti efektif membedakan pola cuaca normal dengan anomali, sehingga dapat mendeteksi kejadian hujan tidak biasa yang mungkin mengindikasikan bencana alam </w:t>
+        <w:t xml:space="preserve">dengan anomali, sehingga dapat mendeteksi kejadian hujan tidak biasa yang mungkin mengindikasikan bencana alam </w:t>
       </w:r>
       <w:r>
         <w:fldChar w:fldCharType="begin" w:fldLock="1"/>
@@ -2502,6 +2499,7 @@
         </w:numPr>
       </w:pPr>
       <w:r>
+        <w:lastRenderedPageBreak/>
         <w:t>Davies-Bouldin Indeks</w:t>
       </w:r>
     </w:p>
@@ -3272,6 +3270,7 @@
     <w:p/>
     <w:p/>
     <w:p/>
+    <w:p/>
     <w:p>
       <w:pPr>
         <w:pStyle w:val="Heading2"/>
@@ -3315,7 +3314,7 @@
         <w:fldChar w:fldCharType="begin" w:fldLock="1"/>
       </w:r>
       <w:r>
-        <w:instrText>ADDIN CSL_CITATION {"citationItems":[{"id":"ITEM-1","itemData":{"DOI":"10.3390/mca27030037","ISBN":"2297-8747","abstract":"The purpose of this research is to study the spatial and temporal groupings of 124 meteorological stations in Thailand under ENSO. The multivariate climate variables are rainfall, relative humidity, temperature, max temperature, min temperature, solar downwelling, and horizontal wind from the conformal cubic atmospheric model (CCAM) in years of El Niño (1987, 2004, and 2015) and La Niña (1999, 2000, and 2011). Euclidean distance timed and spaced with average linkage for clustering and silhouette width for cluster validation were employed. Five spatial clusters (SCs) and three temporal clusters (TCs) in each SC with different average precipitation were compared by El Niño and La Niña. The pattern of SCs and TCs was similar for both events except in the case when severe El Niño occurred. This method could be applied using variables forecasted in the future to be used for planning and managing crop cultivation with the climate change in each area.","author":[{"dropping-particle":"","family":"Dechpichai","given":"Porntip","non-dropping-particle":"","parse-names":false,"suffix":""},{"dropping-particle":"","family":"Jinapang","given":"Nuttawadee","non-dropping-particle":"","parse-names":false,"suffix":""},{"dropping-particle":"","family":"Yamphli","given":"Pariyakorn","non-dropping-particle":"","parse-names":false,"suffix":""},{"dropping-particle":"","family":"Polamnuay","given":"Sakulrat","non-dropping-particle":"","parse-names":false,"suffix":""},{"dropping-particle":"","family":"Injan","given":"Sittisak","non-dropping-particle":"","parse-names":false,"suffix":""},{"dropping-particle":"","family":"Humphries","given":"Usa","non-dropping-particle":"","parse-names":false,"suffix":""}],"container-title":"Mathematical and Computational Applications","id":"ITEM-1","issue":"3","issued":{"date-parts":[["2022"]]},"title":"Multivariable Panel Data Cluster Analysis of Meteorological Stations in Thailand for ENSO Phenomenon","type":"article","volume":"27"},"uris":["http://www.mendeley.com/documents/?uuid=493f87fd-b80c-41ac-b99e-e5f382cc65e5"]},{"id":"ITEM-2","itemData":{"DOI":"10.2991/978-94-6463-716-8_18","ISBN":"1951-6851","author":[{"dropping-particle":"","family":"Jain","given":"Anupam","non-dropping-particle":"","parse-names":false,"suffix":""},{"dropping-particle":"","family":"Rathi","given":"Khushal","non-dropping-particle":"","parse-names":false,"suffix":""},{"dropping-particle":"","family":"Ganguly","given":"Yuboraj","non-dropping-particle":"","parse-names":false,"suffix":""},{"dropping-particle":"","family":"Kumar","given":"Ankit","non-dropping-particle":"","parse-names":false,"suffix":""},{"dropping-particle":"","family":"Bhale","given":"Yogiraj","non-dropping-particle":"","parse-names":false,"suffix":""}],"id":"ITEM-2","issued":{"date-parts":[["2025"]]},"page":"212-221","publisher":"Atlantis Press","title":"A Comparative Analysis of DBSCAN, K-Means and Agglomerative Clustering Algorithms for Geospatial Data BT  - Proceedings of the International Conference on Recent Advancements and Modernisations in Sustainable Intelligent Technologies and Applications (RAMSITA 2025)","type":"paper-conference"},"uris":["http://www.mendeley.com/documents/?uuid=3b7b166b-6e15-470c-9816-4df9918e5e63"]},{"id":"ITEM-3","itemData":{"DOI":"10.34028/iajit/19/1/3","abstract":"Anomaly detection concerns identifying anomalous observations or patterns that are a deviation from the dataset's expected behaviour. The detection of anomalies has significant and practical applications in several industrial domains such as public health, finance, Information Technology (IT), security, medical, energy, and climate studies. Density-Based Spatial Clustering of Applications with Noise (DBSCAN) Algorithm is a density-based clustering algorithm with the capability of identifying anomalous data. In this paper, a modified DBSCAN algorithm is proposed for anomaly detection in time-series data with seasonality. For experimental evaluation, a monthly temperature dataset was employed and the analysis set forth the advantages of the modified DBSCAN over the standard DBSCAN algorithm for the seasonal datasets. From the result analysis, we may conclude that DBSCAN is used for finding the anomalies in a dataset but fails to find local anomalies in seasonal data. The proposed Modified DBSCAN approach helps to find both the global and local anomalies from the seasonal data. Using normal DBSCAN, we are able to get 19 (2.16%) anomaly points. While using the modified approach for DBSCAN, we are able to get 42 (4.79%) anomaly points. In comparison, we can say that we are able to get 2.21% more anomalies using the modified DBSCAN approach. Hence, the proposed Modified DBSCAN algorithm outperforms in comparison with the DBSCAN algorithm to find local anomalies.","author":[{"dropping-particle":"","family":"Jain","given":"P.","non-dropping-particle":"","parse-names":false,"suffix":""},{"dropping-particle":"","family":"Bajpai","given":"M. S.","non-dropping-particle":"","parse-names":false,"suffix":""},{"dropping-particle":"","family":"Pamula","given":"R.","non-dropping-particle":"","parse-names":false,"suffix":""}],"container-title":"The International Arab Journal of Information Technology","id":"ITEM-3","issue":"1","issued":{"date-parts":[["2022"]]},"title":"A Modified DBSCAN Algorithm for Anomaly Detection in Time-series Data with Seasonality","type":"article-journal","volume":"19"},"uris":["http://www.mendeley.com/documents/?uuid=cd5d28bb-2a1a-4e0a-929b-0a78da3e9d2c"]},{"id":"ITEM-4","itemData":{"DOI":"10.1088/1757-899X/879/1/012057","abstract":"The purpose of this study is to compare between two different of cluster analysis algorithm in data mining on the Tropical Rainfall Measuring Mission (TRMM). The TRMM is a joint mission between NASA and the Japan Aerospace Exploration (JAXA) Agency to study rainfall for weather and climate research. The TRMM satellite data-sets used in this research is a 3-hourly rainfall data within 10 years from 1998 to 2007. These data-sets will be analyzed by two different cluster analysis algorithms in data mining which are K-means and DBScan. In this paper, rainfall data in Jakarta based on TRMM was analyzed and compared in the efficiency and the accuracy using each algorithm. The comparison results of the two algorithmic processes can be seen from several parameters, especially from the number of clusters formed and the time needed to process the model.","author":[{"dropping-particle":"","family":"Pamuji","given":"Geraldi","non-dropping-particle":"","parse-names":false,"suffix":""},{"dropping-particle":"","family":"Rongtao","given":"H","non-dropping-particle":"","parse-names":false,"suffix":""}],"container-title":"IOP Conference Series: Materials Science and Engineering","id":"ITEM-4","issued":{"date-parts":[["2020","8","7"]]},"page":"12057","title":"A Comparison study of DBScan and K-Means Clustering in Jakarta rainfall based on the Tropical Rainfall Measuring Mission (TRMM) 1998-2007","type":"article-journal","volume":"879"},"uris":["http://www.mendeley.com/documents/?uuid=6158611d-2762-4ebc-b9e0-f7b497f646b9"]},{"id":"ITEM-5","itemData":{"DOI":"10.30598/barekengvol18iss2pp0837-0848","abstract":"Article History: Indonesia has a tropical climate and has two seasons: dry and rainy. Prolonged drought can cause drought disasters, and rain can cause floods and landslides. According to information from the Meteorology, Climatology, and Geophysics Agency (BMKG), natural disasters such as floods and landslides due to heavy rains have been a severe problem in Indonesia for the past five years. Different regional characteristics can affect the intensity of rain that falls in every province in Indonesia. It can be grouped to determine which provinces have similar characteristics to natural disasters due to rainfall. Later, it can provide information to the government and the public so that they are more aware of natural disasters. So, it is necessary to research and classify provinces in Indonesia for rainfall with cluster analysis. The data used is secondary rainfall data taken from the official BMKG website. Cluster analysis of rainfall in 34 provinces in Indonesia used hierarchical and non-hierarchical methods in this study. The approach that is used in this research limits our clustering of the data. Further research with a machine learning approach is recommended. For the clustering method, the agglomerative hierarchical method includes single, average, and complete linkage. The non-hierarchical method includes k-medoids and fuzzy C-means. The cluster analysis results show that the dynamic time warping (DTW) distance measurement method with the average linkage method has the most optimal cluster results with a silhouette coefficient value of 0.813.","author":[{"dropping-particle":"","family":"Sofro","given":"A","non-dropping-particle":"","parse-names":false,"suffix":""},{"dropping-particle":"","family":"Khikmah","given":"Khusnia","non-dropping-particle":"","parse-names":false,"suffix":""},{"dropping-particle":"","family":"Romadhonia","given":"Riska","non-dropping-particle":"","parse-names":false,"suffix":""},{"dropping-particle":"","family":"Ariyanto","given":"Danang","non-dropping-particle":"","parse-names":false,"suffix":""},{"dropping-particle":"","family":"Riani","given":"R","non-dropping-particle":"","parse-names":false,"suffix":""}],"container-title":"BAREKENG JURNAL ILMU MATEMATIKA DAN TERAPAN","id":"ITEM-5","issued":{"date-parts":[["2024","6","1"]]},"page":"837-848","title":"ANALYSIS OF RAINFALL IN INDONESIA USING A TIME SERIES- BASED CLUSTERING APPROACH","type":"article-journal"},"uris":["http://www.mendeley.com/documents/?uuid=d4e18972-d5b3-4169-a3ee-b38e9fd347c1"]},{"id":"ITEM-6","itemData":{"DOI":"10.1080/02664763.2019.1675606","ISSN":"0266-4763 (Print)","PMID":"35706698","abstract":"Dealing with individual rainfall station is time consuming as well as prone to  more variation. It seems reasonable and advantageous to deal with a group of homogeneous stations rather than an individual station. Such groups can be identified using clustering algorithms, techniques used in the multivariate data analysis. Particularly, in this study, covering both hard and soft clustering approaches, three clustering algorithms namely Agglomerative hierarchical, K-means clustering and Fuzzy C-means methods are chosen due to their popularity. These algorithms are applied over precipitation data recorded by the Bangladesh Meteorology Department, and a comparison among the algorithms is made. Annual and seasonal precipitations from 1977 to 2012 recorded in 30 stations are used in this study. Optimal numbers of clusters in the four precipitation series are determined using the Gap statistic for K-means clustering and using the extended Gap statistic for Fuzzy C-means clustering, and are found as 3, 1, 3 and 2 for annual, pre-monsoon, monsoon and post-monsoon, respectively. This study investigates the clustering methods in terms of the similarity, members and homogeneity, among the clusters formed. The clusters are also characterized to see how they are distributed. Moreover, in terms of cluster homogeneity, Fuzzy C-means algorithm outperforms the other clustering methods.","author":[{"dropping-particle":"","family":"Alam","given":"Mohammad Samsul","non-dropping-particle":"","parse-names":false,"suffix":""},{"dropping-particle":"","family":"Paul","given":"Sangita","non-dropping-particle":"","parse-names":false,"suffix":""}],"container-title":"Journal of applied statistics","id":"ITEM-6","issue":"8","issued":{"date-parts":[["2020"]]},"language":"eng","page":"1460-1481","publisher-place":"England","title":"A comparative analysis of clustering algorithms to identify the homogeneous  rainfall gauge stations of Bangladesh.","type":"article-journal","volume":"47"},"uris":["http://www.mendeley.com/documents/?uuid=0da70aab-98a7-44a3-a63e-87dd75ad2ae1"]}],"mendeley":{"formattedCitation":"(Alam &amp; Paul, 2020; Dechpichai et al., 2022; A. Jain et al., 2025; P. Jain et al., 2022; Pamuji &amp; Rongtao, 2020; Sofro et al., 2024)","plainTextFormattedCitation":"(Alam &amp; Paul, 2020; Dechpichai et al., 2022; A. Jain et al., 2025; P. Jain et al., 2022; Pamuji &amp; Rongtao, 2020; Sofro et al., 2024)","previouslyFormattedCitation":"(Alam &amp; Paul, 2020; Dechpichai et al., 2022; A. Jain et al., 2025; P. Jain et al., 2022; Pamuji &amp; Rongtao, 2020; Sofro et al., 2024)"},"properties":{"noteIndex":0},"schema":"https://github.com/citation-style-language/schema/raw/master/csl-citation.json"}</w:instrText>
+        <w:instrText>ADDIN CSL_CITATION {"citationItems":[{"id":"ITEM-1","itemData":{"DOI":"10.3390/mca27030037","ISBN":"2297-8747","abstract":"The purpose of this research is to study the spatial and temporal groupings of 124 meteorological stations in Thailand under ENSO. The multivariate climate variables are rainfall, relative humidity, temperature, max temperature, min temperature, solar downwelling, and horizontal wind from the conformal cubic atmospheric model (CCAM) in years of El Niño (1987, 2004, and 2015) and La Niña (1999, 2000, and 2011). Euclidean distance timed and spaced with average linkage for clustering and silhouette width for cluster validation were employed. Five spatial clusters (SCs) and three temporal clusters (TCs) in each SC with different average precipitation were compared by El Niño and La Niña. The pattern of SCs and TCs was similar for both events except in the case when severe El Niño occurred. This method could be applied using variables forecasted in the future to be used for planning and managing crop cultivation with the climate change in each area.","author":[{"dropping-particle":"","family":"Dechpichai","given":"Porntip","non-dropping-particle":"","parse-names":false,"suffix":""},{"dropping-particle":"","family":"Jinapang","given":"Nuttawadee","non-dropping-particle":"","parse-names":false,"suffix":""},{"dropping-particle":"","family":"Yamphli","given":"Pariyakorn","non-dropping-particle":"","parse-names":false,"suffix":""},{"dropping-particle":"","family":"Polamnuay","given":"Sakulrat","non-dropping-particle":"","parse-names":false,"suffix":""},{"dropping-particle":"","family":"Injan","given":"Sittisak","non-dropping-particle":"","parse-names":false,"suffix":""},{"dropping-particle":"","family":"Humphries","given":"Usa","non-dropping-particle":"","parse-names":false,"suffix":""}],"container-title":"Mathematical and Computational Applications","id":"ITEM-1","issue":"3","issued":{"date-parts":[["2022"]]},"title":"Multivariable Panel Data Cluster Analysis of Meteorological Stations in Thailand for ENSO Phenomenon","type":"article","volume":"27"},"uris":["http://www.mendeley.com/documents/?uuid=493f87fd-b80c-41ac-b99e-e5f382cc65e5"]},{"id":"ITEM-2","itemData":{"DOI":"10.2991/978-94-6463-716-8_18","ISBN":"1951-6851","author":[{"dropping-particle":"","family":"Jain","given":"Anupam","non-dropping-particle":"","parse-names":false,"suffix":""},{"dropping-particle":"","family":"Rathi","given":"Khushal","non-dropping-particle":"","parse-names":false,"suffix":""},{"dropping-particle":"","family":"Ganguly","given":"Yuboraj","non-dropping-particle":"","parse-names":false,"suffix":""},{"dropping-particle":"","family":"Kumar","given":"Ankit","non-dropping-particle":"","parse-names":false,"suffix":""},{"dropping-particle":"","family":"Bhale","given":"Yogiraj","non-dropping-particle":"","parse-names":false,"suffix":""}],"id":"ITEM-2","issued":{"date-parts":[["2025"]]},"page":"212-221","publisher":"Atlantis Press","title":"A Comparative Analysis of DBSCAN, K-Means and Agglomerative Clustering Algorithms for Geospatial Data BT  - Proceedings of the International Conference on Recent Advancements and Modernisations in Sustainable Intelligent Technologies and Applications (RAM","type":"paper-conference"},"uris":["http://www.mendeley.com/documents/?uuid=3b7b166b-6e15-470c-9816-4df9918e5e63"]},{"id":"ITEM-3","itemData":{"DOI":"10.34028/iajit/19/1/3","abstract":"Anomaly detection concerns identifying anomalous observations or patterns that are a deviation from the dataset's expected behaviour. The detection of anomalies has significant and practical applications in several industrial domains such as public health, finance, Information Technology (IT), security, medical, energy, and climate studies. Density-Based Spatial Clustering of Applications with Noise (DBSCAN) Algorithm is a density-based clustering algorithm with the capability of identifying anomalous data. In this paper, a modified DBSCAN algorithm is proposed for anomaly detection in time-series data with seasonality. For experimental evaluation, a monthly temperature dataset was employed and the analysis set forth the advantages of the modified DBSCAN over the standard DBSCAN algorithm for the seasonal datasets. From the result analysis, we may conclude that DBSCAN is used for finding the anomalies in a dataset but fails to find local anomalies in seasonal data. The proposed Modified DBSCAN approach helps to find both the global and local anomalies from the seasonal data. Using normal DBSCAN, we are able to get 19 (2.16%) anomaly points. While using the modified approach for DBSCAN, we are able to get 42 (4.79%) anomaly points. In comparison, we can say that we are able to get 2.21% more anomalies using the modified DBSCAN approach. Hence, the proposed Modified DBSCAN algorithm outperforms in comparison with the DBSCAN algorithm to find local anomalies.","author":[{"dropping-particle":"","family":"Jain","given":"P.","non-dropping-particle":"","parse-names":false,"suffix":""},{"dropping-particle":"","family":"Bajpai","given":"M. S.","non-dropping-particle":"","parse-names":false,"suffix":""},{"dropping-particle":"","family":"Pamula","given":"R.","non-dropping-particle":"","parse-names":false,"suffix":""}],"container-title":"The International Arab Journal of Information Technology","id":"ITEM-3","issue":"1","issued":{"date-parts":[["2022"]]},"title":"A Modified DBSCAN Algorithm for Anomaly Detection in Time-series Data with Seasonality","type":"article-journal","volume":"19"},"uris":["http://www.mendeley.com/documents/?uuid=cd5d28bb-2a1a-4e0a-929b-0a78da3e9d2c"]},{"id":"ITEM-4","itemData":{"DOI":"10.1088/1757-899X/879/1/012057","abstract":"The purpose of this study is to compare between two different of cluster analysis algorithm in data mining on the Tropical Rainfall Measuring Mission (TRMM). The TRMM is a joint mission between NASA and the Japan Aerospace Exploration (JAXA) Agency to study rainfall for weather and climate research. The TRMM satellite data-sets used in this research is a 3-hourly rainfall data within 10 years from 1998 to 2007. These data-sets will be analyzed by two different cluster analysis algorithms in data mining which are K-means and DBScan. In this paper, rainfall data in Jakarta based on TRMM was analyzed and compared in the efficiency and the accuracy using each algorithm. The comparison results of the two algorithmic processes can be seen from several parameters, especially from the number of clusters formed and the time needed to process the model.","author":[{"dropping-particle":"","family":"Pamuji","given":"Geraldi","non-dropping-particle":"","parse-names":false,"suffix":""},{"dropping-particle":"","family":"Rongtao","given":"H","non-dropping-particle":"","parse-names":false,"suffix":""}],"container-title":"IOP Conference Series: Materials Science and Engineering","id":"ITEM-4","issued":{"date-parts":[["2020","8","7"]]},"page":"12057","title":"A Comparison study of DBScan and K-Means Clustering in Jakarta rainfall based on the Tropical Rainfall Measuring Mission (TRMM) 1998-2007","type":"article-journal","volume":"879"},"uris":["http://www.mendeley.com/documents/?uuid=6158611d-2762-4ebc-b9e0-f7b497f646b9"]},{"id":"ITEM-5","itemData":{"DOI":"10.30598/barekengvol18iss2pp0837-0848","abstract":"Article History: Indonesia has a tropical climate and has two seasons: dry and rainy. Prolonged drought can cause drought disasters, and rain can cause floods and landslides. According to information from the Meteorology, Climatology, and Geophysics Agency (BMKG), natural disasters such as floods and landslides due to heavy rains have been a severe problem in Indonesia for the past five years. Different regional characteristics can affect the intensity of rain that falls in every province in Indonesia. It can be grouped to determine which provinces have similar characteristics to natural disasters due to rainfall. Later, it can provide information to the government and the public so that they are more aware of natural disasters. So, it is necessary to research and classify provinces in Indonesia for rainfall with cluster analysis. The data used is secondary rainfall data taken from the official BMKG website. Cluster analysis of rainfall in 34 provinces in Indonesia used hierarchical and non-hierarchical methods in this study. The approach that is used in this research limits our clustering of the data. Further research with a machine learning approach is recommended. For the clustering method, the agglomerative hierarchical method includes single, average, and complete linkage. The non-hierarchical method includes k-medoids and fuzzy C-means. The cluster analysis results show that the dynamic time warping (DTW) distance measurement method with the average linkage method has the most optimal cluster results with a silhouette coefficient value of 0.813.","author":[{"dropping-particle":"","family":"Sofro","given":"A","non-dropping-particle":"","parse-names":false,"suffix":""},{"dropping-particle":"","family":"Khikmah","given":"Khusnia","non-dropping-particle":"","parse-names":false,"suffix":""},{"dropping-particle":"","family":"Romadhonia","given":"Riska","non-dropping-particle":"","parse-names":false,"suffix":""},{"dropping-particle":"","family":"Ariyanto","given":"Danang","non-dropping-particle":"","parse-names":false,"suffix":""},{"dropping-particle":"","family":"Riani","given":"R","non-dropping-particle":"","parse-names":false,"suffix":""}],"container-title":"BAREKENG JURNAL ILMU MATEMATIKA DAN TERAPAN","id":"ITEM-5","issued":{"date-parts":[["2024","6","1"]]},"page":"837-848","title":"ANALYSIS OF RAINFALL IN INDONESIA USING A TIME SERIES- BASED CLUSTERING APPROACH","type":"article-journal"},"uris":["http://www.mendeley.com/documents/?uuid=d4e18972-d5b3-4169-a3ee-b38e9fd347c1"]},{"id":"ITEM-6","itemData":{"DOI":"10.1080/02664763.2019.1675606","ISSN":"0266-4763 (Print)","PMID":"35706698","abstract":"Dealing with individual rainfall station is time consuming as well as prone to  more variation. It seems reasonable and advantageous to deal with a group of homogeneous stations rather than an individual station. Such groups can be identified using clustering algorithms, techniques used in the multivariate data analysis. Particularly, in this study, covering both hard and soft clustering approaches, three clustering algorithms namely Agglomerative hierarchical, K-means clustering and Fuzzy C-means methods are chosen due to their popularity. These algorithms are applied over precipitation data recorded by the Bangladesh Meteorology Department, and a comparison among the algorithms is made. Annual and seasonal precipitations from 1977 to 2012 recorded in 30 stations are used in this study. Optimal numbers of clusters in the four precipitation series are determined using the Gap statistic for K-means clustering and using the extended Gap statistic for Fuzzy C-means clustering, and are found as 3, 1, 3 and 2 for annual, pre-monsoon, monsoon and post-monsoon, respectively. This study investigates the clustering methods in terms of the similarity, members and homogeneity, among the clusters formed. The clusters are also characterized to see how they are distributed. Moreover, in terms of cluster homogeneity, Fuzzy C-means algorithm outperforms the other clustering methods.","author":[{"dropping-particle":"","family":"Alam","given":"Mohammad Samsul","non-dropping-particle":"","parse-names":false,"suffix":""},{"dropping-particle":"","family":"Paul","given":"Sangita","non-dropping-particle":"","parse-names":false,"suffix":""}],"container-title":"Journal of applied statistics","id":"ITEM-6","issue":"8","issued":{"date-parts":[["2020"]]},"language":"eng","page":"1460-1481","publisher-place":"England","title":"A comparative analysis of clustering algorithms to identify the homogeneous  rainfall gauge stations of Bangladesh.","type":"article-journal","volume":"47"},"uris":["http://www.mendeley.com/documents/?uuid=0da70aab-98a7-44a3-a63e-87dd75ad2ae1"]}],"mendeley":{"formattedCitation":"(Alam &amp; Paul, 2020; Dechpichai et al., 2022; A. Jain et al., 2025; P. Jain et al., 2022; Pamuji &amp; Rongtao, 2020; Sofro et al., 2024)","plainTextFormattedCitation":"(Alam &amp; Paul, 2020; Dechpichai et al., 2022; A. Jain et al., 2025; P. Jain et al., 2022; Pamuji &amp; Rongtao, 2020; Sofro et al., 2024)","previouslyFormattedCitation":"(Alam &amp; Paul, 2020; Dechpichai et al., 2022; A. Jain et al., 2025; P. Jain et al., 2022; Pamuji &amp; Rongtao, 2020; Sofro et al., 2024)"},"properties":{"noteIndex":0},"schema":"https://github.com/citation-style-language/schema/raw/master/csl-citation.json"}</w:instrText>
       </w:r>
       <w:r>
         <w:fldChar w:fldCharType="separate"/>
@@ -3414,19 +3413,13 @@
     <w:p/>
     <w:p>
       <w:r>
-        <w:t xml:space="preserve">Meskipun memiliki tujuan yang sama, studi-studi tersebut menunjukkan kontras mendasar dalam filosofi </w:t>
-      </w:r>
-      <w:r>
-        <w:t>algoritma</w:t>
-      </w:r>
-      <w:r>
-        <w:t xml:space="preserve">, sumber data, dan cakupan analitisnya. Perbedaan utama terletak antara metode partisi seperti K-Means, yang memerlukan jumlah klaster yang telah ditentukan (k) </w:t>
+        <w:t xml:space="preserve">Meskipun memiliki tujuan yang sama, studi-studi tersebut menunjukkan kontras mendasar dalam filosofi algoritma, sumber data, dan cakupan analitisnya. Perbedaan utama terletak antara metode partisi seperti K-Means, yang memerlukan jumlah klaster yang telah ditentukan (k) </w:t>
       </w:r>
       <w:r>
         <w:fldChar w:fldCharType="begin" w:fldLock="1"/>
       </w:r>
       <w:r>
-        <w:instrText>ADDIN CSL_CITATION {"citationItems":[{"id":"ITEM-1","itemData":{"DOI":"10.1080/02664763.2019.1675606","ISSN":"0266-4763 (Print)","PMID":"35706698","abstract":"Dealing with individual rainfall station is time consuming as well as prone to  more variation. It seems reasonable and advantageous to deal with a group of homogeneous stations rather than an individual station. Such groups can be identified using clustering algorithms, techniques used in the multivariate data analysis. Particularly, in this study, covering both hard and soft clustering approaches, three clustering algorithms namely Agglomerative hierarchical, K-means clustering and Fuzzy C-means methods are chosen due to their popularity. These algorithms are applied over precipitation data recorded by the Bangladesh Meteorology Department, and a comparison among the algorithms is made. Annual and seasonal precipitations from 1977 to 2012 recorded in 30 stations are used in this study. Optimal numbers of clusters in the four precipitation series are determined using the Gap statistic for K-means clustering and using the extended Gap statistic for Fuzzy C-means clustering, and are found as 3, 1, 3 and 2 for annual, pre-monsoon, monsoon and post-monsoon, respectively. This study investigates the clustering methods in terms of the similarity, members and homogeneity, among the clusters formed. The clusters are also characterized to see how they are distributed. Moreover, in terms of cluster homogeneity, Fuzzy C-means algorithm outperforms the other clustering methods.","author":[{"dropping-particle":"","family":"Alam","given":"Mohammad Samsul","non-dropping-particle":"","parse-names":false,"suffix":""},{"dropping-particle":"","family":"Paul","given":"Sangita","non-dropping-particle":"","parse-names":false,"suffix":""}],"container-title":"Journal of applied statistics","id":"ITEM-1","issue":"8","issued":{"date-parts":[["2020"]]},"language":"eng","page":"1460-1481","publisher-place":"England","title":"A comparative analysis of clustering algorithms to identify the homogeneous  rainfall gauge stations of Bangladesh.","type":"article-journal","volume":"47"},"uris":["http://www.mendeley.com/documents/?uuid=0da70aab-98a7-44a3-a63e-87dd75ad2ae1"]},{"id":"ITEM-2","itemData":{"DOI":"10.1088/1757-899X/879/1/012057","abstract":"The purpose of this study is to compare between two different of cluster analysis algorithm in data mining on the Tropical Rainfall Measuring Mission (TRMM). The TRMM is a joint mission between NASA and the Japan Aerospace Exploration (JAXA) Agency to study rainfall for weather and climate research. The TRMM satellite data-sets used in this research is a 3-hourly rainfall data within 10 years from 1998 to 2007. These data-sets will be analyzed by two different cluster analysis algorithms in data mining which are K-means and DBScan. In this paper, rainfall data in Jakarta based on TRMM was analyzed and compared in the efficiency and the accuracy using each algorithm. The comparison results of the two algorithmic processes can be seen from several parameters, especially from the number of clusters formed and the time needed to process the model.","author":[{"dropping-particle":"","family":"Pamuji","given":"Geraldi","non-dropping-particle":"","parse-names":false,"suffix":""},{"dropping-particle":"","family":"Rongtao","given":"H","non-dropping-particle":"","parse-names":false,"suffix":""}],"container-title":"IOP Conference Series: Materials Science and Engineering","id":"ITEM-2","issued":{"date-parts":[["2020","8","7"]]},"page":"12057","title":"A Comparison study of DBScan and K-Means Clustering in Jakarta rainfall based on the Tropical Rainfall Measuring Mission (TRMM) 1998-2007","type":"article-journal","volume":"879"},"uris":["http://www.mendeley.com/documents/?uuid=6158611d-2762-4ebc-b9e0-f7b497f646b9"]},{"id":"ITEM-3","itemData":{"DOI":"10.2991/978-94-6463-716-8_18","ISBN":"1951-6851","author":[{"dropping-particle":"","family":"Jain","given":"Anupam","non-dropping-particle":"","parse-names":false,"suffix":""},{"dropping-particle":"","family":"Rathi","given":"Khushal","non-dropping-particle":"","parse-names":false,"suffix":""},{"dropping-particle":"","family":"Ganguly","given":"Yuboraj","non-dropping-particle":"","parse-names":false,"suffix":""},{"dropping-particle":"","family":"Kumar","given":"Ankit","non-dropping-particle":"","parse-names":false,"suffix":""},{"dropping-particle":"","family":"Bhale","given":"Yogiraj","non-dropping-particle":"","parse-names":false,"suffix":""}],"id":"ITEM-3","issued":{"date-parts":[["2025"]]},"page":"212-221","publisher":"Atlantis Press","title":"A Comparative Analysis of DBSCAN, K-Means and Agglomerative Clustering Algorithms for Geospatial Data BT  - Proceedings of the International Conference on Recent Advancements and Modernisations in Sustainable Intelligent Technologies and Applications (RAMSITA 2025)","type":"paper-conference"},"uris":["http://www.mendeley.com/documents/?uuid=3b7b166b-6e15-470c-9816-4df9918e5e63"]}],"mendeley":{"formattedCitation":"(Alam &amp; Paul, 2020; A. Jain et al., 2025; Pamuji &amp; Rongtao, 2020)","plainTextFormattedCitation":"(Alam &amp; Paul, 2020; A. Jain et al., 2025; Pamuji &amp; Rongtao, 2020)","previouslyFormattedCitation":"(Alam &amp; Paul, 2020; A. Jain et al., 2025; Pamuji &amp; Rongtao, 2020)"},"properties":{"noteIndex":0},"schema":"https://github.com/citation-style-language/schema/raw/master/csl-citation.json"}</w:instrText>
+        <w:instrText>ADDIN CSL_CITATION {"citationItems":[{"id":"ITEM-1","itemData":{"DOI":"10.1080/02664763.2019.1675606","ISSN":"0266-4763 (Print)","PMID":"35706698","abstract":"Dealing with individual rainfall station is time consuming as well as prone to  more variation. It seems reasonable and advantageous to deal with a group of homogeneous stations rather than an individual station. Such groups can be identified using clustering algorithms, techniques used in the multivariate data analysis. Particularly, in this study, covering both hard and soft clustering approaches, three clustering algorithms namely Agglomerative hierarchical, K-means clustering and Fuzzy C-means methods are chosen due to their popularity. These algorithms are applied over precipitation data recorded by the Bangladesh Meteorology Department, and a comparison among the algorithms is made. Annual and seasonal precipitations from 1977 to 2012 recorded in 30 stations are used in this study. Optimal numbers of clusters in the four precipitation series are determined using the Gap statistic for K-means clustering and using the extended Gap statistic for Fuzzy C-means clustering, and are found as 3, 1, 3 and 2 for annual, pre-monsoon, monsoon and post-monsoon, respectively. This study investigates the clustering methods in terms of the similarity, members and homogeneity, among the clusters formed. The clusters are also characterized to see how they are distributed. Moreover, in terms of cluster homogeneity, Fuzzy C-means algorithm outperforms the other clustering methods.","author":[{"dropping-particle":"","family":"Alam","given":"Mohammad Samsul","non-dropping-particle":"","parse-names":false,"suffix":""},{"dropping-particle":"","family":"Paul","given":"Sangita","non-dropping-particle":"","parse-names":false,"suffix":""}],"container-title":"Journal of applied statistics","id":"ITEM-1","issue":"8","issued":{"date-parts":[["2020"]]},"language":"eng","page":"1460-1481","publisher-place":"England","title":"A comparative analysis of clustering algorithms to identify the homogeneous  rainfall gauge stations of Bangladesh.","type":"article-journal","volume":"47"},"uris":["http://www.mendeley.com/documents/?uuid=0da70aab-98a7-44a3-a63e-87dd75ad2ae1"]},{"id":"ITEM-2","itemData":{"DOI":"10.1088/1757-899X/879/1/012057","abstract":"The purpose of this study is to compare between two different of cluster analysis algorithm in data mining on the Tropical Rainfall Measuring Mission (TRMM). The TRMM is a joint mission between NASA and the Japan Aerospace Exploration (JAXA) Agency to study rainfall for weather and climate research. The TRMM satellite data-sets used in this research is a 3-hourly rainfall data within 10 years from 1998 to 2007. These data-sets will be analyzed by two different cluster analysis algorithms in data mining which are K-means and DBScan. In this paper, rainfall data in Jakarta based on TRMM was analyzed and compared in the efficiency and the accuracy using each algorithm. The comparison results of the two algorithmic processes can be seen from several parameters, especially from the number of clusters formed and the time needed to process the model.","author":[{"dropping-particle":"","family":"Pamuji","given":"Geraldi","non-dropping-particle":"","parse-names":false,"suffix":""},{"dropping-particle":"","family":"Rongtao","given":"H","non-dropping-particle":"","parse-names":false,"suffix":""}],"container-title":"IOP Conference Series: Materials Science and Engineering","id":"ITEM-2","issued":{"date-parts":[["2020","8","7"]]},"page":"12057","title":"A Comparison study of DBScan and K-Means Clustering in Jakarta rainfall based on the Tropical Rainfall Measuring Mission (TRMM) 1998-2007","type":"article-journal","volume":"879"},"uris":["http://www.mendeley.com/documents/?uuid=6158611d-2762-4ebc-b9e0-f7b497f646b9"]},{"id":"ITEM-3","itemData":{"DOI":"10.2991/978-94-6463-716-8_18","ISBN":"1951-6851","author":[{"dropping-particle":"","family":"Jain","given":"Anupam","non-dropping-particle":"","parse-names":false,"suffix":""},{"dropping-particle":"","family":"Rathi","given":"Khushal","non-dropping-particle":"","parse-names":false,"suffix":""},{"dropping-particle":"","family":"Ganguly","given":"Yuboraj","non-dropping-particle":"","parse-names":false,"suffix":""},{"dropping-particle":"","family":"Kumar","given":"Ankit","non-dropping-particle":"","parse-names":false,"suffix":""},{"dropping-particle":"","family":"Bhale","given":"Yogiraj","non-dropping-particle":"","parse-names":false,"suffix":""}],"id":"ITEM-3","issued":{"date-parts":[["2025"]]},"page":"212-221","publisher":"Atlantis Press","title":"A Comparative Analysis of DBSCAN, K-Means and Agglomerative Clustering Algorithms for Geospatial Data BT  - Proceedings of the International Conference on Recent Advancements and Modernisations in Sustainable Intelligent Technologies and Applications (RAM","type":"paper-conference"},"uris":["http://www.mendeley.com/documents/?uuid=3b7b166b-6e15-470c-9816-4df9918e5e63"]}],"mendeley":{"formattedCitation":"(Alam &amp; Paul, 2020; A. Jain et al., 2025; Pamuji &amp; Rongtao, 2020)","plainTextFormattedCitation":"(Alam &amp; Paul, 2020; A. Jain et al., 2025; Pamuji &amp; Rongtao, 2020)","previouslyFormattedCitation":"(Alam &amp; Paul, 2020; A. Jain et al., 2025; Pamuji &amp; Rongtao, 2020)"},"properties":{"noteIndex":0},"schema":"https://github.com/citation-style-language/schema/raw/master/csl-citation.json"}</w:instrText>
       </w:r>
       <w:r>
         <w:fldChar w:fldCharType="separate"/>
@@ -3480,7 +3473,7 @@
         <w:fldChar w:fldCharType="begin" w:fldLock="1"/>
       </w:r>
       <w:r>
-        <w:instrText>ADDIN CSL_CITATION {"citationItems":[{"id":"ITEM-1","itemData":{"DOI":"10.1088/1757-899X/879/1/012057","abstract":"The purpose of this study is to compare between two different of cluster analysis algorithm in data mining on the Tropical Rainfall Measuring Mission (TRMM). The TRMM is a joint mission between NASA and the Japan Aerospace Exploration (JAXA) Agency to study rainfall for weather and climate research. The TRMM satellite data-sets used in this research is a 3-hourly rainfall data within 10 years from 1998 to 2007. These data-sets will be analyzed by two different cluster analysis algorithms in data mining which are K-means and DBScan. In this paper, rainfall data in Jakarta based on TRMM was analyzed and compared in the efficiency and the accuracy using each algorithm. The comparison results of the two algorithmic processes can be seen from several parameters, especially from the number of clusters formed and the time needed to process the model.","author":[{"dropping-particle":"","family":"Pamuji","given":"Geraldi","non-dropping-particle":"","parse-names":false,"suffix":""},{"dropping-particle":"","family":"Rongtao","given":"H","non-dropping-particle":"","parse-names":false,"suffix":""}],"container-title":"IOP Conference Series: Materials Science and Engineering","id":"ITEM-1","issued":{"date-parts":[["2020","8","7"]]},"page":"12057","title":"A Comparison study of DBScan and K-Means Clustering in Jakarta rainfall based on the Tropical Rainfall Measuring Mission (TRMM) 1998-2007","type":"article-journal","volume":"879"},"uris":["http://www.mendeley.com/documents/?uuid=6158611d-2762-4ebc-b9e0-f7b497f646b9"]},{"id":"ITEM-2","itemData":{"DOI":"10.34028/iajit/19/1/3","abstract":"Anomaly detection concerns identifying anomalous observations or patterns that are a deviation from the dataset's expected behaviour. The detection of anomalies has significant and practical applications in several industrial domains such as public health, finance, Information Technology (IT), security, medical, energy, and climate studies. Density-Based Spatial Clustering of Applications with Noise (DBSCAN) Algorithm is a density-based clustering algorithm with the capability of identifying anomalous data. In this paper, a modified DBSCAN algorithm is proposed for anomaly detection in time-series data with seasonality. For experimental evaluation, a monthly temperature dataset was employed and the analysis set forth the advantages of the modified DBSCAN over the standard DBSCAN algorithm for the seasonal datasets. From the result analysis, we may conclude that DBSCAN is used for finding the anomalies in a dataset but fails to find local anomalies in seasonal data. The proposed Modified DBSCAN approach helps to find both the global and local anomalies from the seasonal data. Using normal DBSCAN, we are able to get 19 (2.16%) anomaly points. While using the modified approach for DBSCAN, we are able to get 42 (4.79%) anomaly points. In comparison, we can say that we are able to get 2.21% more anomalies using the modified DBSCAN approach. Hence, the proposed Modified DBSCAN algorithm outperforms in comparison with the DBSCAN algorithm to find local anomalies.","author":[{"dropping-particle":"","family":"Jain","given":"P.","non-dropping-particle":"","parse-names":false,"suffix":""},{"dropping-particle":"","family":"Bajpai","given":"M. S.","non-dropping-particle":"","parse-names":false,"suffix":""},{"dropping-particle":"","family":"Pamula","given":"R.","non-dropping-particle":"","parse-names":false,"suffix":""}],"container-title":"The International Arab Journal of Information Technology","id":"ITEM-2","issue":"1","issued":{"date-parts":[["2022"]]},"title":"A Modified DBSCAN Algorithm for Anomaly Detection in Time-series Data with Seasonality","type":"article-journal","volume":"19"},"uris":["http://www.mendeley.com/documents/?uuid=cd5d28bb-2a1a-4e0a-929b-0a78da3e9d2c"]},{"id":"ITEM-3","itemData":{"DOI":"10.2991/978-94-6463-716-8_18","ISBN":"1951-6851","author":[{"dropping-particle":"","family":"Jain","given":"Anupam","non-dropping-particle":"","parse-names":false,"suffix":""},{"dropping-particle":"","family":"Rathi","given":"Khushal","non-dropping-particle":"","parse-names":false,"suffix":""},{"dropping-particle":"","family":"Ganguly","given":"Yuboraj","non-dropping-particle":"","parse-names":false,"suffix":""},{"dropping-particle":"","family":"Kumar","given":"Ankit","non-dropping-particle":"","parse-names":false,"suffix":""},{"dropping-particle":"","family":"Bhale","given":"Yogiraj","non-dropping-particle":"","parse-names":false,"suffix":""}],"id":"ITEM-3","issued":{"date-parts":[["2025"]]},"page":"212-221","publisher":"Atlantis Press","title":"A Comparative Analysis of DBSCAN, K-Means and Agglomerative Clustering Algorithms for Geospatial Data BT  - Proceedings of the International Conference on Recent Advancements and Modernisations in Sustainable Intelligent Technologies and Applications (RAMSITA 2025)","type":"paper-conference"},"uris":["http://www.mendeley.com/documents/?uuid=3b7b166b-6e15-470c-9816-4df9918e5e63"]}],"mendeley":{"formattedCitation":"(A. Jain et al., 2025; P. Jain et al., 2022; Pamuji &amp; Rongtao, 2020)","plainTextFormattedCitation":"(A. Jain et al., 2025; P. Jain et al., 2022; Pamuji &amp; Rongtao, 2020)","previouslyFormattedCitation":"(A. Jain et al., 2025; P. Jain et al., 2022; Pamuji &amp; Rongtao, 2020)"},"properties":{"noteIndex":0},"schema":"https://github.com/citation-style-language/schema/raw/master/csl-citation.json"}</w:instrText>
+        <w:instrText>ADDIN CSL_CITATION {"citationItems":[{"id":"ITEM-1","itemData":{"DOI":"10.1088/1757-899X/879/1/012057","abstract":"The purpose of this study is to compare between two different of cluster analysis algorithm in data mining on the Tropical Rainfall Measuring Mission (TRMM). The TRMM is a joint mission between NASA and the Japan Aerospace Exploration (JAXA) Agency to study rainfall for weather and climate research. The TRMM satellite data-sets used in this research is a 3-hourly rainfall data within 10 years from 1998 to 2007. These data-sets will be analyzed by two different cluster analysis algorithms in data mining which are K-means and DBScan. In this paper, rainfall data in Jakarta based on TRMM was analyzed and compared in the efficiency and the accuracy using each algorithm. The comparison results of the two algorithmic processes can be seen from several parameters, especially from the number of clusters formed and the time needed to process the model.","author":[{"dropping-particle":"","family":"Pamuji","given":"Geraldi","non-dropping-particle":"","parse-names":false,"suffix":""},{"dropping-particle":"","family":"Rongtao","given":"H","non-dropping-particle":"","parse-names":false,"suffix":""}],"container-title":"IOP Conference Series: Materials Science and Engineering","id":"ITEM-1","issued":{"date-parts":[["2020","8","7"]]},"page":"12057","title":"A Comparison study of DBScan and K-Means Clustering in Jakarta rainfall based on the Tropical Rainfall Measuring Mission (TRMM) 1998-2007","type":"article-journal","volume":"879"},"uris":["http://www.mendeley.com/documents/?uuid=6158611d-2762-4ebc-b9e0-f7b497f646b9"]},{"id":"ITEM-2","itemData":{"DOI":"10.34028/iajit/19/1/3","abstract":"Anomaly detection concerns identifying anomalous observations or patterns that are a deviation from the dataset's expected behaviour. The detection of anomalies has significant and practical applications in several industrial domains such as public health, finance, Information Technology (IT), security, medical, energy, and climate studies. Density-Based Spatial Clustering of Applications with Noise (DBSCAN) Algorithm is a density-based clustering algorithm with the capability of identifying anomalous data. In this paper, a modified DBSCAN algorithm is proposed for anomaly detection in time-series data with seasonality. For experimental evaluation, a monthly temperature dataset was employed and the analysis set forth the advantages of the modified DBSCAN over the standard DBSCAN algorithm for the seasonal datasets. From the result analysis, we may conclude that DBSCAN is used for finding the anomalies in a dataset but fails to find local anomalies in seasonal data. The proposed Modified DBSCAN approach helps to find both the global and local anomalies from the seasonal data. Using normal DBSCAN, we are able to get 19 (2.16%) anomaly points. While using the modified approach for DBSCAN, we are able to get 42 (4.79%) anomaly points. In comparison, we can say that we are able to get 2.21% more anomalies using the modified DBSCAN approach. Hence, the proposed Modified DBSCAN algorithm outperforms in comparison with the DBSCAN algorithm to find local anomalies.","author":[{"dropping-particle":"","family":"Jain","given":"P.","non-dropping-particle":"","parse-names":false,"suffix":""},{"dropping-particle":"","family":"Bajpai","given":"M. S.","non-dropping-particle":"","parse-names":false,"suffix":""},{"dropping-particle":"","family":"Pamula","given":"R.","non-dropping-particle":"","parse-names":false,"suffix":""}],"container-title":"The International Arab Journal of Information Technology","id":"ITEM-2","issue":"1","issued":{"date-parts":[["2022"]]},"title":"A Modified DBSCAN Algorithm for Anomaly Detection in Time-series Data with Seasonality","type":"article-journal","volume":"19"},"uris":["http://www.mendeley.com/documents/?uuid=cd5d28bb-2a1a-4e0a-929b-0a78da3e9d2c"]},{"id":"ITEM-3","itemData":{"DOI":"10.2991/978-94-6463-716-8_18","ISBN":"1951-6851","author":[{"dropping-particle":"","family":"Jain","given":"Anupam","non-dropping-particle":"","parse-names":false,"suffix":""},{"dropping-particle":"","family":"Rathi","given":"Khushal","non-dropping-particle":"","parse-names":false,"suffix":""},{"dropping-particle":"","family":"Ganguly","given":"Yuboraj","non-dropping-particle":"","parse-names":false,"suffix":""},{"dropping-particle":"","family":"Kumar","given":"Ankit","non-dropping-particle":"","parse-names":false,"suffix":""},{"dropping-particle":"","family":"Bhale","given":"Yogiraj","non-dropping-particle":"","parse-names":false,"suffix":""}],"id":"ITEM-3","issued":{"date-parts":[["2025"]]},"page":"212-221","publisher":"Atlantis Press","title":"A Comparative Analysis of DBSCAN, K-Means and Agglomerative Clustering Algorithms for Geospatial Data BT  - Proceedings of the International Conference on Recent Advancements and Modernisations in Sustainable Intelligent Technologies and Applications (RAM","type":"paper-conference"},"uris":["http://www.mendeley.com/documents/?uuid=3b7b166b-6e15-470c-9816-4df9918e5e63"]}],"mendeley":{"formattedCitation":"(A. Jain et al., 2025; P. Jain et al., 2022; Pamuji &amp; Rongtao, 2020)","plainTextFormattedCitation":"(A. Jain et al., 2025; P. Jain et al., 2022; Pamuji &amp; Rongtao, 2020)","previouslyFormattedCitation":"(A. Jain et al., 2025; P. Jain et al., 2022; Pamuji &amp; Rongtao, 2020)"},"properties":{"noteIndex":0},"schema":"https://github.com/citation-style-language/schema/raw/master/csl-citation.json"}</w:instrText>
       </w:r>
       <w:r>
         <w:fldChar w:fldCharType="separate"/>
@@ -3664,10 +3657,7 @@
         <w:t>Berdasarkan tinjauan literatur, terdapat beberapa pendekatan yang terbukti efektif untuk analisis klasterisasi data curah hujan di Indonesia, dengan hasil yang sangat bergantung pada metodologi yang dipilih</w:t>
       </w:r>
       <w:r>
-        <w:t xml:space="preserve">. </w:t>
-      </w:r>
-      <w:r>
-        <w:t xml:space="preserve">Penelitian </w:t>
+        <w:t xml:space="preserve">. Penelitian </w:t>
       </w:r>
       <w:r>
         <w:fldChar w:fldCharType="begin" w:fldLock="1"/>
@@ -3700,31 +3690,7 @@
         <w:fldChar w:fldCharType="end"/>
       </w:r>
       <w:r>
-        <w:t xml:space="preserve"> </w:t>
-      </w:r>
-      <w:r>
-        <w:t>menunjukkan bahwa kombinasi algoritma Agglomerative Hierarchical clustering dengan metrik jarak berhasil</w:t>
-      </w:r>
-      <w:r>
-        <w:t xml:space="preserve"> </w:t>
-      </w:r>
-      <w:r>
-        <w:t xml:space="preserve">mengidentifikasi lima pola curah hujan utama di seluruh provinsi </w:t>
-      </w:r>
-      <w:r>
-        <w:t xml:space="preserve">Indonesia. </w:t>
-      </w:r>
-      <w:r>
-        <w:t xml:space="preserve">Hasil ini divalidasi dengan Silhouette </w:t>
-      </w:r>
-      <w:r>
-        <w:t>Score</w:t>
-      </w:r>
-      <w:r>
-        <w:t xml:space="preserve"> 0.813, menunjukkan kualitas pengelompokan yang sangat baik</w:t>
-      </w:r>
-      <w:r>
-        <w:t xml:space="preserve">. </w:t>
+        <w:t xml:space="preserve"> menunjukkan bahwa kombinasi algoritma Agglomerative Hierarchical clustering dengan metrik jarak berhasil mengidentifikasi lima pola curah hujan utama di seluruh provinsi Indonesia. Hasil ini divalidasi dengan Silhouette Score 0.813, menunjukkan kualitas pengelompokan yang sangat baik. </w:t>
       </w:r>
       <w:r>
         <w:t xml:space="preserve">Pada penelitian curah hujan di </w:t>
@@ -3760,7 +3726,7 @@
         <w:fldChar w:fldCharType="begin" w:fldLock="1"/>
       </w:r>
       <w:r>
-        <w:instrText>ADDIN CSL_CITATION {"citationItems":[{"id":"ITEM-1","itemData":{"DOI":"10.34028/iajit/19/1/3","abstract":"Anomaly detection concerns identifying anomalous observations or patterns that are a deviation from the dataset's expected behaviour. The detection of anomalies has significant and practical applications in several industrial domains such as public health, finance, Information Technology (IT), security, medical, energy, and climate studies. Density-Based Spatial Clustering of Applications with Noise (DBSCAN) Algorithm is a density-based clustering algorithm with the capability of identifying anomalous data. In this paper, a modified DBSCAN algorithm is proposed for anomaly detection in time-series data with seasonality. For experimental evaluation, a monthly temperature dataset was employed and the analysis set forth the advantages of the modified DBSCAN over the standard DBSCAN algorithm for the seasonal datasets. From the result analysis, we may conclude that DBSCAN is used for finding the anomalies in a dataset but fails to find local anomalies in seasonal data. The proposed Modified DBSCAN approach helps to find both the global and local anomalies from the seasonal data. Using normal DBSCAN, we are able to get 19 (2.16%) anomaly points. While using the modified approach for DBSCAN, we are able to get 42 (4.79%) anomaly points. In comparison, we can say that we are able to get 2.21% more anomalies using the modified DBSCAN approach. Hence, the proposed Modified DBSCAN algorithm outperforms in comparison with the DBSCAN algorithm to find local anomalies.","author":[{"dropping-particle":"","family":"Jain","given":"P.","non-dropping-particle":"","parse-names":false,"suffix":""},{"dropping-particle":"","family":"Bajpai","given":"M. S.","non-dropping-particle":"","parse-names":false,"suffix":""},{"dropping-particle":"","family":"Pamula","given":"R.","non-dropping-particle":"","parse-names":false,"suffix":""}],"container-title":"The International Arab Journal of Information Technology","id":"ITEM-1","issue":"1","issued":{"date-parts":[["2022"]]},"title":"A Modified DBSCAN Algorithm for Anomaly Detection in Time-series Data with Seasonality","type":"article-journal","volume":"19"},"uris":["http://www.mendeley.com/documents/?uuid=cd5d28bb-2a1a-4e0a-929b-0a78da3e9d2c"]},{"id":"ITEM-2","itemData":{"DOI":"10.2991/978-94-6463-716-8_18","ISBN":"1951-6851","author":[{"dropping-particle":"","family":"Jain","given":"Anupam","non-dropping-particle":"","parse-names":false,"suffix":""},{"dropping-particle":"","family":"Rathi","given":"Khushal","non-dropping-particle":"","parse-names":false,"suffix":""},{"dropping-particle":"","family":"Ganguly","given":"Yuboraj","non-dropping-particle":"","parse-names":false,"suffix":""},{"dropping-particle":"","family":"Kumar","given":"Ankit","non-dropping-particle":"","parse-names":false,"suffix":""},{"dropping-particle":"","family":"Bhale","given":"Yogiraj","non-dropping-particle":"","parse-names":false,"suffix":""}],"id":"ITEM-2","issued":{"date-parts":[["2025"]]},"page":"212-221","publisher":"Atlantis Press","title":"A Comparative Analysis of DBSCAN, K-Means and Agglomerative Clustering Algorithms for Geospatial Data BT  - Proceedings of the International Conference on Recent Advancements and Modernisations in Sustainable Intelligent Technologies and Applications (RAMSITA 2025)","type":"paper-conference"},"uris":["http://www.mendeley.com/documents/?uuid=3b7b166b-6e15-470c-9816-4df9918e5e63"]}],"mendeley":{"formattedCitation":"(A. Jain et al., 2025; P. Jain et al., 2022)","plainTextFormattedCitation":"(A. Jain et al., 2025; P. Jain et al., 2022)"},"properties":{"noteIndex":0},"schema":"https://github.com/citation-style-language/schema/raw/master/csl-citation.json"}</w:instrText>
+        <w:instrText>ADDIN CSL_CITATION {"citationItems":[{"id":"ITEM-1","itemData":{"DOI":"10.34028/iajit/19/1/3","abstract":"Anomaly detection concerns identifying anomalous observations or patterns that are a deviation from the dataset's expected behaviour. The detection of anomalies has significant and practical applications in several industrial domains such as public health, finance, Information Technology (IT), security, medical, energy, and climate studies. Density-Based Spatial Clustering of Applications with Noise (DBSCAN) Algorithm is a density-based clustering algorithm with the capability of identifying anomalous data. In this paper, a modified DBSCAN algorithm is proposed for anomaly detection in time-series data with seasonality. For experimental evaluation, a monthly temperature dataset was employed and the analysis set forth the advantages of the modified DBSCAN over the standard DBSCAN algorithm for the seasonal datasets. From the result analysis, we may conclude that DBSCAN is used for finding the anomalies in a dataset but fails to find local anomalies in seasonal data. The proposed Modified DBSCAN approach helps to find both the global and local anomalies from the seasonal data. Using normal DBSCAN, we are able to get 19 (2.16%) anomaly points. While using the modified approach for DBSCAN, we are able to get 42 (4.79%) anomaly points. In comparison, we can say that we are able to get 2.21% more anomalies using the modified DBSCAN approach. Hence, the proposed Modified DBSCAN algorithm outperforms in comparison with the DBSCAN algorithm to find local anomalies.","author":[{"dropping-particle":"","family":"Jain","given":"P.","non-dropping-particle":"","parse-names":false,"suffix":""},{"dropping-particle":"","family":"Bajpai","given":"M. S.","non-dropping-particle":"","parse-names":false,"suffix":""},{"dropping-particle":"","family":"Pamula","given":"R.","non-dropping-particle":"","parse-names":false,"suffix":""}],"container-title":"The International Arab Journal of Information Technology","id":"ITEM-1","issue":"1","issued":{"date-parts":[["2022"]]},"title":"A Modified DBSCAN Algorithm for Anomaly Detection in Time-series Data with Seasonality","type":"article-journal","volume":"19"},"uris":["http://www.mendeley.com/documents/?uuid=cd5d28bb-2a1a-4e0a-929b-0a78da3e9d2c"]},{"id":"ITEM-2","itemData":{"DOI":"10.2991/978-94-6463-716-8_18","ISBN":"1951-6851","author":[{"dropping-particle":"","family":"Jain","given":"Anupam","non-dropping-particle":"","parse-names":false,"suffix":""},{"dropping-particle":"","family":"Rathi","given":"Khushal","non-dropping-particle":"","parse-names":false,"suffix":""},{"dropping-particle":"","family":"Ganguly","given":"Yuboraj","non-dropping-particle":"","parse-names":false,"suffix":""},{"dropping-particle":"","family":"Kumar","given":"Ankit","non-dropping-particle":"","parse-names":false,"suffix":""},{"dropping-particle":"","family":"Bhale","given":"Yogiraj","non-dropping-particle":"","parse-names":false,"suffix":""}],"id":"ITEM-2","issued":{"date-parts":[["2025"]]},"page":"212-221","publisher":"Atlantis Press","title":"A Comparative Analysis of DBSCAN, K-Means and Agglomerative Clustering Algorithms for Geospatial Data BT  - Proceedings of the International Conference on Recent Advancements and Modernisations in Sustainable Intelligent Technologies and Applications (RAM","type":"paper-conference"},"uris":["http://www.mendeley.com/documents/?uuid=3b7b166b-6e15-470c-9816-4df9918e5e63"]}],"mendeley":{"formattedCitation":"(A. Jain et al., 2025; P. Jain et al., 2022)","plainTextFormattedCitation":"(A. Jain et al., 2025; P. Jain et al., 2022)","previouslyFormattedCitation":"(A. Jain et al., 2025; P. Jain et al., 2022)"},"properties":{"noteIndex":0},"schema":"https://github.com/citation-style-language/schema/raw/master/csl-citation.json"}</w:instrText>
       </w:r>
       <w:r>
         <w:fldChar w:fldCharType="separate"/>
@@ -3781,7 +3747,13 @@
         <w:t>DBSCAN menunjukkan keunggulan dalam menangani data geospasial yang mengandung noise</w:t>
       </w:r>
       <w:r>
-        <w:t>. Oleh karena itu, penelitian ini akan membandingkan hasil pengelompokan pada data curah hujan untuk Stasiun Meteorologi Serang menggunakan pendekatan yang telah dipilih.</w:t>
+        <w:t xml:space="preserve">. Oleh karena itu, penelitian ini akan membandingkan hasil pengelompokan pada data curah hujan untuk </w:t>
+      </w:r>
+      <w:r>
+        <w:t>Stasiun Meteorologi Maritim Serang</w:t>
+      </w:r>
+      <w:r>
+        <w:t xml:space="preserve"> menggunakan pendekatan yang telah dipilih.</w:t>
       </w:r>
     </w:p>
     <w:p/>
@@ -3807,7 +3779,2781 @@
       </w:r>
     </w:p>
     <w:p/>
+    <w:p>
+      <w:pPr>
+        <w:keepNext/>
+        <w:spacing w:line="240" w:lineRule="auto"/>
+        <w:jc w:val="center"/>
+      </w:pPr>
+      <w:r>
+        <w:rPr>
+          <w:rFonts w:eastAsia="Times New Roman"/>
+          <w:noProof/>
+          <w14:ligatures w14:val="none"/>
+        </w:rPr>
+        <w:drawing>
+          <wp:inline distT="0" distB="0" distL="0" distR="0" wp14:anchorId="0EE7994C" wp14:editId="65C0A189">
+            <wp:extent cx="3535680" cy="2811780"/>
+            <wp:effectExtent l="0" t="0" r="7620" b="0"/>
+            <wp:docPr id="3" name="Picture 2" descr="A black and white diagram&#10;&#10;AI-generated content may be incorrect."/>
+            <wp:cNvGraphicFramePr>
+              <a:graphicFrameLocks xmlns:a="http://schemas.openxmlformats.org/drawingml/2006/main" noChangeAspect="1"/>
+            </wp:cNvGraphicFramePr>
+            <a:graphic xmlns:a="http://schemas.openxmlformats.org/drawingml/2006/main">
+              <a:graphicData uri="http://schemas.openxmlformats.org/drawingml/2006/picture">
+                <pic:pic xmlns:pic="http://schemas.openxmlformats.org/drawingml/2006/picture">
+                  <pic:nvPicPr>
+                    <pic:cNvPr id="3" name="Picture 2" descr="A black and white diagram&#10;&#10;AI-generated content may be incorrect."/>
+                    <pic:cNvPicPr>
+                      <a:picLocks noChangeAspect="1" noChangeArrowheads="1"/>
+                    </pic:cNvPicPr>
+                  </pic:nvPicPr>
+                  <pic:blipFill>
+                    <a:blip r:embed="rId8" cstate="print">
+                      <a:extLst>
+                        <a:ext uri="{28A0092B-C50C-407E-A947-70E740481C1C}">
+                          <a14:useLocalDpi xmlns:a14="http://schemas.microsoft.com/office/drawing/2010/main" val="0"/>
+                        </a:ext>
+                      </a:extLst>
+                    </a:blip>
+                    <a:srcRect/>
+                    <a:stretch>
+                      <a:fillRect/>
+                    </a:stretch>
+                  </pic:blipFill>
+                  <pic:spPr bwMode="auto">
+                    <a:xfrm>
+                      <a:off x="0" y="0"/>
+                      <a:ext cx="3535680" cy="2811780"/>
+                    </a:xfrm>
+                    <a:prstGeom prst="rect">
+                      <a:avLst/>
+                    </a:prstGeom>
+                    <a:noFill/>
+                    <a:ln>
+                      <a:noFill/>
+                    </a:ln>
+                  </pic:spPr>
+                </pic:pic>
+              </a:graphicData>
+            </a:graphic>
+          </wp:inline>
+        </w:drawing>
+      </w:r>
+    </w:p>
+    <w:p>
+      <w:pPr>
+        <w:pStyle w:val="Caption"/>
+      </w:pPr>
+      <w:r>
+        <w:t>Gambar 2.</w:t>
+      </w:r>
+      <w:fldSimple w:instr=" SEQ Gambar_2. \* ARABIC ">
+        <w:r>
+          <w:t>1</w:t>
+        </w:r>
+      </w:fldSimple>
+      <w:r>
+        <w:t xml:space="preserve"> Kerangka teoretis penelitian</w:t>
+      </w:r>
+    </w:p>
     <w:p/>
+    <w:p>
+      <w:r>
+        <w:t xml:space="preserve">Kerangka teoretis ini menempatkan data curah hujan </w:t>
+      </w:r>
+      <w:r>
+        <w:fldChar w:fldCharType="begin" w:fldLock="1"/>
+      </w:r>
+      <w:r>
+        <w:instrText>ADDIN CSL_CITATION {"citationItems":[{"id":"ITEM-1","itemData":{"author":[{"dropping-particle":"","family":"BMKG","given":"","non-dropping-particle":"","parse-names":false,"suffix":""}],"id":"ITEM-1","issued":{"date-parts":[["2016"]]},"publisher":"BMKG","title":"Peraturan Kepala BMKG Nomor 4 Tahun 2016 Tentang Pengamatan dan Pengelolaan Data Iklim di Lingkungan BMKG","type":"article"},"uris":["http://www.mendeley.com/documents/?uuid=577f9b7b-2fd4-4a16-86a0-a354296e5012"]},{"id":"ITEM-2","itemData":{"author":[{"dropping-particle":"","family":"BMKG","given":"","non-dropping-particle":"","parse-names":false,"suffix":""}],"id":"ITEM-2","issued":{"date-parts":[["2022"]]},"publisher":"BMKG","title":"Pemutakhiran Zona Musim Indonesia Periode 1991 -- 2020","type":"book"},"uris":["http://www.mendeley.com/documents/?uuid=3834086e-479e-4332-ad9a-222bb298ddb7"]}],"mendeley":{"formattedCitation":"(BMKG, 2016b, 2022)","manualFormatting":"BMKG (2016b, 2022)","plainTextFormattedCitation":"(BMKG, 2016b, 2022)","previouslyFormattedCitation":"(BMKG, 2016b, 2022)"},"properties":{"noteIndex":0},"schema":"https://github.com/citation-style-language/schema/raw/master/csl-citation.json"}</w:instrText>
+      </w:r>
+      <w:r>
+        <w:fldChar w:fldCharType="separate"/>
+      </w:r>
+      <w:r>
+        <w:rPr>
+          <w:noProof/>
+        </w:rPr>
+        <w:t xml:space="preserve">BMKG </w:t>
+      </w:r>
+      <w:r>
+        <w:rPr>
+          <w:noProof/>
+        </w:rPr>
+        <w:t>(</w:t>
+      </w:r>
+      <w:r>
+        <w:rPr>
+          <w:noProof/>
+        </w:rPr>
+        <w:t>2016b, 2022)</w:t>
+      </w:r>
+      <w:r>
+        <w:fldChar w:fldCharType="end"/>
+      </w:r>
+      <w:r>
+        <w:t xml:space="preserve"> </w:t>
+      </w:r>
+      <w:r>
+        <w:t>dan kebutuhan perencanaan tata ruang (Asta Cita; WMO 2011) sebagai dua pilar input yang saling melengkapi. Data curah hujan menyediakan gambaran kuantitatif tentang variabilitas spasial-temporal presipitasi di wilayah</w:t>
+      </w:r>
+      <w:r>
+        <w:t xml:space="preserve"> Indonesia, khususnya di</w:t>
+      </w:r>
+      <w:r>
+        <w:t xml:space="preserve"> Serang</w:t>
+      </w:r>
+      <w:r>
+        <w:t>,</w:t>
+      </w:r>
+      <w:r>
+        <w:t xml:space="preserve"> </w:t>
+      </w:r>
+      <w:r>
+        <w:t xml:space="preserve">di mana informasi iklim </w:t>
+      </w:r>
+      <w:r>
+        <w:t>penting untuk memetakan risiko banjir, kekeringan, maupun ketersediaan air. Sementara itu, dokumen tata ruang mensyaratkan pemanfaatan informasi iklim agar setiap zonasi lahan, infrastruktur, dan koridor hijau dapat beradaptasi dengan skenario iklim saat ini maupun proyeksi jangka panjang. Kedua sumber tersebut memengaruhi kebutuhan produk informasi iklim sebagaimana dikemukakan</w:t>
+      </w:r>
+      <w:r>
+        <w:t xml:space="preserve"> </w:t>
+      </w:r>
+      <w:r>
+        <w:fldChar w:fldCharType="begin" w:fldLock="1"/>
+      </w:r>
+      <w:r>
+        <w:instrText>ADDIN CSL_CITATION {"citationItems":[{"id":"ITEM-1","itemData":{"DOI":"https://doi.org/10.1016/j.resconrec.2014.07.014","ISSN":"0921-3449","abstract":"Runoff water management is among the inherent challenges which face the sustainability of the development of arid urban centers. These areas are particularly at risk from flooding due to rainfall concentration in few heavy showers. On the other hand, they are susceptible to drought. The capital of Sudan (Khartoum) stands as exemplary for these issues. Hence, this research study aims at investigating the potential of applying rainwater harvesting (RWH) in Khartoum City Center as a potential urban runoff management tool. Rapid urbanization coupled with the extension of impervious surfaces has intensified the heat island in Khartoum. Consequently, increased frequency of heat waves and dust storms during the dry summer and streets flooding during the rainy season have led to environmental, economical, and health problems. The study starts with exposing the rainfall behavior in Khartoum by investigating rainfall variability, number of raindays, distribution of rain over the season, probability of daily rainfall, maximum daily rainfall and deficit/surplus of rain through time. The daily rainfall data show that very strong falls of &gt;30mm occur almost once every wet season. Decreased intra- and inter-annual rainfall surpluses as well as increased rainfall concentration in the month of August have been taking place. The 30-year rainfall variability is calculated at decade interval since 1941. Increasing variability is revealed with 1981–2010 having coefficients of variation of 66.6% for the annual values and 108.8–118.0% for the wettest months (July–September). Under the aforementioned rainfall conditions, this paper then explores the potential of RWH in Khartoum City Center as an option for storm water management since the drainage system covers only 40% of the study area. The potential runoff from the 6.5km2 center area is computed using the United States Natural Resources Conservation Services method (US-NRCS), where a weighted Curve Number (CN) of 94% is found, confirming dominant imperviousness. Rainfall threshold for runoff generation is found to be 3.3mm. A 24,000m3 runoff generated from a 13.1mm rainfall (with 80% probability and one year return period) equals the drainage system capacity. An extreme rainfall of 30mm produces a runoff equivalent to fourfold the drainage capacity. It is suggested that the former and latter volumes mentioned above could be harvested by applying the rational method from 18% and 80% rooftops of the commercial and business di…","author":[{"dropping-particle":"","family":"Mahmoud","given":"Wifag Hassan","non-dropping-particle":"","parse-names":false,"suffix":""},{"dropping-particle":"","family":"Elagib","given":"Nadir Ahmed","non-dropping-particle":"","parse-names":false,"suffix":""},{"dropping-particle":"","family":"Gaese","given":"Hartmut","non-dropping-particle":"","parse-names":false,"suffix":""},{"dropping-particle":"","family":"Heinrich","given":"Jürgen","non-dropping-particle":"","parse-names":false,"suffix":""}],"container-title":"Resources, Conservation and Recycling","id":"ITEM-1","issued":{"date-parts":[["2014"]]},"page":"89-99","title":"Rainfall conditions and rainwater harvesting potential in the urban area of Khartoum","type":"article-journal","volume":"91"},"uris":["http://www.mendeley.com/documents/?uuid=64b97122-aba1-4283-ac3a-6f733d9efb7c"]}],"mendeley":{"formattedCitation":"(Mahmoud et al., 2014)","manualFormatting":"Mahmoud et al. (2014)","plainTextFormattedCitation":"(Mahmoud et al., 2014)","previouslyFormattedCitation":"(Mahmoud et al., 2014)"},"properties":{"noteIndex":0},"schema":"https://github.com/citation-style-language/schema/raw/master/csl-citation.json"}</w:instrText>
+      </w:r>
+      <w:r>
+        <w:fldChar w:fldCharType="separate"/>
+      </w:r>
+      <w:r>
+        <w:rPr>
+          <w:noProof/>
+        </w:rPr>
+        <w:t xml:space="preserve">Mahmoud et al. </w:t>
+      </w:r>
+      <w:r>
+        <w:rPr>
+          <w:noProof/>
+        </w:rPr>
+        <w:t>(</w:t>
+      </w:r>
+      <w:r>
+        <w:rPr>
+          <w:noProof/>
+        </w:rPr>
+        <w:t>2014)</w:t>
+      </w:r>
+      <w:r>
+        <w:fldChar w:fldCharType="end"/>
+      </w:r>
+      <w:r>
+        <w:t>,</w:t>
+      </w:r>
+      <w:r>
+        <w:t xml:space="preserve"> supaya keputusan tata guna lahan lebih tangguh terhadap variabilitas cuaca ekstrem.</w:t>
+      </w:r>
+    </w:p>
+    <w:p/>
+    <w:p>
+      <w:r>
+        <w:t>T</w:t>
+      </w:r>
+      <w:r>
+        <w:t xml:space="preserve">ahap berikutnya adalah perbandingan algoritma klaster untuk memastikan pola curah hujan yang dihasilkan stabil serta relevan dengan konteks perencanaan. Kebutuhan </w:t>
+      </w:r>
+      <w:r>
+        <w:lastRenderedPageBreak/>
+        <w:t>tersebut memengaruhi pemilihan dan justifikasi metodologi</w:t>
+      </w:r>
+      <w:r>
+        <w:t>. Sebagai contoh</w:t>
+      </w:r>
+      <w:r>
+        <w:t>, K-</w:t>
+      </w:r>
+      <w:r>
+        <w:t>M</w:t>
+      </w:r>
+      <w:r>
+        <w:t xml:space="preserve">eans, </w:t>
+      </w:r>
+      <w:r>
+        <w:t>Agglomerative-Ward</w:t>
+      </w:r>
+      <w:r>
+        <w:t>, atau DBSCAN lebih konsisten memetakan pola musiman dan anomali di Serang.</w:t>
+      </w:r>
+      <w:r>
+        <w:t xml:space="preserve"> Setelah algoritma klaster didapatkan, maka proses selanjutnya adalah menghasilkan produk informasi iklim menggunakan algoritma klaster tersebut.</w:t>
+      </w:r>
+    </w:p>
+    <w:p/>
+    <w:p>
+      <w:pPr>
+        <w:spacing w:after="160" w:line="259" w:lineRule="auto"/>
+        <w:jc w:val="left"/>
+      </w:pPr>
+      <w:r>
+        <w:br w:type="page"/>
+      </w:r>
+    </w:p>
+    <w:p>
+      <w:pPr>
+        <w:pStyle w:val="Heading1"/>
+      </w:pPr>
+      <w:r>
+        <w:lastRenderedPageBreak/>
+        <w:t>BAB 3</w:t>
+      </w:r>
+      <w:r>
+        <w:br/>
+        <w:t>METODOLOGI PENELITIAN</w:t>
+      </w:r>
+    </w:p>
+    <w:p/>
+    <w:p>
+      <w:r>
+        <w:t xml:space="preserve">Bab ini </w:t>
+      </w:r>
+      <w:r>
+        <w:t>men</w:t>
+      </w:r>
+      <w:r>
+        <w:t>jelaskan metodologi penelitian, metode pengolahan data, alur penelitian, dan instrumen penelitian yang digunakan. Penyusunan metodologi merujuk pada pertanyaan penelitian dan tinjauan pustaka yang telah dipaparkan pada Bab 1 dan Bab 2.</w:t>
+      </w:r>
+    </w:p>
+    <w:p/>
+    <w:p>
+      <w:pPr>
+        <w:pStyle w:val="Heading2"/>
+      </w:pPr>
+      <w:r>
+        <w:t>3.1.</w:t>
+      </w:r>
+      <w:r>
+        <w:tab/>
+        <w:t>Desain Penelitian</w:t>
+      </w:r>
+    </w:p>
+    <w:p>
+      <w:r>
+        <w:t>Penelitian ini menggunakan metodologi penelitian kuantitatif, karena melibatkan penyelidikan sistematis atas data numerik serta penggunaan alat statistik dan komputasi untuk analisis. Desain penelitian yang diterapkan adalah eksperimental, yaitu menyiapkan lingkungan terkontrol untuk memanipulasi variabel pemodelan (pemilihan algoritma/parameter klaster) dan mengamati dampaknya terhadap indikator kinerja yang ditetapkan.</w:t>
+      </w:r>
+      <w:r>
+        <w:t xml:space="preserve"> Tabel 3.1 menyajikan atribut desain penelitian secara ringkas.</w:t>
+      </w:r>
+    </w:p>
+    <w:p/>
+    <w:p>
+      <w:pPr>
+        <w:pStyle w:val="Caption"/>
+        <w:keepNext/>
+      </w:pPr>
+      <w:r>
+        <w:t>Tabel 3.</w:t>
+      </w:r>
+      <w:fldSimple w:instr=" SEQ Tabel_3. \* ARABIC ">
+        <w:r>
+          <w:rPr>
+            <w:noProof/>
+          </w:rPr>
+          <w:t>1</w:t>
+        </w:r>
+      </w:fldSimple>
+      <w:r>
+        <w:t xml:space="preserve"> Atribut desain penelitian</w:t>
+      </w:r>
+    </w:p>
+    <w:tbl>
+      <w:tblPr>
+        <w:tblStyle w:val="TableGrid"/>
+        <w:tblW w:w="0" w:type="auto"/>
+        <w:jc w:val="center"/>
+        <w:tblLook w:val="04A0" w:firstRow="1" w:lastRow="0" w:firstColumn="1" w:lastColumn="0" w:noHBand="0" w:noVBand="1"/>
+      </w:tblPr>
+      <w:tblGrid>
+        <w:gridCol w:w="2831"/>
+        <w:gridCol w:w="5386"/>
+      </w:tblGrid>
+      <w:tr>
+        <w:trPr>
+          <w:jc w:val="center"/>
+        </w:trPr>
+        <w:tc>
+          <w:tcPr>
+            <w:tcW w:w="2831" w:type="dxa"/>
+            <w:shd w:val="clear" w:color="auto" w:fill="D1D1D1" w:themeFill="background2" w:themeFillShade="E6"/>
+          </w:tcPr>
+          <w:p>
+            <w:r>
+              <w:t>Atribut</w:t>
+            </w:r>
+          </w:p>
+        </w:tc>
+        <w:tc>
+          <w:tcPr>
+            <w:tcW w:w="5386" w:type="dxa"/>
+            <w:shd w:val="clear" w:color="auto" w:fill="D1D1D1" w:themeFill="background2" w:themeFillShade="E6"/>
+          </w:tcPr>
+          <w:p>
+            <w:r>
+              <w:t>Keterangan</w:t>
+            </w:r>
+          </w:p>
+        </w:tc>
+      </w:tr>
+      <w:tr>
+        <w:trPr>
+          <w:jc w:val="center"/>
+        </w:trPr>
+        <w:tc>
+          <w:tcPr>
+            <w:tcW w:w="2831" w:type="dxa"/>
+          </w:tcPr>
+          <w:p>
+            <w:pPr>
+              <w:jc w:val="left"/>
+            </w:pPr>
+            <w:r>
+              <w:t>Metodologi</w:t>
+            </w:r>
+          </w:p>
+        </w:tc>
+        <w:tc>
+          <w:tcPr>
+            <w:tcW w:w="5386" w:type="dxa"/>
+          </w:tcPr>
+          <w:p>
+            <w:pPr>
+              <w:jc w:val="left"/>
+            </w:pPr>
+            <w:r>
+              <w:t>Kuantitatif</w:t>
+            </w:r>
+          </w:p>
+        </w:tc>
+      </w:tr>
+      <w:tr>
+        <w:trPr>
+          <w:jc w:val="center"/>
+        </w:trPr>
+        <w:tc>
+          <w:tcPr>
+            <w:tcW w:w="2831" w:type="dxa"/>
+          </w:tcPr>
+          <w:p>
+            <w:pPr>
+              <w:jc w:val="left"/>
+            </w:pPr>
+            <w:r>
+              <w:t>Desain</w:t>
+            </w:r>
+          </w:p>
+        </w:tc>
+        <w:tc>
+          <w:tcPr>
+            <w:tcW w:w="5386" w:type="dxa"/>
+          </w:tcPr>
+          <w:p>
+            <w:pPr>
+              <w:jc w:val="left"/>
+            </w:pPr>
+            <w:r>
+              <w:t>Eksperimental</w:t>
+            </w:r>
+          </w:p>
+        </w:tc>
+      </w:tr>
+      <w:tr>
+        <w:trPr>
+          <w:jc w:val="center"/>
+        </w:trPr>
+        <w:tc>
+          <w:tcPr>
+            <w:tcW w:w="2831" w:type="dxa"/>
+          </w:tcPr>
+          <w:p>
+            <w:pPr>
+              <w:jc w:val="left"/>
+            </w:pPr>
+            <w:r>
+              <w:t>Tujuan</w:t>
+            </w:r>
+          </w:p>
+        </w:tc>
+        <w:tc>
+          <w:tcPr>
+            <w:tcW w:w="5386" w:type="dxa"/>
+          </w:tcPr>
+          <w:p>
+            <w:pPr>
+              <w:jc w:val="left"/>
+            </w:pPr>
+            <w:r>
+              <w:t>Identifikasi kelompok curah hujan dan penyusunan informasi berbasis jarak/anomali.</w:t>
+            </w:r>
+          </w:p>
+        </w:tc>
+      </w:tr>
+      <w:tr>
+        <w:trPr>
+          <w:jc w:val="center"/>
+        </w:trPr>
+        <w:tc>
+          <w:tcPr>
+            <w:tcW w:w="2831" w:type="dxa"/>
+          </w:tcPr>
+          <w:p>
+            <w:pPr>
+              <w:jc w:val="left"/>
+            </w:pPr>
+            <w:r>
+              <w:t>Data</w:t>
+            </w:r>
+          </w:p>
+        </w:tc>
+        <w:tc>
+          <w:tcPr>
+            <w:tcW w:w="5386" w:type="dxa"/>
+          </w:tcPr>
+          <w:p>
+            <w:pPr>
+              <w:jc w:val="left"/>
+            </w:pPr>
+            <w:r>
+              <w:t xml:space="preserve">Curah hujan harian Stasiun Meteorologi Maritim Serang Tahun 1975—2025. </w:t>
+            </w:r>
+          </w:p>
+        </w:tc>
+      </w:tr>
+      <w:tr>
+        <w:trPr>
+          <w:jc w:val="center"/>
+        </w:trPr>
+        <w:tc>
+          <w:tcPr>
+            <w:tcW w:w="2831" w:type="dxa"/>
+          </w:tcPr>
+          <w:p>
+            <w:pPr>
+              <w:jc w:val="left"/>
+            </w:pPr>
+            <w:r>
+              <w:t>Metode Pengolahan Data</w:t>
+            </w:r>
+          </w:p>
+        </w:tc>
+        <w:tc>
+          <w:tcPr>
+            <w:tcW w:w="5386" w:type="dxa"/>
+          </w:tcPr>
+          <w:p>
+            <w:pPr>
+              <w:jc w:val="left"/>
+            </w:pPr>
+            <w:r>
+              <w:t>Pengelompokan Data</w:t>
+            </w:r>
+          </w:p>
+        </w:tc>
+      </w:tr>
+      <w:tr>
+        <w:trPr>
+          <w:jc w:val="center"/>
+        </w:trPr>
+        <w:tc>
+          <w:tcPr>
+            <w:tcW w:w="2831" w:type="dxa"/>
+          </w:tcPr>
+          <w:p>
+            <w:pPr>
+              <w:jc w:val="left"/>
+            </w:pPr>
+            <w:r>
+              <w:t>Alat Bantu</w:t>
+            </w:r>
+          </w:p>
+        </w:tc>
+        <w:tc>
+          <w:tcPr>
+            <w:tcW w:w="5386" w:type="dxa"/>
+          </w:tcPr>
+          <w:p>
+            <w:pPr>
+              <w:jc w:val="left"/>
+            </w:pPr>
+            <w:r>
+              <w:t>Scikit-Learn, Python, Microsoft Excel</w:t>
+            </w:r>
+          </w:p>
+        </w:tc>
+      </w:tr>
+    </w:tbl>
+    <w:p/>
+    <w:p>
+      <w:pPr>
+        <w:pStyle w:val="Heading2"/>
+      </w:pPr>
+      <w:r>
+        <w:t>3.2.</w:t>
+      </w:r>
+      <w:r>
+        <w:tab/>
+        <w:t>Tahapan Penelitian</w:t>
+      </w:r>
+    </w:p>
+    <w:p>
+      <w:r>
+        <w:t xml:space="preserve">Subbab ini menguraikan tahapan penelitian secara keseluruhan. Pada proses inti, penelitian mengikuti </w:t>
+      </w:r>
+      <w:r>
+        <w:t xml:space="preserve">pendekatan </w:t>
+      </w:r>
+      <w:r>
+        <w:t>siklus CRISP-DM</w:t>
+      </w:r>
+      <w:r>
+        <w:t xml:space="preserve"> (</w:t>
+      </w:r>
+      <w:r>
+        <w:t>The Cross-Industry Standard Process for Data Mining</w:t>
+      </w:r>
+      <w:r>
+        <w:t>)</w:t>
+      </w:r>
+      <w:r>
+        <w:t xml:space="preserve"> yang merupakan salah satu pedoman dalam menjalankan proyek penambangan data </w:t>
+      </w:r>
+      <w:r>
+        <w:fldChar w:fldCharType="begin" w:fldLock="1"/>
+      </w:r>
+      <w:r>
+        <w:instrText>ADDIN CSL_CITATION {"citationItems":[{"id":"ITEM-1","itemData":{"DOI":"10.3390/make3020020","ISBN":"2504-4990","abstract":"Machine learning is an established and frequently used technique in industry and academia, but a standard process model to improve success and efficiency of machine learning applications is still missing. Project organizations and machine learning practitioners face manifold challenges and risks when developing machine learning applications and have a need for guidance to meet business expectations. This paper therefore proposes a process model for the development of machine learning applications, covering six phases from defining the scope to maintaining the deployed machine learning application. Business and data understanding are executed simultaneously in the first phase, as both have considerable impact on the feasibility of the project. The next phases are comprised of data preparation, modeling, evaluation, and deployment. Special focus is applied to the last phase, as a model running in changing real-time environments requires close monitoring and maintenance to reduce the risk of performance degradation over time. With each task of the process, this work proposes quality assurance methodology that is suitable to address challenges in machine learning development that are identified in the form of risks. The methodology is drawn from practical experience and scientific literature, and has proven to be general and stable. The process model expands on CRISP-DM, a data mining process model that enjoys strong industry support, but fails to address machine learning specific tasks. The presented work proposes an industry- and application-neutral process model tailored for machine learning applications with a focus on technical tasks for quality assurance.","author":[{"dropping-particle":"","family":"Studer","given":"Stefan","non-dropping-particle":"","parse-names":false,"suffix":""},{"dropping-particle":"","family":"Bui","given":"Thanh B","non-dropping-particle":"","parse-names":false,"suffix":""},{"dropping-particle":"","family":"Drescher","given":"Christian","non-dropping-particle":"","parse-names":false,"suffix":""},{"dropping-particle":"","family":"Hanuschkin","given":"Alexander","non-dropping-particle":"","parse-names":false,"suffix":""},{"dropping-particle":"","family":"Winkler","given":"Ludwig","non-dropping-particle":"","parse-names":false,"suffix":""},{"dropping-particle":"","family":"Peters","given":"Steven","non-dropping-particle":"","parse-names":false,"suffix":""},{"dropping-particle":"","family":"Müller","given":"Klaus-Robert","non-dropping-particle":"","parse-names":false,"suffix":""}],"container-title":"Machine Learning and Knowledge Extraction","id":"ITEM-1","issue":"2","issued":{"date-parts":[["2021"]]},"page":"392-413","title":"Towards CRISP-ML(Q): A Machine Learning Process Model with Quality Assurance Methodology","type":"article","volume":"3"},"uris":["http://www.mendeley.com/documents/?uuid=e2707078-cc19-4d05-aed1-c53d730e1d9e"]}],"mendeley":{"formattedCitation":"(Studer et al., 2021)","plainTextFormattedCitation":"(Studer et al., 2021)","previouslyFormattedCitation":"(Studer et al., 2021)"},"properties":{"noteIndex":0},"schema":"https://github.com/citation-style-language/schema/raw/master/csl-citation.json"}</w:instrText>
+      </w:r>
+      <w:r>
+        <w:fldChar w:fldCharType="separate"/>
+      </w:r>
+      <w:r>
+        <w:rPr>
+          <w:noProof/>
+        </w:rPr>
+        <w:t>(Studer et al., 2021)</w:t>
+      </w:r>
+      <w:r>
+        <w:fldChar w:fldCharType="end"/>
+      </w:r>
+      <w:r>
+        <w:t>.</w:t>
+      </w:r>
+      <w:r>
+        <w:t xml:space="preserve"> </w:t>
+      </w:r>
+      <w:r>
+        <w:t>Siklus CRISP-DM</w:t>
+      </w:r>
+      <w:r>
+        <w:t xml:space="preserve"> terdiri atas: </w:t>
+      </w:r>
+      <w:r>
+        <w:lastRenderedPageBreak/>
+        <w:t>Pemahaman Bisnis, Pemahaman Data, Penyiapan Data, Pemodelan, Evaluasi, dan Pelaporan.</w:t>
+      </w:r>
+    </w:p>
+    <w:p/>
+    <w:p>
+      <w:pPr>
+        <w:pStyle w:val="Heading3"/>
+      </w:pPr>
+      <w:r>
+        <w:t>3.2.1</w:t>
+      </w:r>
+      <w:r>
+        <w:tab/>
+      </w:r>
+      <w:r>
+        <w:t>Pemahaman bisnis</w:t>
+      </w:r>
+    </w:p>
+    <w:p>
+      <w:r>
+        <w:t>Pemahaman bisnis merupakan tahapan perumusan tujuan, menerjemahkannya ke dalam masalah data, dan menetapkan strategi awal sebelum mulai mengumpulkan data. Penelitian ini menyelaraskan kebutuhan operasional (tipologi pola hujan tahunan Serang dan peringatan dini hujan ekstrem berbasis data harian) dengan ruang lingkup data dan keterbatasan stasiun tunggal. Penelitian ini kemudian menetapkan objek yang dianalisis yaitu curah hujan harian yang diturunkan menjadi curah hujan dasarian dengan representasi sidik-jari 36-dasarian (Januari-I s.d. Desember-III) untuk klastering pola curah hujan serta menurunkan fitur gulir (R1, R3, R5, R7, R10) untuk peringatan harian.</w:t>
+      </w:r>
+    </w:p>
+    <w:p>
+      <w:r>
+        <w:t>Kemudian, penelitian ini menyusun strategi pemilihan algoritma, skema validasi, dan kriteria evaluasi untuk memastikan tahapan penelitian dan kemudahan replikasi.</w:t>
+      </w:r>
+    </w:p>
+    <w:p/>
+    <w:p>
+      <w:pPr>
+        <w:pStyle w:val="Heading3"/>
+      </w:pPr>
+      <w:r>
+        <w:t>3.2.2</w:t>
+      </w:r>
+      <w:r>
+        <w:tab/>
+        <w:t>Pemahaman data</w:t>
+      </w:r>
+    </w:p>
+    <w:p>
+      <w:r>
+        <w:t>Merupakan tahapan yang dilakukan setelah data diperoleh. Penelitian ini menggunakan data curah hujan harian dari Stasiun Meteorologi Maritim Serang pada periode tahun 1975—2025. Pada tahapan ini, kami akan melakukan eksplorasi data untuk mengetahui deskripsi data dan kualitas data. Secara teknis, eksplorasi yang dilakukan mencakup visualisasi, analisis deskriptif, dan pengecekan anomali atau data ekstrem.</w:t>
+      </w:r>
+    </w:p>
+    <w:p/>
+    <w:p>
+      <w:pPr>
+        <w:pStyle w:val="Heading3"/>
+      </w:pPr>
+      <w:r>
+        <w:t>3.2.3</w:t>
+      </w:r>
+      <w:r>
+        <w:tab/>
+        <w:t>Penyiapan data</w:t>
+      </w:r>
+    </w:p>
+    <w:p>
+      <w:r>
+        <w:t xml:space="preserve">Tahap penyiapan data mencakup </w:t>
+      </w:r>
+      <w:r>
+        <w:t>tiga</w:t>
+      </w:r>
+      <w:r>
+        <w:t xml:space="preserve"> kegiatan utama. Pertama, konsistensi dan kendali mutu dilakukan melalui normalisasi satuan ke milimeter, penandaan nilai anomali fisik, serta penerapan kebijakan penanganan data hilang</w:t>
+      </w:r>
+      <w:r>
+        <w:t xml:space="preserve"> </w:t>
+      </w:r>
+      <w:r>
+        <w:t xml:space="preserve">tanpa melakukan imputasi pada hari-hari ekstrem. Kedua, rekayasa fitur untuk analisis </w:t>
+      </w:r>
+      <w:r>
+        <w:t>pola</w:t>
+      </w:r>
+      <w:r>
+        <w:t xml:space="preserve"> tahunan dilaksanakan dengan mengagregasikan curah hujan harian menjadi deret dasarian (36 slot per tahun), menerapkan transformasi log</w:t>
+      </w:r>
+      <w:r>
+        <w:t>aritmik</w:t>
+      </w:r>
+      <w:r>
+        <w:t xml:space="preserve"> untuk menstabilkan sebaran, dan melakukan standarisasi (</w:t>
+      </w:r>
+      <w:r>
+        <w:rPr>
+          <w:i/>
+          <w:iCs/>
+        </w:rPr>
+        <w:t>z-score</w:t>
+      </w:r>
+      <w:r>
+        <w:t xml:space="preserve">) per posisi dasarian agar perbedaan musim basah–kering tidak mendominasi. Ketiga, rekayasa fitur untuk skema </w:t>
+      </w:r>
+      <w:r>
+        <w:t>peringatan curah hujan</w:t>
+      </w:r>
+      <w:r>
+        <w:t xml:space="preserve"> harian </w:t>
+      </w:r>
+      <w:r>
+        <w:lastRenderedPageBreak/>
+        <w:t>dilakukan melalui perhitungan akumulasi bergulir R1, R3, R5, R7, dan R10 yang kemudian dinormalisasi terhadap klimatologi tanggal-dalam-tahun (musiman).</w:t>
+      </w:r>
+    </w:p>
+    <w:p/>
+    <w:p>
+      <w:pPr>
+        <w:pStyle w:val="Heading3"/>
+      </w:pPr>
+      <w:r>
+        <w:t>3.2.4</w:t>
+      </w:r>
+      <w:r>
+        <w:tab/>
+        <w:t>Pemodelan</w:t>
+      </w:r>
+    </w:p>
+    <w:p>
+      <w:r>
+        <w:t xml:space="preserve">Pada tahap ini, kami melakukan pemodelan data berdasar pembahasan pada Bab 2 dan dipadukan dengan </w:t>
+      </w:r>
+      <w:r>
+        <w:rPr>
+          <w:i/>
+          <w:iCs/>
+        </w:rPr>
+        <w:t>best practice</w:t>
+      </w:r>
+      <w:r>
+        <w:t xml:space="preserve"> yang bersumber dari kode sumber terbuka seperti Kaggle</w:t>
+      </w:r>
+      <w:r>
+        <w:rPr>
+          <w:rStyle w:val="FootnoteReference"/>
+        </w:rPr>
+        <w:footnoteReference w:id="1"/>
+      </w:r>
+      <w:r>
+        <w:t xml:space="preserve"> dan Github</w:t>
+      </w:r>
+      <w:r>
+        <w:rPr>
+          <w:rStyle w:val="FootnoteReference"/>
+        </w:rPr>
+        <w:footnoteReference w:id="2"/>
+      </w:r>
+      <w:r>
+        <w:t xml:space="preserve">. Rincian rencana pemodelan yang kami usulkan kami sajikan pada Tabel 3.2 berikut. Pemilihan parameter disesuaikan dengan </w:t>
+      </w:r>
+      <w:r>
+        <w:rPr>
+          <w:i/>
+          <w:iCs/>
+        </w:rPr>
+        <w:t>best practice</w:t>
+      </w:r>
+      <w:r>
+        <w:t xml:space="preserve"> dan kemampuan infrastruktur komputasi yang digunakan.</w:t>
+      </w:r>
+    </w:p>
+    <w:p/>
+    <w:p>
+      <w:pPr>
+        <w:pStyle w:val="Caption"/>
+        <w:keepNext/>
+      </w:pPr>
+      <w:r>
+        <w:t>Tabel 3.</w:t>
+      </w:r>
+      <w:fldSimple w:instr=" SEQ Tabel_3. \* ARABIC ">
+        <w:r>
+          <w:rPr>
+            <w:noProof/>
+          </w:rPr>
+          <w:t>2</w:t>
+        </w:r>
+      </w:fldSimple>
+      <w:r>
+        <w:rPr>
+          <w:lang w:val="en-US"/>
+        </w:rPr>
+        <w:t xml:space="preserve"> </w:t>
+      </w:r>
+      <w:r>
+        <w:t>Rencana pemodelan</w:t>
+      </w:r>
+    </w:p>
+    <w:tbl>
+      <w:tblPr>
+        <w:tblStyle w:val="TableGrid"/>
+        <w:tblW w:w="0" w:type="auto"/>
+        <w:tblLook w:val="04A0" w:firstRow="1" w:lastRow="0" w:firstColumn="1" w:lastColumn="0" w:noHBand="0" w:noVBand="1"/>
+      </w:tblPr>
+      <w:tblGrid>
+        <w:gridCol w:w="2547"/>
+        <w:gridCol w:w="5947"/>
+      </w:tblGrid>
+      <w:tr>
+        <w:tc>
+          <w:tcPr>
+            <w:tcW w:w="2547" w:type="dxa"/>
+          </w:tcPr>
+          <w:p>
+            <w:r>
+              <w:t>Algoritma</w:t>
+            </w:r>
+          </w:p>
+        </w:tc>
+        <w:tc>
+          <w:tcPr>
+            <w:tcW w:w="5947" w:type="dxa"/>
+          </w:tcPr>
+          <w:p>
+            <w:r>
+              <w:t>Parameter</w:t>
+            </w:r>
+          </w:p>
+        </w:tc>
+      </w:tr>
+      <w:tr>
+        <w:tc>
+          <w:tcPr>
+            <w:tcW w:w="2547" w:type="dxa"/>
+          </w:tcPr>
+          <w:p>
+            <w:r>
+              <w:t>K-Means</w:t>
+            </w:r>
+          </w:p>
+        </w:tc>
+        <w:tc>
+          <w:tcPr>
+            <w:tcW w:w="5947" w:type="dxa"/>
+          </w:tcPr>
+          <w:p>
+            <m:oMath>
+              <m:r>
+                <w:rPr>
+                  <w:rFonts w:ascii="Cambria Math" w:hAnsi="Cambria Math"/>
+                </w:rPr>
+                <m:t>k∈{3,4,5,6}</m:t>
+              </m:r>
+            </m:oMath>
+            <w:r>
+              <w:t xml:space="preserve"> ditentukan oleh Silhouette Score dan analisis Elbow</w:t>
+            </w:r>
+          </w:p>
+        </w:tc>
+      </w:tr>
+      <w:tr>
+        <w:tc>
+          <w:tcPr>
+            <w:tcW w:w="2547" w:type="dxa"/>
+          </w:tcPr>
+          <w:p>
+            <w:r>
+              <w:t>Agglomerative-Ward</w:t>
+            </w:r>
+          </w:p>
+        </w:tc>
+        <w:tc>
+          <w:tcPr>
+            <w:tcW w:w="5947" w:type="dxa"/>
+          </w:tcPr>
+          <w:p>
+            <m:oMath>
+              <m:r>
+                <w:rPr>
+                  <w:rFonts w:ascii="Cambria Math" w:hAnsi="Cambria Math"/>
+                </w:rPr>
+                <m:t>k∈{3,4,5,6}</m:t>
+              </m:r>
+            </m:oMath>
+            <w:r>
+              <w:t xml:space="preserve"> ditentukan oleh Silhouette Score dan analisis Elbow</w:t>
+            </w:r>
+          </w:p>
+        </w:tc>
+      </w:tr>
+      <w:tr>
+        <w:tc>
+          <w:tcPr>
+            <w:tcW w:w="2547" w:type="dxa"/>
+          </w:tcPr>
+          <w:p>
+            <w:r>
+              <w:t>DBSCAN</w:t>
+            </w:r>
+          </w:p>
+        </w:tc>
+        <w:tc>
+          <w:tcPr>
+            <w:tcW w:w="5947" w:type="dxa"/>
+          </w:tcPr>
+          <w:p>
+            <w:pPr>
+              <w:rPr>
+                <w:lang w:val="en-US"/>
+              </w:rPr>
+            </w:pPr>
+            <w:r>
+              <w:t xml:space="preserve">DBSCAN: eps diturunkan dari distribusi jarak tetangga-terdekat; min_samples </w:t>
+            </w:r>
+            <m:oMath>
+              <m:r>
+                <w:rPr>
+                  <w:rFonts w:ascii="Cambria Math" w:hAnsi="Cambria Math"/>
+                </w:rPr>
+                <m:t>∈{3,4,5,6}</m:t>
+              </m:r>
+            </m:oMath>
+          </w:p>
+        </w:tc>
+      </w:tr>
+      <w:tr>
+        <w:tc>
+          <w:tcPr>
+            <w:tcW w:w="2547" w:type="dxa"/>
+          </w:tcPr>
+          <w:p>
+            <w:r>
+              <w:t>SOM</w:t>
+            </w:r>
+          </w:p>
+        </w:tc>
+        <w:tc>
+          <w:tcPr>
+            <w:tcW w:w="5947" w:type="dxa"/>
+          </w:tcPr>
+          <w:p>
+            <w:r>
+              <w:t xml:space="preserve">kisi kecil </w:t>
+            </w:r>
+            <m:oMath>
+              <m:r>
+                <w:rPr>
+                  <w:rFonts w:ascii="Cambria Math" w:hAnsi="Cambria Math"/>
+                </w:rPr>
+                <m:t>m×n</m:t>
+              </m:r>
+            </m:oMath>
+            <w:r>
+              <w:t xml:space="preserve"> </w:t>
+            </w:r>
+            <w:r>
+              <w:t xml:space="preserve">(2×2, 2×3, 3×3); </w:t>
+            </w:r>
+            <w:r>
+              <w:rPr>
+                <w:i/>
+                <w:iCs/>
+              </w:rPr>
+              <w:t>sigma</w:t>
+            </w:r>
+            <w:r>
+              <w:t xml:space="preserve"> dan </w:t>
+            </w:r>
+            <w:r>
+              <w:rPr>
+                <w:i/>
+                <w:iCs/>
+              </w:rPr>
+              <w:t>learning rate</w:t>
+            </w:r>
+            <w:r>
+              <w:t xml:space="preserve"> di</w:t>
+            </w:r>
+            <w:r>
+              <w:t>tetapkan</w:t>
+            </w:r>
+            <w:r>
+              <w:t xml:space="preserve"> dan/atau disetel ringan.</w:t>
+            </w:r>
+          </w:p>
+        </w:tc>
+      </w:tr>
+    </w:tbl>
+    <w:p/>
+    <w:p>
+      <w:pPr>
+        <w:pStyle w:val="Heading3"/>
+      </w:pPr>
+      <w:r>
+        <w:t>3.2.5</w:t>
+      </w:r>
+      <w:r>
+        <w:tab/>
+        <w:t>Evaluasi</w:t>
+      </w:r>
+    </w:p>
+    <w:p>
+      <w:r>
+        <w:t>Evaluasi klaster yang dibentuk dilakukan melalui tiga tahap sebagai berikut.</w:t>
+      </w:r>
+    </w:p>
+    <w:p>
+      <w:pPr>
+        <w:pStyle w:val="ListParagraph"/>
+        <w:numPr>
+          <w:ilvl w:val="0"/>
+          <w:numId w:val="6"/>
+        </w:numPr>
+      </w:pPr>
+      <w:r>
+        <w:t>Metrik internal: Silhouette Score, Davies-Bouldin Index, Calinski-Harabasz Index.</w:t>
+      </w:r>
+    </w:p>
+    <w:p>
+      <w:pPr>
+        <w:pStyle w:val="ListParagraph"/>
+        <w:numPr>
+          <w:ilvl w:val="0"/>
+          <w:numId w:val="6"/>
+        </w:numPr>
+      </w:pPr>
+      <w:r>
+        <w:t>Stabilitas model.</w:t>
+      </w:r>
+    </w:p>
+    <w:p>
+      <w:pPr>
+        <w:pStyle w:val="ListParagraph"/>
+        <w:numPr>
+          <w:ilvl w:val="0"/>
+          <w:numId w:val="6"/>
+        </w:numPr>
+      </w:pPr>
+      <w:r>
+        <w:t>Interpretabilitas fisik: konsistensi puncak/lembah musiman antar pola.</w:t>
+      </w:r>
+    </w:p>
+    <w:p/>
+    <w:p/>
+    <w:p/>
+    <w:p>
+      <w:pPr>
+        <w:pStyle w:val="Heading3"/>
+      </w:pPr>
+      <w:r>
+        <w:lastRenderedPageBreak/>
+        <w:t>3.2.6</w:t>
+      </w:r>
+      <w:r>
+        <w:tab/>
+        <w:t>Pelaporan</w:t>
+      </w:r>
+    </w:p>
+    <w:p>
+      <w:r>
+        <w:t>Pada tahap ini seluruh eksperimen telah dijalankan dan hasilnya dirangkum untuk menyusun kesimpulan serta dokumentasi karya akhir</w:t>
+      </w:r>
+      <w:r>
+        <w:t>.</w:t>
+      </w:r>
+    </w:p>
+    <w:p/>
+    <w:p>
+      <w:pPr>
+        <w:spacing w:after="160" w:line="259" w:lineRule="auto"/>
+        <w:jc w:val="left"/>
+      </w:pPr>
+      <w:r>
+        <w:br w:type="page"/>
+      </w:r>
+    </w:p>
+    <w:p>
+      <w:pPr>
+        <w:pStyle w:val="Heading1"/>
+      </w:pPr>
+      <w:r>
+        <w:lastRenderedPageBreak/>
+        <w:t>DAFTAR PUSTAKA</w:t>
+      </w:r>
+    </w:p>
+    <w:p/>
+    <w:p>
+      <w:pPr>
+        <w:widowControl w:val="0"/>
+        <w:autoSpaceDE w:val="0"/>
+        <w:autoSpaceDN w:val="0"/>
+        <w:adjustRightInd w:val="0"/>
+        <w:ind w:left="480" w:hanging="480"/>
+        <w:rPr>
+          <w:noProof/>
+        </w:rPr>
+      </w:pPr>
+      <w:r>
+        <w:fldChar w:fldCharType="begin" w:fldLock="1"/>
+      </w:r>
+      <w:r>
+        <w:instrText xml:space="preserve">ADDIN Mendeley Bibliography CSL_BIBLIOGRAPHY </w:instrText>
+      </w:r>
+      <w:r>
+        <w:fldChar w:fldCharType="separate"/>
+      </w:r>
+      <w:r>
+        <w:rPr>
+          <w:noProof/>
+        </w:rPr>
+        <w:t xml:space="preserve">Alam, M. S., &amp; Paul, S. (2020). A comparative analysis of clustering algorithms to identify the homogeneous  rainfall gauge stations of Bangladesh. </w:t>
+      </w:r>
+      <w:r>
+        <w:rPr>
+          <w:i/>
+          <w:iCs/>
+          <w:noProof/>
+        </w:rPr>
+        <w:t>Journal of Applied Statistics</w:t>
+      </w:r>
+      <w:r>
+        <w:rPr>
+          <w:noProof/>
+        </w:rPr>
+        <w:t xml:space="preserve">, </w:t>
+      </w:r>
+      <w:r>
+        <w:rPr>
+          <w:i/>
+          <w:iCs/>
+          <w:noProof/>
+        </w:rPr>
+        <w:t>47</w:t>
+      </w:r>
+      <w:r>
+        <w:rPr>
+          <w:noProof/>
+        </w:rPr>
+        <w:t>(8), 1460–1481. https://doi.org/10.1080/02664763.2019.1675606</w:t>
+      </w:r>
+    </w:p>
+    <w:p>
+      <w:pPr>
+        <w:widowControl w:val="0"/>
+        <w:autoSpaceDE w:val="0"/>
+        <w:autoSpaceDN w:val="0"/>
+        <w:adjustRightInd w:val="0"/>
+        <w:ind w:left="480" w:hanging="480"/>
+        <w:rPr>
+          <w:noProof/>
+        </w:rPr>
+      </w:pPr>
+      <w:r>
+        <w:rPr>
+          <w:noProof/>
+        </w:rPr>
+        <w:t xml:space="preserve">Aldrian, E., &amp; Susanto, R. D. (2003). Identification of Three Dominant Rainfall Regions within Indonesia and Their Relationship to Sea Surface Temperature. </w:t>
+      </w:r>
+      <w:r>
+        <w:rPr>
+          <w:i/>
+          <w:iCs/>
+          <w:noProof/>
+        </w:rPr>
+        <w:t>International Journal of Climatology</w:t>
+      </w:r>
+      <w:r>
+        <w:rPr>
+          <w:noProof/>
+        </w:rPr>
+        <w:t xml:space="preserve">, </w:t>
+      </w:r>
+      <w:r>
+        <w:rPr>
+          <w:i/>
+          <w:iCs/>
+          <w:noProof/>
+        </w:rPr>
+        <w:t>23</w:t>
+      </w:r>
+      <w:r>
+        <w:rPr>
+          <w:noProof/>
+        </w:rPr>
+        <w:t>, 1435–1452. https://doi.org/10.1002/joc.950</w:t>
+      </w:r>
+    </w:p>
+    <w:p>
+      <w:pPr>
+        <w:widowControl w:val="0"/>
+        <w:autoSpaceDE w:val="0"/>
+        <w:autoSpaceDN w:val="0"/>
+        <w:adjustRightInd w:val="0"/>
+        <w:ind w:left="480" w:hanging="480"/>
+        <w:rPr>
+          <w:noProof/>
+        </w:rPr>
+      </w:pPr>
+      <w:r>
+        <w:rPr>
+          <w:noProof/>
+        </w:rPr>
+        <w:t xml:space="preserve">BMKG. (2016a). </w:t>
+      </w:r>
+      <w:r>
+        <w:rPr>
+          <w:i/>
+          <w:iCs/>
+          <w:noProof/>
+        </w:rPr>
+        <w:t>Peraturan Kepala Badan Meteorologi, Klimatologi, dan Geofisika Nomor 3 Tahun 2016 tentang Organisasi dan Tata Kerja Badan Meteorologi, Klimatologi, dan Geofisika.</w:t>
+      </w:r>
+    </w:p>
+    <w:p>
+      <w:pPr>
+        <w:widowControl w:val="0"/>
+        <w:autoSpaceDE w:val="0"/>
+        <w:autoSpaceDN w:val="0"/>
+        <w:adjustRightInd w:val="0"/>
+        <w:ind w:left="480" w:hanging="480"/>
+        <w:rPr>
+          <w:noProof/>
+        </w:rPr>
+      </w:pPr>
+      <w:r>
+        <w:rPr>
+          <w:noProof/>
+        </w:rPr>
+        <w:t xml:space="preserve">BMKG. (2016b). </w:t>
+      </w:r>
+      <w:r>
+        <w:rPr>
+          <w:i/>
+          <w:iCs/>
+          <w:noProof/>
+        </w:rPr>
+        <w:t>Peraturan Kepala BMKG Nomor 4 Tahun 2016 Tentang Pengamatan dan Pengelolaan Data Iklim di Lingkungan BMKG</w:t>
+      </w:r>
+      <w:r>
+        <w:rPr>
+          <w:noProof/>
+        </w:rPr>
+        <w:t>. BMKG.</w:t>
+      </w:r>
+    </w:p>
+    <w:p>
+      <w:pPr>
+        <w:widowControl w:val="0"/>
+        <w:autoSpaceDE w:val="0"/>
+        <w:autoSpaceDN w:val="0"/>
+        <w:adjustRightInd w:val="0"/>
+        <w:ind w:left="480" w:hanging="480"/>
+        <w:rPr>
+          <w:noProof/>
+        </w:rPr>
+      </w:pPr>
+      <w:r>
+        <w:rPr>
+          <w:noProof/>
+        </w:rPr>
+        <w:t xml:space="preserve">BMKG. (2020). </w:t>
+      </w:r>
+      <w:r>
+        <w:rPr>
+          <w:i/>
+          <w:iCs/>
+          <w:noProof/>
+        </w:rPr>
+        <w:t>Peraturan Badan Meteorologi, Klimatologi, dan Geofisika Republik Indonesia Nomor 4 Tahun 2020 Tentang Rencana Strategis Badan Meteorologi, Klimatologi, dan Geofisika Tahun 2020—2024</w:t>
+      </w:r>
+      <w:r>
+        <w:rPr>
+          <w:noProof/>
+        </w:rPr>
+        <w:t>.</w:t>
+      </w:r>
+    </w:p>
+    <w:p>
+      <w:pPr>
+        <w:widowControl w:val="0"/>
+        <w:autoSpaceDE w:val="0"/>
+        <w:autoSpaceDN w:val="0"/>
+        <w:adjustRightInd w:val="0"/>
+        <w:ind w:left="480" w:hanging="480"/>
+        <w:rPr>
+          <w:noProof/>
+        </w:rPr>
+      </w:pPr>
+      <w:r>
+        <w:rPr>
+          <w:noProof/>
+        </w:rPr>
+        <w:t xml:space="preserve">BMKG. (2022). </w:t>
+      </w:r>
+      <w:r>
+        <w:rPr>
+          <w:i/>
+          <w:iCs/>
+          <w:noProof/>
+        </w:rPr>
+        <w:t>Pemutakhiran Zona Musim Indonesia Periode 1991 -- 2020</w:t>
+      </w:r>
+      <w:r>
+        <w:rPr>
+          <w:noProof/>
+        </w:rPr>
+        <w:t>. BMKG.</w:t>
+      </w:r>
+    </w:p>
+    <w:p>
+      <w:pPr>
+        <w:widowControl w:val="0"/>
+        <w:autoSpaceDE w:val="0"/>
+        <w:autoSpaceDN w:val="0"/>
+        <w:adjustRightInd w:val="0"/>
+        <w:ind w:left="480" w:hanging="480"/>
+        <w:rPr>
+          <w:noProof/>
+        </w:rPr>
+      </w:pPr>
+      <w:r>
+        <w:rPr>
+          <w:noProof/>
+        </w:rPr>
+        <w:t xml:space="preserve">Chen, H., &amp; Li, Y. (2024). </w:t>
+      </w:r>
+      <w:r>
+        <w:rPr>
+          <w:i/>
+          <w:iCs/>
+          <w:noProof/>
+        </w:rPr>
+        <w:t>Urban spatial sustainability landscape planning and design: A study on solving flood disasters in low-lying urban areas based on simulated natural drainage system.</w:t>
+      </w:r>
+      <w:r>
+        <w:rPr>
+          <w:noProof/>
+        </w:rPr>
+        <w:t xml:space="preserve"> https://doi.org/https://doi.org/10.69610/j.eit.20240528</w:t>
+      </w:r>
+    </w:p>
+    <w:p>
+      <w:pPr>
+        <w:widowControl w:val="0"/>
+        <w:autoSpaceDE w:val="0"/>
+        <w:autoSpaceDN w:val="0"/>
+        <w:adjustRightInd w:val="0"/>
+        <w:ind w:left="480" w:hanging="480"/>
+        <w:rPr>
+          <w:noProof/>
+        </w:rPr>
+      </w:pPr>
+      <w:r>
+        <w:rPr>
+          <w:noProof/>
+        </w:rPr>
+        <w:t xml:space="preserve">Crane, R. G., &amp; Hewitson, B. C. (2003). Clustering and upscaling of station precipitation records to regional patterns using self-organizing maps (SOMs). </w:t>
+      </w:r>
+      <w:r>
+        <w:rPr>
+          <w:i/>
+          <w:iCs/>
+          <w:noProof/>
+        </w:rPr>
+        <w:t>Climate Research</w:t>
+      </w:r>
+      <w:r>
+        <w:rPr>
+          <w:noProof/>
+        </w:rPr>
+        <w:t xml:space="preserve">, </w:t>
+      </w:r>
+      <w:r>
+        <w:rPr>
+          <w:i/>
+          <w:iCs/>
+          <w:noProof/>
+        </w:rPr>
+        <w:t>25</w:t>
+      </w:r>
+      <w:r>
+        <w:rPr>
+          <w:noProof/>
+        </w:rPr>
+        <w:t>, 95–107. https://www.int-res.com/abstracts/cr/v25/cr025095</w:t>
+      </w:r>
+    </w:p>
+    <w:p>
+      <w:pPr>
+        <w:widowControl w:val="0"/>
+        <w:autoSpaceDE w:val="0"/>
+        <w:autoSpaceDN w:val="0"/>
+        <w:adjustRightInd w:val="0"/>
+        <w:ind w:left="480" w:hanging="480"/>
+        <w:rPr>
+          <w:noProof/>
+        </w:rPr>
+      </w:pPr>
+      <w:r>
+        <w:rPr>
+          <w:noProof/>
+        </w:rPr>
+        <w:t xml:space="preserve">Dechpichai, P., Jinapang, N., Yamphli, P., Polamnuay, S., Injan, S., &amp; Humphries, U. (2022). Multivariable Panel Data Cluster Analysis of Meteorological Stations in Thailand for ENSO Phenomenon. In </w:t>
+      </w:r>
+      <w:r>
+        <w:rPr>
+          <w:i/>
+          <w:iCs/>
+          <w:noProof/>
+        </w:rPr>
+        <w:t>Mathematical and Computational Applications</w:t>
+      </w:r>
+      <w:r>
+        <w:rPr>
+          <w:noProof/>
+        </w:rPr>
+        <w:t xml:space="preserve"> (Vol. 27, Issue 3). https://doi.org/10.3390/mca27030037</w:t>
+      </w:r>
+    </w:p>
+    <w:p>
+      <w:pPr>
+        <w:widowControl w:val="0"/>
+        <w:autoSpaceDE w:val="0"/>
+        <w:autoSpaceDN w:val="0"/>
+        <w:adjustRightInd w:val="0"/>
+        <w:ind w:left="480" w:hanging="480"/>
+        <w:rPr>
+          <w:noProof/>
+        </w:rPr>
+      </w:pPr>
+      <w:r>
+        <w:rPr>
+          <w:noProof/>
+        </w:rPr>
+        <w:t xml:space="preserve">Doan, Q.-V., Amagasa, T., Pham, T.-H., Sato, T., Chen, F., &amp; Kusaka, H. (2023). Structural $k$-means (S $k$-means) and clustering uncertainty evaluation framework (CUEF) for mining climate data. </w:t>
+      </w:r>
+      <w:r>
+        <w:rPr>
+          <w:i/>
+          <w:iCs/>
+          <w:noProof/>
+        </w:rPr>
+        <w:t>Geoscientific Model Development</w:t>
+      </w:r>
+      <w:r>
+        <w:rPr>
+          <w:noProof/>
+        </w:rPr>
+        <w:t xml:space="preserve">, </w:t>
+      </w:r>
+      <w:r>
+        <w:rPr>
+          <w:i/>
+          <w:iCs/>
+          <w:noProof/>
+        </w:rPr>
+        <w:t>16</w:t>
+      </w:r>
+      <w:r>
+        <w:rPr>
+          <w:noProof/>
+        </w:rPr>
+        <w:t>(8), 2215–2233. https://doi.org/10.5194/gmd-16-2215-2023</w:t>
+      </w:r>
+    </w:p>
+    <w:p>
+      <w:pPr>
+        <w:widowControl w:val="0"/>
+        <w:autoSpaceDE w:val="0"/>
+        <w:autoSpaceDN w:val="0"/>
+        <w:adjustRightInd w:val="0"/>
+        <w:ind w:left="480" w:hanging="480"/>
+        <w:rPr>
+          <w:noProof/>
+        </w:rPr>
+      </w:pPr>
+      <w:r>
+        <w:rPr>
+          <w:noProof/>
+        </w:rPr>
+        <w:t xml:space="preserve">Gazder, U. (2024). Studying Patterns of Rainfall and Topographical Clustering for </w:t>
+      </w:r>
+      <w:r>
+        <w:rPr>
+          <w:noProof/>
+        </w:rPr>
+        <w:lastRenderedPageBreak/>
+        <w:t xml:space="preserve">Kingdom of Bahrain: An Application of Big Data. </w:t>
+      </w:r>
+      <w:r>
+        <w:rPr>
+          <w:i/>
+          <w:iCs/>
+          <w:noProof/>
+        </w:rPr>
+        <w:t>Engineering World</w:t>
+      </w:r>
+      <w:r>
+        <w:rPr>
+          <w:noProof/>
+        </w:rPr>
+        <w:t xml:space="preserve">, </w:t>
+      </w:r>
+      <w:r>
+        <w:rPr>
+          <w:i/>
+          <w:iCs/>
+          <w:noProof/>
+        </w:rPr>
+        <w:t>6</w:t>
+      </w:r>
+      <w:r>
+        <w:rPr>
+          <w:noProof/>
+        </w:rPr>
+        <w:t>. https://doi.org/10.37394/232025.2024.6.5</w:t>
+      </w:r>
+    </w:p>
+    <w:p>
+      <w:pPr>
+        <w:widowControl w:val="0"/>
+        <w:autoSpaceDE w:val="0"/>
+        <w:autoSpaceDN w:val="0"/>
+        <w:adjustRightInd w:val="0"/>
+        <w:ind w:left="480" w:hanging="480"/>
+        <w:rPr>
+          <w:noProof/>
+        </w:rPr>
+      </w:pPr>
+      <w:r>
+        <w:rPr>
+          <w:noProof/>
+        </w:rPr>
+        <w:t xml:space="preserve">Hasan, Y. (2024). Pengukuran Silhouette Score dan Davies-Bouldin Index pada Hasil Cluster K-Means dan DBSCAN. </w:t>
+      </w:r>
+      <w:r>
+        <w:rPr>
+          <w:i/>
+          <w:iCs/>
+          <w:noProof/>
+        </w:rPr>
+        <w:t>KAKIFIKOM (Kumpulan Artikel Karya Ilmiah Fakultas Ilmu Komputer)</w:t>
+      </w:r>
+      <w:r>
+        <w:rPr>
+          <w:noProof/>
+        </w:rPr>
+        <w:t xml:space="preserve">, </w:t>
+      </w:r>
+      <w:r>
+        <w:rPr>
+          <w:i/>
+          <w:iCs/>
+          <w:noProof/>
+        </w:rPr>
+        <w:t>6</w:t>
+      </w:r>
+      <w:r>
+        <w:rPr>
+          <w:noProof/>
+        </w:rPr>
+        <w:t>(1 SE-), 60–74. https://ejournal.ust.ac.id/index.php/KAKIFIKOM/article/view/3938</w:t>
+      </w:r>
+    </w:p>
+    <w:p>
+      <w:pPr>
+        <w:widowControl w:val="0"/>
+        <w:autoSpaceDE w:val="0"/>
+        <w:autoSpaceDN w:val="0"/>
+        <w:adjustRightInd w:val="0"/>
+        <w:ind w:left="480" w:hanging="480"/>
+        <w:rPr>
+          <w:noProof/>
+        </w:rPr>
+      </w:pPr>
+      <w:r>
+        <w:rPr>
+          <w:noProof/>
+        </w:rPr>
+        <w:t xml:space="preserve">Hermawan, E., Risyanto, R., Purwaningsih, A., Ratri, D. N., Ridho, A., Harjana, T., Andarini, D. F., Satyawardhana, H., &amp; Sujalu, A. P. (2025). Characteristics of Mesoscale Convective Systems and Their Impact on Heavy Rainfall in Indonesia’s New Capital City, Nusantara, in March 2022. </w:t>
+      </w:r>
+      <w:r>
+        <w:rPr>
+          <w:i/>
+          <w:iCs/>
+          <w:noProof/>
+        </w:rPr>
+        <w:t>Advances in Atmospheric Sciences</w:t>
+      </w:r>
+      <w:r>
+        <w:rPr>
+          <w:noProof/>
+        </w:rPr>
+        <w:t xml:space="preserve">, </w:t>
+      </w:r>
+      <w:r>
+        <w:rPr>
+          <w:i/>
+          <w:iCs/>
+          <w:noProof/>
+        </w:rPr>
+        <w:t>42</w:t>
+      </w:r>
+      <w:r>
+        <w:rPr>
+          <w:noProof/>
+        </w:rPr>
+        <w:t>(2), 342–356. https://doi.org/10.1007/s00376-024-4102-1</w:t>
+      </w:r>
+    </w:p>
+    <w:p>
+      <w:pPr>
+        <w:widowControl w:val="0"/>
+        <w:autoSpaceDE w:val="0"/>
+        <w:autoSpaceDN w:val="0"/>
+        <w:adjustRightInd w:val="0"/>
+        <w:ind w:left="480" w:hanging="480"/>
+        <w:rPr>
+          <w:noProof/>
+        </w:rPr>
+      </w:pPr>
+      <w:r>
+        <w:rPr>
+          <w:noProof/>
+        </w:rPr>
+        <w:t xml:space="preserve">J, E. (2025). </w:t>
+      </w:r>
+      <w:r>
+        <w:rPr>
+          <w:i/>
+          <w:iCs/>
+          <w:noProof/>
+        </w:rPr>
+        <w:t>K-Means Clustering: 7 Pros and Cons Uncovered</w:t>
+      </w:r>
+      <w:r>
+        <w:rPr>
+          <w:noProof/>
+        </w:rPr>
+        <w:t>. https://datarundown.com/k-means-clustering-pros-cons/</w:t>
+      </w:r>
+    </w:p>
+    <w:p>
+      <w:pPr>
+        <w:widowControl w:val="0"/>
+        <w:autoSpaceDE w:val="0"/>
+        <w:autoSpaceDN w:val="0"/>
+        <w:adjustRightInd w:val="0"/>
+        <w:ind w:left="480" w:hanging="480"/>
+        <w:rPr>
+          <w:noProof/>
+        </w:rPr>
+      </w:pPr>
+      <w:r>
+        <w:rPr>
+          <w:noProof/>
+        </w:rPr>
+        <w:t xml:space="preserve">Jain, A., Rathi, K., Ganguly, Y., Kumar, A., &amp; Bhale, Y. (2025). </w:t>
+      </w:r>
+      <w:r>
+        <w:rPr>
+          <w:i/>
+          <w:iCs/>
+          <w:noProof/>
+        </w:rPr>
+        <w:t>A Comparative Analysis of DBSCAN, K-Means and Agglomerative Clustering Algorithms for Geospatial Data BT  - Proceedings of the International Conference on Recent Advancements and Modernisations in Sustainable Intelligent Technologies and Applications (RAM</w:t>
+      </w:r>
+      <w:r>
+        <w:rPr>
+          <w:noProof/>
+        </w:rPr>
+        <w:t>. 212–221. https://doi.org/10.2991/978-94-6463-716-8_18</w:t>
+      </w:r>
+    </w:p>
+    <w:p>
+      <w:pPr>
+        <w:widowControl w:val="0"/>
+        <w:autoSpaceDE w:val="0"/>
+        <w:autoSpaceDN w:val="0"/>
+        <w:adjustRightInd w:val="0"/>
+        <w:ind w:left="480" w:hanging="480"/>
+        <w:rPr>
+          <w:noProof/>
+        </w:rPr>
+      </w:pPr>
+      <w:r>
+        <w:rPr>
+          <w:noProof/>
+        </w:rPr>
+        <w:t xml:space="preserve">Jain, P., Bajpai, M. S., &amp; Pamula, R. (2022). A Modified DBSCAN Algorithm for Anomaly Detection in Time-series Data with Seasonality. </w:t>
+      </w:r>
+      <w:r>
+        <w:rPr>
+          <w:i/>
+          <w:iCs/>
+          <w:noProof/>
+        </w:rPr>
+        <w:t>The International Arab Journal of Information Technology</w:t>
+      </w:r>
+      <w:r>
+        <w:rPr>
+          <w:noProof/>
+        </w:rPr>
+        <w:t xml:space="preserve">, </w:t>
+      </w:r>
+      <w:r>
+        <w:rPr>
+          <w:i/>
+          <w:iCs/>
+          <w:noProof/>
+        </w:rPr>
+        <w:t>19</w:t>
+      </w:r>
+      <w:r>
+        <w:rPr>
+          <w:noProof/>
+        </w:rPr>
+        <w:t>(1). https://doi.org/10.34028/iajit/19/1/3</w:t>
+      </w:r>
+    </w:p>
+    <w:p>
+      <w:pPr>
+        <w:widowControl w:val="0"/>
+        <w:autoSpaceDE w:val="0"/>
+        <w:autoSpaceDN w:val="0"/>
+        <w:adjustRightInd w:val="0"/>
+        <w:ind w:left="480" w:hanging="480"/>
+        <w:rPr>
+          <w:noProof/>
+        </w:rPr>
+      </w:pPr>
+      <w:r>
+        <w:rPr>
+          <w:noProof/>
+        </w:rPr>
+        <w:t xml:space="preserve">Kang, H. M., &amp; Yusof, F. (2012). Application of Self-Organizing Map (SOM) in Missing Daily Rainfall Data in Malaysia. </w:t>
+      </w:r>
+      <w:r>
+        <w:rPr>
+          <w:i/>
+          <w:iCs/>
+          <w:noProof/>
+        </w:rPr>
+        <w:t>International Journal of Computer Applications</w:t>
+      </w:r>
+      <w:r>
+        <w:rPr>
+          <w:noProof/>
+        </w:rPr>
+        <w:t xml:space="preserve">, </w:t>
+      </w:r>
+      <w:r>
+        <w:rPr>
+          <w:i/>
+          <w:iCs/>
+          <w:noProof/>
+        </w:rPr>
+        <w:t>48</w:t>
+      </w:r>
+      <w:r>
+        <w:rPr>
+          <w:noProof/>
+        </w:rPr>
+        <w:t>(5). https://doi.org/https://doi.org/10.5120/7345-0160</w:t>
+      </w:r>
+    </w:p>
+    <w:p>
+      <w:pPr>
+        <w:widowControl w:val="0"/>
+        <w:autoSpaceDE w:val="0"/>
+        <w:autoSpaceDN w:val="0"/>
+        <w:adjustRightInd w:val="0"/>
+        <w:ind w:left="480" w:hanging="480"/>
+        <w:rPr>
+          <w:noProof/>
+        </w:rPr>
+      </w:pPr>
+      <w:r>
+        <w:rPr>
+          <w:noProof/>
+        </w:rPr>
+        <w:t xml:space="preserve">Khan, M. M. R., Siddique, M. A. B., Arif, R. B., &amp; Oishe, M. R. (2018). ADBSCAN: Adaptive Density-Based Spatial Clustering of Applications with Noise for Identifying Clusters with Varying Densities. </w:t>
+      </w:r>
+      <w:r>
+        <w:rPr>
+          <w:i/>
+          <w:iCs/>
+          <w:noProof/>
+        </w:rPr>
+        <w:t>2018 4th International Conference on Electrical Engineering and Information &amp; Communication Technology (ICEEiCT)</w:t>
+      </w:r>
+      <w:r>
+        <w:rPr>
+          <w:noProof/>
+        </w:rPr>
+        <w:t>, 107–111. https://doi.org/10.1109/CEEICT.2018.8628138</w:t>
+      </w:r>
+    </w:p>
+    <w:p>
+      <w:pPr>
+        <w:widowControl w:val="0"/>
+        <w:autoSpaceDE w:val="0"/>
+        <w:autoSpaceDN w:val="0"/>
+        <w:adjustRightInd w:val="0"/>
+        <w:ind w:left="480" w:hanging="480"/>
+        <w:rPr>
+          <w:noProof/>
+        </w:rPr>
+      </w:pPr>
+      <w:r>
+        <w:rPr>
+          <w:noProof/>
+        </w:rPr>
+        <w:t xml:space="preserve">Kretzschmar, C. (2022). </w:t>
+      </w:r>
+      <w:r>
+        <w:rPr>
+          <w:i/>
+          <w:iCs/>
+          <w:noProof/>
+        </w:rPr>
+        <w:t>Assessing the significance of Water resource management in improving the socio-economic and environmental status of a fast-growing urban community: A case study from Southern India</w:t>
+      </w:r>
+      <w:r>
+        <w:rPr>
+          <w:noProof/>
+        </w:rPr>
+        <w:t xml:space="preserve">. </w:t>
+      </w:r>
+      <w:r>
+        <w:rPr>
+          <w:noProof/>
+        </w:rPr>
+        <w:lastRenderedPageBreak/>
+        <w:t>https://doi.org/https://doi.org/10.5194/iahs2022-696</w:t>
+      </w:r>
+    </w:p>
+    <w:p>
+      <w:pPr>
+        <w:widowControl w:val="0"/>
+        <w:autoSpaceDE w:val="0"/>
+        <w:autoSpaceDN w:val="0"/>
+        <w:adjustRightInd w:val="0"/>
+        <w:ind w:left="480" w:hanging="480"/>
+        <w:rPr>
+          <w:noProof/>
+        </w:rPr>
+      </w:pPr>
+      <w:r>
+        <w:rPr>
+          <w:noProof/>
+        </w:rPr>
+        <w:t xml:space="preserve">Kulkarni, O., &amp; Burhanpurwala, A. (2024). A Survey of Advancements in DBSCAN Clustering Algorithms for Big Data. </w:t>
+      </w:r>
+      <w:r>
+        <w:rPr>
+          <w:i/>
+          <w:iCs/>
+          <w:noProof/>
+        </w:rPr>
+        <w:t>2024 3rd International Conference on Power Electronics and IoT Applications in Renewable Energy and Its Control (PARC)</w:t>
+      </w:r>
+      <w:r>
+        <w:rPr>
+          <w:noProof/>
+        </w:rPr>
+        <w:t>, 106–111. https://doi.org/10.1109/PARC59193.2024.10486339</w:t>
+      </w:r>
+    </w:p>
+    <w:p>
+      <w:pPr>
+        <w:widowControl w:val="0"/>
+        <w:autoSpaceDE w:val="0"/>
+        <w:autoSpaceDN w:val="0"/>
+        <w:adjustRightInd w:val="0"/>
+        <w:ind w:left="480" w:hanging="480"/>
+        <w:rPr>
+          <w:noProof/>
+        </w:rPr>
+      </w:pPr>
+      <w:r>
+        <w:rPr>
+          <w:noProof/>
+        </w:rPr>
+        <w:t xml:space="preserve">Kumar, P., &amp; Agrawal, R. (2024). Performance Benchmarking of Clustering Methods using MNIST Data. </w:t>
+      </w:r>
+      <w:r>
+        <w:rPr>
+          <w:i/>
+          <w:iCs/>
+          <w:noProof/>
+        </w:rPr>
+        <w:t>2024 International Conference on IoT Based Control Networks and Intelligent Systems (ICICNIS)</w:t>
+      </w:r>
+      <w:r>
+        <w:rPr>
+          <w:noProof/>
+        </w:rPr>
+        <w:t>, 39–44.</w:t>
+      </w:r>
+    </w:p>
+    <w:p>
+      <w:pPr>
+        <w:widowControl w:val="0"/>
+        <w:autoSpaceDE w:val="0"/>
+        <w:autoSpaceDN w:val="0"/>
+        <w:adjustRightInd w:val="0"/>
+        <w:ind w:left="480" w:hanging="480"/>
+        <w:rPr>
+          <w:noProof/>
+        </w:rPr>
+      </w:pPr>
+      <w:r>
+        <w:rPr>
+          <w:noProof/>
+        </w:rPr>
+        <w:t xml:space="preserve">Kuswanto, H., Setiawan, D., &amp; Sopaheluwakan, A. (2019). Clustering of precipitation pattern in Indonesia using TRMM satellite data. </w:t>
+      </w:r>
+      <w:r>
+        <w:rPr>
+          <w:i/>
+          <w:iCs/>
+          <w:noProof/>
+        </w:rPr>
+        <w:t>Engineering, Technology &amp; Applied Science Research</w:t>
+      </w:r>
+      <w:r>
+        <w:rPr>
+          <w:noProof/>
+        </w:rPr>
+        <w:t xml:space="preserve">, </w:t>
+      </w:r>
+      <w:r>
+        <w:rPr>
+          <w:i/>
+          <w:iCs/>
+          <w:noProof/>
+        </w:rPr>
+        <w:t>9</w:t>
+      </w:r>
+      <w:r>
+        <w:rPr>
+          <w:noProof/>
+        </w:rPr>
+        <w:t>(4), 4484–4489.</w:t>
+      </w:r>
+    </w:p>
+    <w:p>
+      <w:pPr>
+        <w:widowControl w:val="0"/>
+        <w:autoSpaceDE w:val="0"/>
+        <w:autoSpaceDN w:val="0"/>
+        <w:adjustRightInd w:val="0"/>
+        <w:ind w:left="480" w:hanging="480"/>
+        <w:rPr>
+          <w:noProof/>
+        </w:rPr>
+      </w:pPr>
+      <w:r>
+        <w:rPr>
+          <w:noProof/>
+        </w:rPr>
+        <w:t xml:space="preserve">Mahmoud, W. H., Elagib, N. A., Gaese, H., &amp; Heinrich, J. (2014). Rainfall conditions and rainwater harvesting potential in the urban area of Khartoum. </w:t>
+      </w:r>
+      <w:r>
+        <w:rPr>
+          <w:i/>
+          <w:iCs/>
+          <w:noProof/>
+        </w:rPr>
+        <w:t>Resources, Conservation and Recycling</w:t>
+      </w:r>
+      <w:r>
+        <w:rPr>
+          <w:noProof/>
+        </w:rPr>
+        <w:t xml:space="preserve">, </w:t>
+      </w:r>
+      <w:r>
+        <w:rPr>
+          <w:i/>
+          <w:iCs/>
+          <w:noProof/>
+        </w:rPr>
+        <w:t>91</w:t>
+      </w:r>
+      <w:r>
+        <w:rPr>
+          <w:noProof/>
+        </w:rPr>
+        <w:t>, 89–99. https://doi.org/https://doi.org/10.1016/j.resconrec.2014.07.014</w:t>
+      </w:r>
+    </w:p>
+    <w:p>
+      <w:pPr>
+        <w:widowControl w:val="0"/>
+        <w:autoSpaceDE w:val="0"/>
+        <w:autoSpaceDN w:val="0"/>
+        <w:adjustRightInd w:val="0"/>
+        <w:ind w:left="480" w:hanging="480"/>
+        <w:rPr>
+          <w:noProof/>
+        </w:rPr>
+      </w:pPr>
+      <w:r>
+        <w:rPr>
+          <w:noProof/>
+        </w:rPr>
+        <w:t xml:space="preserve">Pampuch, L. A., Negri, R. G., Loikith, P. C., &amp; Bortolozo, C. A. (2023). A Review on Clustering Methods for Climatology Analysis and Its Application over South America. </w:t>
+      </w:r>
+      <w:r>
+        <w:rPr>
+          <w:i/>
+          <w:iCs/>
+          <w:noProof/>
+        </w:rPr>
+        <w:t>International Journal of Geosciences</w:t>
+      </w:r>
+      <w:r>
+        <w:rPr>
+          <w:noProof/>
+        </w:rPr>
+        <w:t xml:space="preserve">, </w:t>
+      </w:r>
+      <w:r>
+        <w:rPr>
+          <w:i/>
+          <w:iCs/>
+          <w:noProof/>
+        </w:rPr>
+        <w:t>14</w:t>
+      </w:r>
+      <w:r>
+        <w:rPr>
+          <w:noProof/>
+        </w:rPr>
+        <w:t>(9). https://doi.org/10.4236/ijg.2023.149047</w:t>
+      </w:r>
+    </w:p>
+    <w:p>
+      <w:pPr>
+        <w:widowControl w:val="0"/>
+        <w:autoSpaceDE w:val="0"/>
+        <w:autoSpaceDN w:val="0"/>
+        <w:adjustRightInd w:val="0"/>
+        <w:ind w:left="480" w:hanging="480"/>
+        <w:rPr>
+          <w:noProof/>
+        </w:rPr>
+      </w:pPr>
+      <w:r>
+        <w:rPr>
+          <w:noProof/>
+        </w:rPr>
+        <w:t xml:space="preserve">Pamuji, G., &amp; Rongtao, H. (2020). A Comparison study of DBScan and K-Means Clustering in Jakarta rainfall based on the Tropical Rainfall Measuring Mission (TRMM) 1998-2007. </w:t>
+      </w:r>
+      <w:r>
+        <w:rPr>
+          <w:i/>
+          <w:iCs/>
+          <w:noProof/>
+        </w:rPr>
+        <w:t>IOP Conference Series: Materials Science and Engineering</w:t>
+      </w:r>
+      <w:r>
+        <w:rPr>
+          <w:noProof/>
+        </w:rPr>
+        <w:t xml:space="preserve">, </w:t>
+      </w:r>
+      <w:r>
+        <w:rPr>
+          <w:i/>
+          <w:iCs/>
+          <w:noProof/>
+        </w:rPr>
+        <w:t>879</w:t>
+      </w:r>
+      <w:r>
+        <w:rPr>
+          <w:noProof/>
+        </w:rPr>
+        <w:t>, 12057. https://doi.org/10.1088/1757-899X/879/1/012057</w:t>
+      </w:r>
+    </w:p>
+    <w:p>
+      <w:pPr>
+        <w:widowControl w:val="0"/>
+        <w:autoSpaceDE w:val="0"/>
+        <w:autoSpaceDN w:val="0"/>
+        <w:adjustRightInd w:val="0"/>
+        <w:ind w:left="480" w:hanging="480"/>
+        <w:rPr>
+          <w:noProof/>
+        </w:rPr>
+      </w:pPr>
+      <w:r>
+        <w:rPr>
+          <w:noProof/>
+        </w:rPr>
+        <w:t xml:space="preserve">Paul, A., Bhowmik, R., Chowdary, V. M., Dutta, D., Sreedhar, U., &amp; Sankar, H. R. (2017). Trend analysis of time series rainfall data using robust statistics. </w:t>
+      </w:r>
+      <w:r>
+        <w:rPr>
+          <w:i/>
+          <w:iCs/>
+          <w:noProof/>
+        </w:rPr>
+        <w:t>Journal of Water and Climate Change</w:t>
+      </w:r>
+      <w:r>
+        <w:rPr>
+          <w:noProof/>
+        </w:rPr>
+        <w:t xml:space="preserve">, </w:t>
+      </w:r>
+      <w:r>
+        <w:rPr>
+          <w:i/>
+          <w:iCs/>
+          <w:noProof/>
+        </w:rPr>
+        <w:t>8</w:t>
+      </w:r>
+      <w:r>
+        <w:rPr>
+          <w:noProof/>
+        </w:rPr>
+        <w:t>(4), 691–700. https://doi.org/10.2166/wcc.2017.141</w:t>
+      </w:r>
+    </w:p>
+    <w:p>
+      <w:pPr>
+        <w:widowControl w:val="0"/>
+        <w:autoSpaceDE w:val="0"/>
+        <w:autoSpaceDN w:val="0"/>
+        <w:adjustRightInd w:val="0"/>
+        <w:ind w:left="480" w:hanging="480"/>
+        <w:rPr>
+          <w:noProof/>
+        </w:rPr>
+      </w:pPr>
+      <w:r>
+        <w:rPr>
+          <w:noProof/>
+        </w:rPr>
+        <w:t xml:space="preserve">Putra, D. M., &amp; Abdulloh, F. F. (2024). Comparison of Clustering Algorithms: Fuzzy C-Means, K-Means, and DBSCAN for House Classification Based on Specifications and Price. </w:t>
+      </w:r>
+      <w:r>
+        <w:rPr>
+          <w:i/>
+          <w:iCs/>
+          <w:noProof/>
+        </w:rPr>
+        <w:t>Journal of Applied Informatics and Computing</w:t>
+      </w:r>
+      <w:r>
+        <w:rPr>
+          <w:noProof/>
+        </w:rPr>
+        <w:t xml:space="preserve">, </w:t>
+      </w:r>
+      <w:r>
+        <w:rPr>
+          <w:i/>
+          <w:iCs/>
+          <w:noProof/>
+        </w:rPr>
+        <w:t>8</w:t>
+      </w:r>
+      <w:r>
+        <w:rPr>
+          <w:noProof/>
+        </w:rPr>
+        <w:t>(2). https://doi.org/https://doi.org/10.30871/jaic.v8i2.8671</w:t>
+      </w:r>
+    </w:p>
+    <w:p>
+      <w:pPr>
+        <w:widowControl w:val="0"/>
+        <w:autoSpaceDE w:val="0"/>
+        <w:autoSpaceDN w:val="0"/>
+        <w:adjustRightInd w:val="0"/>
+        <w:ind w:left="480" w:hanging="480"/>
+        <w:rPr>
+          <w:noProof/>
+        </w:rPr>
+      </w:pPr>
+      <w:r>
+        <w:rPr>
+          <w:noProof/>
+        </w:rPr>
+        <w:t xml:space="preserve">Riasetiawan, M., Ashari, A., &amp; Wahyu, P. (2022). The Performance Evaluation of K-Means and Agglomerative Hierarchical Clustering for Rainfall Patterns and </w:t>
+      </w:r>
+      <w:r>
+        <w:rPr>
+          <w:noProof/>
+        </w:rPr>
+        <w:lastRenderedPageBreak/>
+        <w:t xml:space="preserve">Modelling. </w:t>
+      </w:r>
+      <w:r>
+        <w:rPr>
+          <w:i/>
+          <w:iCs/>
+          <w:noProof/>
+        </w:rPr>
+        <w:t>2022 6th International Conference on Information Technology, Information Systems and Electrical Engineering (ICITISEE)</w:t>
+      </w:r>
+      <w:r>
+        <w:rPr>
+          <w:noProof/>
+        </w:rPr>
+        <w:t>, 431–436. https://doi.org/10.1109/ICITISEE57756.2022.10057729</w:t>
+      </w:r>
+    </w:p>
+    <w:p>
+      <w:pPr>
+        <w:widowControl w:val="0"/>
+        <w:autoSpaceDE w:val="0"/>
+        <w:autoSpaceDN w:val="0"/>
+        <w:adjustRightInd w:val="0"/>
+        <w:ind w:left="480" w:hanging="480"/>
+        <w:rPr>
+          <w:noProof/>
+        </w:rPr>
+      </w:pPr>
+      <w:r>
+        <w:rPr>
+          <w:noProof/>
+        </w:rPr>
+        <w:t xml:space="preserve">Runtulalo, Y., &amp; Manongga, D. (2024). Clustering Tingkat Kemiripan Curah Hujan di Indonesia Berdasarkan Provinsi Menggunakan Metode Hierarchical Clustering dan GeoMap. </w:t>
+      </w:r>
+      <w:r>
+        <w:rPr>
+          <w:i/>
+          <w:iCs/>
+          <w:noProof/>
+        </w:rPr>
+        <w:t>Progresif: Jurnal Ilmiah Komputer</w:t>
+      </w:r>
+      <w:r>
+        <w:rPr>
+          <w:noProof/>
+        </w:rPr>
+        <w:t xml:space="preserve">, </w:t>
+      </w:r>
+      <w:r>
+        <w:rPr>
+          <w:i/>
+          <w:iCs/>
+          <w:noProof/>
+        </w:rPr>
+        <w:t>20</w:t>
+      </w:r>
+      <w:r>
+        <w:rPr>
+          <w:noProof/>
+        </w:rPr>
+        <w:t>(1), 325–336. https://ojs.stmik-banjarbaru.ac.id/index.php/progresif/article/view/1583</w:t>
+      </w:r>
+    </w:p>
+    <w:p>
+      <w:pPr>
+        <w:widowControl w:val="0"/>
+        <w:autoSpaceDE w:val="0"/>
+        <w:autoSpaceDN w:val="0"/>
+        <w:adjustRightInd w:val="0"/>
+        <w:ind w:left="480" w:hanging="480"/>
+        <w:rPr>
+          <w:noProof/>
+        </w:rPr>
+      </w:pPr>
+      <w:r>
+        <w:rPr>
+          <w:noProof/>
+        </w:rPr>
+        <w:t xml:space="preserve">Sasirekha, K., &amp; Baby, P. (2013). Agglomerative Hierarchical Clustering Algorithm- A Review. </w:t>
+      </w:r>
+      <w:r>
+        <w:rPr>
+          <w:i/>
+          <w:iCs/>
+          <w:noProof/>
+        </w:rPr>
+        <w:t>International Journal of Scientific and Research Publications</w:t>
+      </w:r>
+      <w:r>
+        <w:rPr>
+          <w:noProof/>
+        </w:rPr>
+        <w:t xml:space="preserve">, </w:t>
+      </w:r>
+      <w:r>
+        <w:rPr>
+          <w:i/>
+          <w:iCs/>
+          <w:noProof/>
+        </w:rPr>
+        <w:t>3</w:t>
+      </w:r>
+      <w:r>
+        <w:rPr>
+          <w:noProof/>
+        </w:rPr>
+        <w:t>(3). https://www.ijsrp.org/research-paper-0313/ijsrp-p1515.pdf</w:t>
+      </w:r>
+    </w:p>
+    <w:p>
+      <w:pPr>
+        <w:widowControl w:val="0"/>
+        <w:autoSpaceDE w:val="0"/>
+        <w:autoSpaceDN w:val="0"/>
+        <w:adjustRightInd w:val="0"/>
+        <w:ind w:left="480" w:hanging="480"/>
+        <w:rPr>
+          <w:noProof/>
+        </w:rPr>
+      </w:pPr>
+      <w:r>
+        <w:rPr>
+          <w:noProof/>
+        </w:rPr>
+        <w:t xml:space="preserve">Setiawan, D. (2021). Analisis Curah Hujan di Indonesia untuk Memetakan Daerah Potensi Banjir dan Tanah Longsor dengan Metode Cluster Fuzzy C-Means dan Singular Value Decompotition (SVD). </w:t>
+      </w:r>
+      <w:r>
+        <w:rPr>
+          <w:i/>
+          <w:iCs/>
+          <w:noProof/>
+        </w:rPr>
+        <w:t>Engineering, MAthematics and Computer Science Journal (EMACS)</w:t>
+      </w:r>
+      <w:r>
+        <w:rPr>
+          <w:noProof/>
+        </w:rPr>
+        <w:t xml:space="preserve">, </w:t>
+      </w:r>
+      <w:r>
+        <w:rPr>
+          <w:i/>
+          <w:iCs/>
+          <w:noProof/>
+        </w:rPr>
+        <w:t>3</w:t>
+      </w:r>
+      <w:r>
+        <w:rPr>
+          <w:noProof/>
+        </w:rPr>
+        <w:t>(3). https://doi.org/https://doi.org/10.21512/emacsjournal.v3i3.7428</w:t>
+      </w:r>
+    </w:p>
+    <w:p>
+      <w:pPr>
+        <w:widowControl w:val="0"/>
+        <w:autoSpaceDE w:val="0"/>
+        <w:autoSpaceDN w:val="0"/>
+        <w:adjustRightInd w:val="0"/>
+        <w:ind w:left="480" w:hanging="480"/>
+        <w:rPr>
+          <w:noProof/>
+        </w:rPr>
+      </w:pPr>
+      <w:r>
+        <w:rPr>
+          <w:noProof/>
+        </w:rPr>
+        <w:t xml:space="preserve">Sharma, S., &amp; Batra, N. (2019). Comparative study of single linkage, complete linkage, and ward method of agglomerative clustering. </w:t>
+      </w:r>
+      <w:r>
+        <w:rPr>
+          <w:i/>
+          <w:iCs/>
+          <w:noProof/>
+        </w:rPr>
+        <w:t>2019 International Conference on Machine Learning, Big Data, Cloud and Parallel Computing (COMITCon)</w:t>
+      </w:r>
+      <w:r>
+        <w:rPr>
+          <w:noProof/>
+        </w:rPr>
+        <w:t>, 568–573.</w:t>
+      </w:r>
+    </w:p>
+    <w:p>
+      <w:pPr>
+        <w:widowControl w:val="0"/>
+        <w:autoSpaceDE w:val="0"/>
+        <w:autoSpaceDN w:val="0"/>
+        <w:adjustRightInd w:val="0"/>
+        <w:ind w:left="480" w:hanging="480"/>
+        <w:rPr>
+          <w:noProof/>
+        </w:rPr>
+      </w:pPr>
+      <w:r>
+        <w:rPr>
+          <w:noProof/>
+        </w:rPr>
+        <w:t xml:space="preserve">Sheridan, S., &amp; Lee, C. (2011). The Self-Organizing Map in Synoptic Climatological Research. </w:t>
+      </w:r>
+      <w:r>
+        <w:rPr>
+          <w:i/>
+          <w:iCs/>
+          <w:noProof/>
+        </w:rPr>
+        <w:t>Progress in Physical Geography</w:t>
+      </w:r>
+      <w:r>
+        <w:rPr>
+          <w:noProof/>
+        </w:rPr>
+        <w:t xml:space="preserve">, </w:t>
+      </w:r>
+      <w:r>
+        <w:rPr>
+          <w:i/>
+          <w:iCs/>
+          <w:noProof/>
+        </w:rPr>
+        <w:t>35</w:t>
+      </w:r>
+      <w:r>
+        <w:rPr>
+          <w:noProof/>
+        </w:rPr>
+        <w:t>, 109–119. https://doi.org/10.1177/0309133310397582.</w:t>
+      </w:r>
+    </w:p>
+    <w:p>
+      <w:pPr>
+        <w:widowControl w:val="0"/>
+        <w:autoSpaceDE w:val="0"/>
+        <w:autoSpaceDN w:val="0"/>
+        <w:adjustRightInd w:val="0"/>
+        <w:ind w:left="480" w:hanging="480"/>
+        <w:rPr>
+          <w:noProof/>
+        </w:rPr>
+      </w:pPr>
+      <w:r>
+        <w:rPr>
+          <w:noProof/>
+        </w:rPr>
+        <w:t xml:space="preserve">Sofro, A., Khikmah, K., Romadhonia, R., Ariyanto, D., &amp; Riani, R. (2024). ANALYSIS OF RAINFALL IN INDONESIA USING A TIME SERIES- BASED CLUSTERING APPROACH. </w:t>
+      </w:r>
+      <w:r>
+        <w:rPr>
+          <w:i/>
+          <w:iCs/>
+          <w:noProof/>
+        </w:rPr>
+        <w:t>BAREKENG JURNAL ILMU MATEMATIKA DAN TERAPAN</w:t>
+      </w:r>
+      <w:r>
+        <w:rPr>
+          <w:noProof/>
+        </w:rPr>
+        <w:t>, 837–848. https://doi.org/10.30598/barekengvol18iss2pp0837-0848</w:t>
+      </w:r>
+    </w:p>
+    <w:p>
+      <w:pPr>
+        <w:widowControl w:val="0"/>
+        <w:autoSpaceDE w:val="0"/>
+        <w:autoSpaceDN w:val="0"/>
+        <w:adjustRightInd w:val="0"/>
+        <w:ind w:left="480" w:hanging="480"/>
+        <w:rPr>
+          <w:noProof/>
+        </w:rPr>
+      </w:pPr>
+      <w:r>
+        <w:rPr>
+          <w:noProof/>
+        </w:rPr>
+        <w:t xml:space="preserve">Steward, B. (WMO). (2011). Managing Water Resources with Climate Information. </w:t>
+      </w:r>
+      <w:r>
+        <w:rPr>
+          <w:i/>
+          <w:iCs/>
+          <w:noProof/>
+        </w:rPr>
+        <w:t>WMO Vol 60 (2)</w:t>
+      </w:r>
+      <w:r>
+        <w:rPr>
+          <w:noProof/>
+        </w:rPr>
+        <w:t>. https://wmo.int/resources/magazines/vol-60-2-2011</w:t>
+      </w:r>
+    </w:p>
+    <w:p>
+      <w:pPr>
+        <w:widowControl w:val="0"/>
+        <w:autoSpaceDE w:val="0"/>
+        <w:autoSpaceDN w:val="0"/>
+        <w:adjustRightInd w:val="0"/>
+        <w:ind w:left="480" w:hanging="480"/>
+        <w:rPr>
+          <w:noProof/>
+        </w:rPr>
+      </w:pPr>
+      <w:r>
+        <w:rPr>
+          <w:noProof/>
+        </w:rPr>
+        <w:t xml:space="preserve">Straus, D. M. (2019). </w:t>
+      </w:r>
+      <w:r>
+        <w:rPr>
+          <w:i/>
+          <w:iCs/>
+          <w:noProof/>
+        </w:rPr>
+        <w:t>Clustering Techniques in Climate Analysis</w:t>
+      </w:r>
+      <w:r>
+        <w:rPr>
+          <w:noProof/>
+        </w:rPr>
+        <w:t>. Oxford University Press. https://doi.org/10.1093/acrefore/9780190228620.013.711</w:t>
+      </w:r>
+    </w:p>
+    <w:p>
+      <w:pPr>
+        <w:widowControl w:val="0"/>
+        <w:autoSpaceDE w:val="0"/>
+        <w:autoSpaceDN w:val="0"/>
+        <w:adjustRightInd w:val="0"/>
+        <w:ind w:left="480" w:hanging="480"/>
+        <w:rPr>
+          <w:noProof/>
+        </w:rPr>
+      </w:pPr>
+      <w:r>
+        <w:rPr>
+          <w:noProof/>
+        </w:rPr>
+        <w:t xml:space="preserve">Studer, S., Bui, T. B., Drescher, C., Hanuschkin, A., Winkler, L., Peters, S., &amp; Müller, K.-R. (2021). Towards CRISP-ML(Q): A Machine Learning Process Model with </w:t>
+      </w:r>
+      <w:r>
+        <w:rPr>
+          <w:noProof/>
+        </w:rPr>
+        <w:lastRenderedPageBreak/>
+        <w:t xml:space="preserve">Quality Assurance Methodology. In </w:t>
+      </w:r>
+      <w:r>
+        <w:rPr>
+          <w:i/>
+          <w:iCs/>
+          <w:noProof/>
+        </w:rPr>
+        <w:t>Machine Learning and Knowledge Extraction</w:t>
+      </w:r>
+      <w:r>
+        <w:rPr>
+          <w:noProof/>
+        </w:rPr>
+        <w:t xml:space="preserve"> (Vol. 3, Issue 2, pp. 392–413). https://doi.org/10.3390/make3020020</w:t>
+      </w:r>
+    </w:p>
+    <w:p>
+      <w:pPr>
+        <w:widowControl w:val="0"/>
+        <w:autoSpaceDE w:val="0"/>
+        <w:autoSpaceDN w:val="0"/>
+        <w:adjustRightInd w:val="0"/>
+        <w:ind w:left="480" w:hanging="480"/>
+        <w:rPr>
+          <w:noProof/>
+        </w:rPr>
+      </w:pPr>
+      <w:r>
+        <w:rPr>
+          <w:noProof/>
+        </w:rPr>
+        <w:t xml:space="preserve">Tolentino, P. L. M., Williams, R. D., &amp; Hurst, M. D. (2025). Natural Flood Risk Management in Tropical Southeast Asia: Prospects in the Biodiverse Archipelagic Nation of the Philippines. </w:t>
+      </w:r>
+      <w:r>
+        <w:rPr>
+          <w:i/>
+          <w:iCs/>
+          <w:noProof/>
+        </w:rPr>
+        <w:t>WIREs Water</w:t>
+      </w:r>
+      <w:r>
+        <w:rPr>
+          <w:noProof/>
+        </w:rPr>
+        <w:t xml:space="preserve">, </w:t>
+      </w:r>
+      <w:r>
+        <w:rPr>
+          <w:i/>
+          <w:iCs/>
+          <w:noProof/>
+        </w:rPr>
+        <w:t>12</w:t>
+      </w:r>
+      <w:r>
+        <w:rPr>
+          <w:noProof/>
+        </w:rPr>
+        <w:t>(1), e70000. https://doi.org/https://doi.org/10.1002/wat2.70000</w:t>
+      </w:r>
+    </w:p>
+    <w:p>
+      <w:pPr>
+        <w:widowControl w:val="0"/>
+        <w:autoSpaceDE w:val="0"/>
+        <w:autoSpaceDN w:val="0"/>
+        <w:adjustRightInd w:val="0"/>
+        <w:ind w:left="480" w:hanging="480"/>
+        <w:rPr>
+          <w:noProof/>
+        </w:rPr>
+      </w:pPr>
+      <w:r>
+        <w:rPr>
+          <w:noProof/>
+        </w:rPr>
+        <w:t xml:space="preserve">Verma, N., Grover, P., &amp; Deep, A. (2012). An Approach for Cluster Analysis based upon Hierarchical Algorithm - Agglomerative Algorithm. </w:t>
+      </w:r>
+      <w:r>
+        <w:rPr>
+          <w:i/>
+          <w:iCs/>
+          <w:noProof/>
+        </w:rPr>
+        <w:t>International Journal of Engineering, Science and Metallurgy</w:t>
+      </w:r>
+      <w:r>
+        <w:rPr>
+          <w:noProof/>
+        </w:rPr>
+        <w:t xml:space="preserve">, </w:t>
+      </w:r>
+      <w:r>
+        <w:rPr>
+          <w:i/>
+          <w:iCs/>
+          <w:noProof/>
+        </w:rPr>
+        <w:t>3</w:t>
+      </w:r>
+      <w:r>
+        <w:rPr>
+          <w:noProof/>
+        </w:rPr>
+        <w:t>(3).</w:t>
+      </w:r>
+    </w:p>
+    <w:p>
+      <w:pPr>
+        <w:widowControl w:val="0"/>
+        <w:autoSpaceDE w:val="0"/>
+        <w:autoSpaceDN w:val="0"/>
+        <w:adjustRightInd w:val="0"/>
+        <w:ind w:left="480" w:hanging="480"/>
+        <w:rPr>
+          <w:noProof/>
+        </w:rPr>
+      </w:pPr>
+      <w:r>
+        <w:rPr>
+          <w:noProof/>
+        </w:rPr>
+        <w:t xml:space="preserve">Voutilainen, A., &amp; Arvola, L. (2017). SOM clustering of 21-year data of a small pristine boreal lake. </w:t>
+      </w:r>
+      <w:r>
+        <w:rPr>
+          <w:i/>
+          <w:iCs/>
+          <w:noProof/>
+        </w:rPr>
+        <w:t>Knowledge &amp; Management of Aquatic Ecosystems</w:t>
+      </w:r>
+      <w:r>
+        <w:rPr>
+          <w:noProof/>
+        </w:rPr>
+        <w:t xml:space="preserve">, </w:t>
+      </w:r>
+      <w:r>
+        <w:rPr>
+          <w:i/>
+          <w:iCs/>
+          <w:noProof/>
+        </w:rPr>
+        <w:t>418</w:t>
+      </w:r>
+      <w:r>
+        <w:rPr>
+          <w:noProof/>
+        </w:rPr>
+        <w:t>. https://doi.org/https://doi.org/10.1051/kmae/2017027</w:t>
+      </w:r>
+    </w:p>
+    <w:p>
+      <w:pPr>
+        <w:widowControl w:val="0"/>
+        <w:autoSpaceDE w:val="0"/>
+        <w:autoSpaceDN w:val="0"/>
+        <w:adjustRightInd w:val="0"/>
+        <w:ind w:left="480" w:hanging="480"/>
+        <w:rPr>
+          <w:noProof/>
+        </w:rPr>
+      </w:pPr>
+      <w:r>
+        <w:rPr>
+          <w:noProof/>
+        </w:rPr>
+        <w:t xml:space="preserve">Wibisono, S., Anwar, M. T., Supriyanto, A., &amp; Amin, I. H. A. (2021). Multivariate weather anomaly detection using DBSCAN clustering algorithm. </w:t>
+      </w:r>
+      <w:r>
+        <w:rPr>
+          <w:i/>
+          <w:iCs/>
+          <w:noProof/>
+        </w:rPr>
+        <w:t>Journal of Physics: Conference Series</w:t>
+      </w:r>
+      <w:r>
+        <w:rPr>
+          <w:noProof/>
+        </w:rPr>
+        <w:t xml:space="preserve">, </w:t>
+      </w:r>
+      <w:r>
+        <w:rPr>
+          <w:i/>
+          <w:iCs/>
+          <w:noProof/>
+        </w:rPr>
+        <w:t>1869</w:t>
+      </w:r>
+      <w:r>
+        <w:rPr>
+          <w:noProof/>
+        </w:rPr>
+        <w:t>(1), 12077. https://doi.org/10.1088/1742-6596/1869/1/012077</w:t>
+      </w:r>
+    </w:p>
+    <w:p>
+      <w:pPr>
+        <w:widowControl w:val="0"/>
+        <w:autoSpaceDE w:val="0"/>
+        <w:autoSpaceDN w:val="0"/>
+        <w:adjustRightInd w:val="0"/>
+        <w:ind w:left="480" w:hanging="480"/>
+        <w:rPr>
+          <w:noProof/>
+        </w:rPr>
+      </w:pPr>
+      <w:r>
+        <w:rPr>
+          <w:noProof/>
+        </w:rPr>
+        <w:t xml:space="preserve">Winarto, Y. T. ., Stigter, C. J. ., &amp; Wicaksono, M. K. (2017). Transdisciplinary Responses to Climate Change: Institutionalizing Agrometeorological Learning Through Science Field Shops in Indonesia. </w:t>
+      </w:r>
+      <w:r>
+        <w:rPr>
+          <w:i/>
+          <w:iCs/>
+          <w:noProof/>
+        </w:rPr>
+        <w:t>Gender, Ethnicity, and Environmental Transformations</w:t>
+      </w:r>
+      <w:r>
+        <w:rPr>
+          <w:noProof/>
+        </w:rPr>
+        <w:t xml:space="preserve">, </w:t>
+      </w:r>
+      <w:r>
+        <w:rPr>
+          <w:i/>
+          <w:iCs/>
+          <w:noProof/>
+        </w:rPr>
+        <w:t>10</w:t>
+      </w:r>
+      <w:r>
+        <w:rPr>
+          <w:noProof/>
+        </w:rPr>
+        <w:t>(1). https://doi.org/https://doi.org/10.14764/10.ASEAS-2017.1-5</w:t>
+      </w:r>
+    </w:p>
+    <w:p>
+      <w:r>
+        <w:fldChar w:fldCharType="end"/>
+      </w:r>
+    </w:p>
     <w:sectPr>
       <w:pgSz w:w="11906" w:h="16838"/>
       <w:pgMar w:top="1701" w:right="1701" w:bottom="1701" w:left="1701" w:header="708" w:footer="708" w:gutter="0"/>
@@ -3818,12 +6564,112 @@
 </w:document>
 </file>
 
+<file path=word/endnotes.xml><?xml version="1.0" encoding="utf-8"?>
+<w:endnotes xmlns:wpc="http://schemas.microsoft.com/office/word/2010/wordprocessingCanvas" xmlns:cx="http://schemas.microsoft.com/office/drawing/2014/chartex" xmlns:cx1="http://schemas.microsoft.com/office/drawing/2015/9/8/chartex" xmlns:cx2="http://schemas.microsoft.com/office/drawing/2015/10/21/chartex" xmlns:cx3="http://schemas.microsoft.com/office/drawing/2016/5/9/chartex" xmlns:cx4="http://schemas.microsoft.com/office/drawing/2016/5/10/chartex" xmlns:cx5="http://schemas.microsoft.com/office/drawing/2016/5/11/chartex" xmlns:cx6="http://schemas.microsoft.com/office/drawing/2016/5/12/chartex" xmlns:cx7="http://schemas.microsoft.com/office/drawing/2016/5/13/chartex" xmlns:cx8="http://schemas.microsoft.com/office/drawing/2016/5/14/chartex" xmlns:mc="http://schemas.openxmlformats.org/markup-compatibility/2006" xmlns:aink="http://schemas.microsoft.com/office/drawing/2016/ink" xmlns:am3d="http://schemas.microsoft.com/office/drawing/2017/model3d" xmlns:o="urn:schemas-microsoft-com:office:office" xmlns:oel="http://schemas.microsoft.com/office/2019/extlst" xmlns:r="http://schemas.openxmlformats.org/officeDocument/2006/relationships" xmlns:m="http://schemas.openxmlformats.org/officeDocument/2006/math" xmlns:v="urn:schemas-microsoft-com:vml" xmlns:wp14="http://schemas.microsoft.com/office/word/2010/wordprocessingDrawing" xmlns:wp="http://schemas.openxmlformats.org/drawingml/2006/wordprocessingDrawing" xmlns:w10="urn:schemas-microsoft-com:office:word" xmlns:w="http://schemas.openxmlformats.org/wordprocessingml/2006/main" xmlns:w14="http://schemas.microsoft.com/office/word/2010/wordml" xmlns:w15="http://schemas.microsoft.com/office/word/2012/wordml" xmlns:w16cex="http://schemas.microsoft.com/office/word/2018/wordml/cex" xmlns:w16cid="http://schemas.microsoft.com/office/word/2016/wordml/cid" xmlns:w16="http://schemas.microsoft.com/office/word/2018/wordml" xmlns:w16du="http://schemas.microsoft.com/office/word/2023/wordml/word16du" xmlns:w16sdtdh="http://schemas.microsoft.com/office/word/2020/wordml/sdtdatahash" xmlns:w16sdtfl="http://schemas.microsoft.com/office/word/2024/wordml/sdtformatlock" xmlns:w16se="http://schemas.microsoft.com/office/word/2015/wordml/symex" xmlns:wpg="http://schemas.microsoft.com/office/word/2010/wordprocessingGroup" xmlns:wpi="http://schemas.microsoft.com/office/word/2010/wordprocessingInk" xmlns:wne="http://schemas.microsoft.com/office/word/2006/wordml" xmlns:wps="http://schemas.microsoft.com/office/word/2010/wordprocessingShape" mc:Ignorable="w14 w15 w16se w16cid w16 w16cex w16sdtdh w16sdtfl w16du wp14">
+  <w:endnote w:type="separator" w:id="-1">
+    <w:p>
+      <w:pPr>
+        <w:spacing w:line="240" w:lineRule="auto"/>
+      </w:pPr>
+      <w:r>
+        <w:separator/>
+      </w:r>
+    </w:p>
+  </w:endnote>
+  <w:endnote w:type="continuationSeparator" w:id="0">
+    <w:p>
+      <w:pPr>
+        <w:spacing w:line="240" w:lineRule="auto"/>
+      </w:pPr>
+      <w:r>
+        <w:continuationSeparator/>
+      </w:r>
+    </w:p>
+  </w:endnote>
+</w:endnotes>
+</file>
+
+<file path=word/footnotes.xml><?xml version="1.0" encoding="utf-8"?>
+<w:footnotes xmlns:wpc="http://schemas.microsoft.com/office/word/2010/wordprocessingCanvas" xmlns:cx="http://schemas.microsoft.com/office/drawing/2014/chartex" xmlns:cx1="http://schemas.microsoft.com/office/drawing/2015/9/8/chartex" xmlns:cx2="http://schemas.microsoft.com/office/drawing/2015/10/21/chartex" xmlns:cx3="http://schemas.microsoft.com/office/drawing/2016/5/9/chartex" xmlns:cx4="http://schemas.microsoft.com/office/drawing/2016/5/10/chartex" xmlns:cx5="http://schemas.microsoft.com/office/drawing/2016/5/11/chartex" xmlns:cx6="http://schemas.microsoft.com/office/drawing/2016/5/12/chartex" xmlns:cx7="http://schemas.microsoft.com/office/drawing/2016/5/13/chartex" xmlns:cx8="http://schemas.microsoft.com/office/drawing/2016/5/14/chartex" xmlns:mc="http://schemas.openxmlformats.org/markup-compatibility/2006" xmlns:aink="http://schemas.microsoft.com/office/drawing/2016/ink" xmlns:am3d="http://schemas.microsoft.com/office/drawing/2017/model3d" xmlns:o="urn:schemas-microsoft-com:office:office" xmlns:oel="http://schemas.microsoft.com/office/2019/extlst" xmlns:r="http://schemas.openxmlformats.org/officeDocument/2006/relationships" xmlns:m="http://schemas.openxmlformats.org/officeDocument/2006/math" xmlns:v="urn:schemas-microsoft-com:vml" xmlns:wp14="http://schemas.microsoft.com/office/word/2010/wordprocessingDrawing" xmlns:wp="http://schemas.openxmlformats.org/drawingml/2006/wordprocessingDrawing" xmlns:w10="urn:schemas-microsoft-com:office:word" xmlns:w="http://schemas.openxmlformats.org/wordprocessingml/2006/main" xmlns:w14="http://schemas.microsoft.com/office/word/2010/wordml" xmlns:w15="http://schemas.microsoft.com/office/word/2012/wordml" xmlns:w16cex="http://schemas.microsoft.com/office/word/2018/wordml/cex" xmlns:w16cid="http://schemas.microsoft.com/office/word/2016/wordml/cid" xmlns:w16="http://schemas.microsoft.com/office/word/2018/wordml" xmlns:w16du="http://schemas.microsoft.com/office/word/2023/wordml/word16du" xmlns:w16sdtdh="http://schemas.microsoft.com/office/word/2020/wordml/sdtdatahash" xmlns:w16sdtfl="http://schemas.microsoft.com/office/word/2024/wordml/sdtformatlock" xmlns:w16se="http://schemas.microsoft.com/office/word/2015/wordml/symex" xmlns:wpg="http://schemas.microsoft.com/office/word/2010/wordprocessingGroup" xmlns:wpi="http://schemas.microsoft.com/office/word/2010/wordprocessingInk" xmlns:wne="http://schemas.microsoft.com/office/word/2006/wordml" xmlns:wps="http://schemas.microsoft.com/office/word/2010/wordprocessingShape" mc:Ignorable="w14 w15 w16se w16cid w16 w16cex w16sdtdh w16sdtfl w16du wp14">
+  <w:footnote w:type="separator" w:id="-1">
+    <w:p>
+      <w:pPr>
+        <w:spacing w:line="240" w:lineRule="auto"/>
+      </w:pPr>
+      <w:r>
+        <w:separator/>
+      </w:r>
+    </w:p>
+  </w:footnote>
+  <w:footnote w:type="continuationSeparator" w:id="0">
+    <w:p>
+      <w:pPr>
+        <w:spacing w:line="240" w:lineRule="auto"/>
+      </w:pPr>
+      <w:r>
+        <w:continuationSeparator/>
+      </w:r>
+    </w:p>
+  </w:footnote>
+  <w:footnote w:id="1">
+    <w:p>
+      <w:pPr>
+        <w:pStyle w:val="FootnoteText"/>
+        <w:rPr>
+          <w:lang w:val="en-US"/>
+        </w:rPr>
+      </w:pPr>
+      <w:r>
+        <w:rPr>
+          <w:rStyle w:val="FootnoteReference"/>
+        </w:rPr>
+        <w:footnoteRef/>
+      </w:r>
+      <w:r>
+        <w:t xml:space="preserve"> </w:t>
+      </w:r>
+      <w:r>
+        <w:rPr>
+          <w:lang w:val="en-US"/>
+        </w:rPr>
+        <w:t>https://kaggle.com</w:t>
+      </w:r>
+    </w:p>
+  </w:footnote>
+  <w:footnote w:id="2">
+    <w:p>
+      <w:pPr>
+        <w:pStyle w:val="FootnoteText"/>
+        <w:rPr>
+          <w:lang w:val="en-US"/>
+        </w:rPr>
+      </w:pPr>
+      <w:r>
+        <w:rPr>
+          <w:rStyle w:val="FootnoteReference"/>
+        </w:rPr>
+        <w:footnoteRef/>
+      </w:r>
+      <w:r>
+        <w:t xml:space="preserve"> </w:t>
+      </w:r>
+      <w:r>
+        <w:rPr>
+          <w:lang w:val="en-US"/>
+        </w:rPr>
+        <w:t>https://github.com</w:t>
+      </w:r>
+    </w:p>
+  </w:footnote>
+</w:footnotes>
+</file>
+
 <file path=word/numbering.xml><?xml version="1.0" encoding="utf-8"?>
 <w:numbering xmlns:wpc="http://schemas.microsoft.com/office/word/2010/wordprocessingCanvas" xmlns:cx="http://schemas.microsoft.com/office/drawing/2014/chartex" xmlns:cx1="http://schemas.microsoft.com/office/drawing/2015/9/8/chartex" xmlns:cx2="http://schemas.microsoft.com/office/drawing/2015/10/21/chartex" xmlns:cx3="http://schemas.microsoft.com/office/drawing/2016/5/9/chartex" xmlns:cx4="http://schemas.microsoft.com/office/drawing/2016/5/10/chartex" xmlns:cx5="http://schemas.microsoft.com/office/drawing/2016/5/11/chartex" xmlns:cx6="http://schemas.microsoft.com/office/drawing/2016/5/12/chartex" xmlns:cx7="http://schemas.microsoft.com/office/drawing/2016/5/13/chartex" xmlns:cx8="http://schemas.microsoft.com/office/drawing/2016/5/14/chartex" xmlns:mc="http://schemas.openxmlformats.org/markup-compatibility/2006" xmlns:aink="http://schemas.microsoft.com/office/drawing/2016/ink" xmlns:am3d="http://schemas.microsoft.com/office/drawing/2017/model3d" xmlns:o="urn:schemas-microsoft-com:office:office" xmlns:oel="http://schemas.microsoft.com/office/2019/extlst" xmlns:r="http://schemas.openxmlformats.org/officeDocument/2006/relationships" xmlns:m="http://schemas.openxmlformats.org/officeDocument/2006/math" xmlns:v="urn:schemas-microsoft-com:vml" xmlns:wp14="http://schemas.microsoft.com/office/word/2010/wordprocessingDrawing" xmlns:wp="http://schemas.openxmlformats.org/drawingml/2006/wordprocessingDrawing" xmlns:w10="urn:schemas-microsoft-com:office:word" xmlns:w="http://schemas.openxmlformats.org/wordprocessingml/2006/main" xmlns:w14="http://schemas.microsoft.com/office/word/2010/wordml" xmlns:w15="http://schemas.microsoft.com/office/word/2012/wordml" xmlns:w16cex="http://schemas.microsoft.com/office/word/2018/wordml/cex" xmlns:w16cid="http://schemas.microsoft.com/office/word/2016/wordml/cid" xmlns:w16="http://schemas.microsoft.com/office/word/2018/wordml" xmlns:w16du="http://schemas.microsoft.com/office/word/2023/wordml/word16du" xmlns:w16sdtdh="http://schemas.microsoft.com/office/word/2020/wordml/sdtdatahash" xmlns:w16sdtfl="http://schemas.microsoft.com/office/word/2024/wordml/sdtformatlock" xmlns:w16se="http://schemas.microsoft.com/office/word/2015/wordml/symex" xmlns:wpg="http://schemas.microsoft.com/office/word/2010/wordprocessingGroup" xmlns:wpi="http://schemas.microsoft.com/office/word/2010/wordprocessingInk" xmlns:wne="http://schemas.microsoft.com/office/word/2006/wordml" xmlns:wps="http://schemas.microsoft.com/office/word/2010/wordprocessingShape" mc:Ignorable="w14 w15 w16se w16cid w16 w16cex w16sdtdh w16sdtfl w16du wp14">
   <w:abstractNum w:abstractNumId="0" w15:restartNumberingAfterBreak="0">
-    <w:nsid w:val="1C761651"/>
+    <w:nsid w:val="08DF0E11"/>
     <w:multiLevelType w:val="hybridMultilevel"/>
-    <w:tmpl w:val="6A6E9AEC"/>
+    <w:tmpl w:val="BDF61EC2"/>
     <w:lvl w:ilvl="0" w:tplc="04210019">
       <w:start w:val="1"/>
       <w:numFmt w:val="lowerLetter"/>
@@ -3910,6 +6756,95 @@
     </w:lvl>
   </w:abstractNum>
   <w:abstractNum w:abstractNumId="1" w15:restartNumberingAfterBreak="0">
+    <w:nsid w:val="1C761651"/>
+    <w:multiLevelType w:val="hybridMultilevel"/>
+    <w:tmpl w:val="6A6E9AEC"/>
+    <w:lvl w:ilvl="0" w:tplc="04210019">
+      <w:start w:val="1"/>
+      <w:numFmt w:val="lowerLetter"/>
+      <w:lvlText w:val="%1."/>
+      <w:lvlJc w:val="left"/>
+      <w:pPr>
+        <w:ind w:left="720" w:hanging="360"/>
+      </w:pPr>
+      <w:rPr>
+        <w:rFonts w:hint="default"/>
+      </w:rPr>
+    </w:lvl>
+    <w:lvl w:ilvl="1" w:tplc="04210019" w:tentative="1">
+      <w:start w:val="1"/>
+      <w:numFmt w:val="lowerLetter"/>
+      <w:lvlText w:val="%2."/>
+      <w:lvlJc w:val="left"/>
+      <w:pPr>
+        <w:ind w:left="1440" w:hanging="360"/>
+      </w:pPr>
+    </w:lvl>
+    <w:lvl w:ilvl="2" w:tplc="0421001B" w:tentative="1">
+      <w:start w:val="1"/>
+      <w:numFmt w:val="lowerRoman"/>
+      <w:lvlText w:val="%3."/>
+      <w:lvlJc w:val="right"/>
+      <w:pPr>
+        <w:ind w:left="2160" w:hanging="180"/>
+      </w:pPr>
+    </w:lvl>
+    <w:lvl w:ilvl="3" w:tplc="0421000F" w:tentative="1">
+      <w:start w:val="1"/>
+      <w:numFmt w:val="decimal"/>
+      <w:lvlText w:val="%4."/>
+      <w:lvlJc w:val="left"/>
+      <w:pPr>
+        <w:ind w:left="2880" w:hanging="360"/>
+      </w:pPr>
+    </w:lvl>
+    <w:lvl w:ilvl="4" w:tplc="04210019" w:tentative="1">
+      <w:start w:val="1"/>
+      <w:numFmt w:val="lowerLetter"/>
+      <w:lvlText w:val="%5."/>
+      <w:lvlJc w:val="left"/>
+      <w:pPr>
+        <w:ind w:left="3600" w:hanging="360"/>
+      </w:pPr>
+    </w:lvl>
+    <w:lvl w:ilvl="5" w:tplc="0421001B" w:tentative="1">
+      <w:start w:val="1"/>
+      <w:numFmt w:val="lowerRoman"/>
+      <w:lvlText w:val="%6."/>
+      <w:lvlJc w:val="right"/>
+      <w:pPr>
+        <w:ind w:left="4320" w:hanging="180"/>
+      </w:pPr>
+    </w:lvl>
+    <w:lvl w:ilvl="6" w:tplc="0421000F" w:tentative="1">
+      <w:start w:val="1"/>
+      <w:numFmt w:val="decimal"/>
+      <w:lvlText w:val="%7."/>
+      <w:lvlJc w:val="left"/>
+      <w:pPr>
+        <w:ind w:left="5040" w:hanging="360"/>
+      </w:pPr>
+    </w:lvl>
+    <w:lvl w:ilvl="7" w:tplc="04210019" w:tentative="1">
+      <w:start w:val="1"/>
+      <w:numFmt w:val="lowerLetter"/>
+      <w:lvlText w:val="%8."/>
+      <w:lvlJc w:val="left"/>
+      <w:pPr>
+        <w:ind w:left="5760" w:hanging="360"/>
+      </w:pPr>
+    </w:lvl>
+    <w:lvl w:ilvl="8" w:tplc="0421001B" w:tentative="1">
+      <w:start w:val="1"/>
+      <w:numFmt w:val="lowerRoman"/>
+      <w:lvlText w:val="%9."/>
+      <w:lvlJc w:val="right"/>
+      <w:pPr>
+        <w:ind w:left="6480" w:hanging="180"/>
+      </w:pPr>
+    </w:lvl>
+  </w:abstractNum>
+  <w:abstractNum w:abstractNumId="2" w15:restartNumberingAfterBreak="0">
     <w:nsid w:val="21F86B54"/>
     <w:multiLevelType w:val="multilevel"/>
     <w:tmpl w:val="776E4D2E"/>
@@ -4022,7 +6957,7 @@
       </w:rPr>
     </w:lvl>
   </w:abstractNum>
-  <w:abstractNum w:abstractNumId="2" w15:restartNumberingAfterBreak="0">
+  <w:abstractNum w:abstractNumId="3" w15:restartNumberingAfterBreak="0">
     <w:nsid w:val="6BD81AB7"/>
     <w:multiLevelType w:val="hybridMultilevel"/>
     <w:tmpl w:val="521C7B74"/>
@@ -4111,7 +7046,7 @@
       </w:pPr>
     </w:lvl>
   </w:abstractNum>
-  <w:abstractNum w:abstractNumId="3" w15:restartNumberingAfterBreak="0">
+  <w:abstractNum w:abstractNumId="4" w15:restartNumberingAfterBreak="0">
     <w:nsid w:val="76A85887"/>
     <w:multiLevelType w:val="hybridMultilevel"/>
     <w:tmpl w:val="459E517E"/>
@@ -4200,7 +7135,7 @@
       </w:pPr>
     </w:lvl>
   </w:abstractNum>
-  <w:abstractNum w:abstractNumId="4" w15:restartNumberingAfterBreak="0">
+  <w:abstractNum w:abstractNumId="5" w15:restartNumberingAfterBreak="0">
     <w:nsid w:val="7E7344A6"/>
     <w:multiLevelType w:val="multilevel"/>
     <w:tmpl w:val="A13C1630"/>
@@ -4314,18 +7249,21 @@
     </w:lvl>
   </w:abstractNum>
   <w:num w:numId="1" w16cid:durableId="475992432">
+    <w:abstractNumId w:val="2"/>
+  </w:num>
+  <w:num w:numId="2" w16cid:durableId="1522352393">
+    <w:abstractNumId w:val="3"/>
+  </w:num>
+  <w:num w:numId="3" w16cid:durableId="320281492">
+    <w:abstractNumId w:val="4"/>
+  </w:num>
+  <w:num w:numId="4" w16cid:durableId="1485051119">
+    <w:abstractNumId w:val="5"/>
+  </w:num>
+  <w:num w:numId="5" w16cid:durableId="1736538881">
     <w:abstractNumId w:val="1"/>
   </w:num>
-  <w:num w:numId="2" w16cid:durableId="1522352393">
-    <w:abstractNumId w:val="2"/>
-  </w:num>
-  <w:num w:numId="3" w16cid:durableId="320281492">
-    <w:abstractNumId w:val="3"/>
-  </w:num>
-  <w:num w:numId="4" w16cid:durableId="1485051119">
-    <w:abstractNumId w:val="4"/>
-  </w:num>
-  <w:num w:numId="5" w16cid:durableId="1736538881">
+  <w:num w:numId="6" w16cid:durableId="615405522">
     <w:abstractNumId w:val="0"/>
   </w:num>
 </w:numbering>
@@ -4917,6 +7855,7 @@
   <w:style w:type="character" w:default="1" w:styleId="DefaultParagraphFont">
     <w:name w:val="Default Paragraph Font"/>
     <w:uiPriority w:val="1"/>
+    <w:semiHidden/>
     <w:unhideWhenUsed/>
   </w:style>
   <w:style w:type="table" w:default="1" w:styleId="TableNormal">
@@ -5242,6 +8181,82 @@
       <w:color w:val="666666"/>
     </w:rPr>
   </w:style>
+  <w:style w:type="paragraph" w:styleId="Caption">
+    <w:name w:val="caption"/>
+    <w:basedOn w:val="Normal"/>
+    <w:next w:val="Normal"/>
+    <w:uiPriority w:val="35"/>
+    <w:unhideWhenUsed/>
+    <w:qFormat/>
+    <w:rsid w:val="00DB5AD8"/>
+    <w:pPr>
+      <w:spacing w:after="200" w:line="240" w:lineRule="auto"/>
+      <w:jc w:val="center"/>
+    </w:pPr>
+    <w:rPr>
+      <w:sz w:val="22"/>
+      <w:szCs w:val="22"/>
+    </w:rPr>
+  </w:style>
+  <w:style w:type="table" w:styleId="TableGrid">
+    <w:name w:val="Table Grid"/>
+    <w:basedOn w:val="TableNormal"/>
+    <w:uiPriority w:val="39"/>
+    <w:rsid w:val="006763C6"/>
+    <w:pPr>
+      <w:spacing w:after="0" w:line="240" w:lineRule="auto"/>
+    </w:pPr>
+    <w:tblPr>
+      <w:tblBorders>
+        <w:top w:val="single" w:sz="4" w:space="0" w:color="auto"/>
+        <w:left w:val="single" w:sz="4" w:space="0" w:color="auto"/>
+        <w:bottom w:val="single" w:sz="4" w:space="0" w:color="auto"/>
+        <w:right w:val="single" w:sz="4" w:space="0" w:color="auto"/>
+        <w:insideH w:val="single" w:sz="4" w:space="0" w:color="auto"/>
+        <w:insideV w:val="single" w:sz="4" w:space="0" w:color="auto"/>
+      </w:tblBorders>
+    </w:tblPr>
+  </w:style>
+  <w:style w:type="paragraph" w:styleId="FootnoteText">
+    <w:name w:val="footnote text"/>
+    <w:basedOn w:val="Normal"/>
+    <w:link w:val="FootnoteTextChar"/>
+    <w:uiPriority w:val="99"/>
+    <w:semiHidden/>
+    <w:unhideWhenUsed/>
+    <w:rsid w:val="00C2604F"/>
+    <w:pPr>
+      <w:spacing w:line="240" w:lineRule="auto"/>
+    </w:pPr>
+    <w:rPr>
+      <w:sz w:val="20"/>
+      <w:szCs w:val="20"/>
+    </w:rPr>
+  </w:style>
+  <w:style w:type="character" w:customStyle="1" w:styleId="FootnoteTextChar">
+    <w:name w:val="Footnote Text Char"/>
+    <w:basedOn w:val="DefaultParagraphFont"/>
+    <w:link w:val="FootnoteText"/>
+    <w:uiPriority w:val="99"/>
+    <w:semiHidden/>
+    <w:rsid w:val="00C2604F"/>
+    <w:rPr>
+      <w:rFonts w:ascii="Times New Roman" w:hAnsi="Times New Roman" w:cs="Times New Roman"/>
+      <w:sz w:val="20"/>
+      <w:szCs w:val="20"/>
+    </w:rPr>
+  </w:style>
+  <w:style w:type="character" w:styleId="FootnoteReference">
+    <w:name w:val="footnote reference"/>
+    <w:basedOn w:val="DefaultParagraphFont"/>
+    <w:uiPriority w:val="99"/>
+    <w:semiHidden/>
+    <w:unhideWhenUsed/>
+    <w:rsid w:val="00C2604F"/>
+    <w:rPr>
+      <w:vertAlign w:val="superscript"/>
+    </w:rPr>
+  </w:style>
 </w:styles>
 </file>
 

</xml_diff>